<commit_message>
Improve DOCX inline math and quote highlighting
</commit_message>
<xml_diff>
--- a/exports/understanding-flashattention.zh-cn/understanding-flashattention.zh-cn.docx
+++ b/exports/understanding-flashattention.zh-cn/understanding-flashattention.zh-cn.docx
@@ -19,7 +19,7 @@
       <w:r>
         <w:t xml:space="preserve">Nvidia 的 paper “</w:t>
       </w:r>
-      <w:hyperlink w:history="1" r:id="rIdo-xctyack5rw3vm3ihe0k">
+      <w:hyperlink w:history="1" r:id="rIdnhosj7g6tvbpbgny3oumz">
         <w:r>
           <w:rPr>
             <w:color w:val="1756A9"/>
@@ -33,7 +33,7 @@
       </w:r>
     </w:p>
     <w:p>
-      <w:hyperlink w:history="1" r:id="rIdgkazjb9fde-fn9tpwyy8j">
+      <w:hyperlink w:history="1" r:id="rIdyafcgjmooxegb5rxp-ab0">
         <w:r>
           <w:rPr>
             <w:color w:val="1756A9"/>
@@ -64,9 +64,11 @@
       <w:r>
         <w:t xml:space="preserve">首先，softmax 作用在一维 vector  </w:t>
       </w:r>
+      <w:bookmarkStart w:name="inline-math-1" w:id="1"/>
       <w:r>
         <w:t xml:space="preserve">x</w:t>
       </w:r>
+      <w:bookmarkEnd w:id="1"/>
       <w:r>
         <w:t xml:space="preserve"> 上，而不是多维 tensor。</w:t>
       </w:r>
@@ -122,15 +124,25 @@
       <w:r>
         <w:t xml:space="preserve">计算分两步：（1）算出每个 </w:t>
       </w:r>
+      <w:bookmarkStart w:name="inline-math-2" w:id="1"/>
       <w:r>
         <w:t xml:space="preserve">x</w:t>
       </w:r>
+      <w:bookmarkEnd w:id="1"/>
       <w:r>
         <w:t xml:space="preserve"> 的 </w:t>
       </w:r>
-      <w:r>
-        <w:t xml:space="preserve">e^x</w:t>
-      </w:r>
+      <w:bookmarkStart w:name="inline-math-3" w:id="1"/>
+      <w:r>
+        <w:t xml:space="preserve">e</w:t>
+      </w:r>
+      <w:r>
+        <w:rPr>
+          <w:vertAlign w:val="superscript"/>
+        </w:rPr>
+        <w:t xml:space="preserve">x</w:t>
+      </w:r>
+      <w:bookmarkEnd w:id="1"/>
       <w:r>
         <w:t xml:space="preserve"> 并加起来；（2）做除法。</w:t>
       </w:r>
@@ -148,21 +160,33 @@
       <w:r>
         <w:t xml:space="preserve">但 </w:t>
       </w:r>
-      <w:r>
-        <w:t xml:space="preserve">e^x</w:t>
-      </w:r>
+      <w:bookmarkStart w:name="inline-math-4" w:id="1"/>
+      <w:r>
+        <w:t xml:space="preserve">e</w:t>
+      </w:r>
+      <w:r>
+        <w:rPr>
+          <w:vertAlign w:val="superscript"/>
+        </w:rPr>
+        <w:t xml:space="preserve">x</w:t>
+      </w:r>
+      <w:bookmarkEnd w:id="1"/>
       <w:r>
         <w:t xml:space="preserve"> 增长很快，</w:t>
       </w:r>
+      <w:bookmarkStart w:name="inline-math-5" w:id="1"/>
       <w:r>
         <w:t xml:space="preserve">x</w:t>
       </w:r>
+      <w:bookmarkEnd w:id="1"/>
       <w:r>
         <w:t xml:space="preserve"> 稍大一点就容易溢出，用 float16 甚至更低精度时更明显。所以通常先把每个 </w:t>
       </w:r>
+      <w:bookmarkStart w:name="inline-math-6" w:id="1"/>
       <w:r>
         <w:t xml:space="preserve">x</w:t>
       </w:r>
+      <w:bookmarkEnd w:id="1"/>
       <w:r>
         <w:t xml:space="preserve"> 减去最大值，这就是 safe softmax：</w:t>
       </w:r>
@@ -218,9 +242,11 @@
       <w:r>
         <w:t xml:space="preserve">分子和分母乘的是同一个因子，结果不变。减完以后指数都不大于 0，只要 </w:t>
       </w:r>
+      <w:bookmarkStart w:name="inline-math-7" w:id="1"/>
       <w:r>
         <w:t xml:space="preserve">x</w:t>
       </w:r>
+      <w:bookmarkEnd w:id="1"/>
       <w:r>
         <w:t xml:space="preserve"> 是有限值，就不会溢出。</w:t>
       </w:r>
@@ -300,21 +326,27 @@
       <w:r>
         <w:t xml:space="preserve">假设我们构造两个数组 </w:t>
       </w:r>
+      <w:bookmarkStart w:name="inline-math-8" w:id="1"/>
       <w:r>
         <w:t xml:space="preserve">G</w:t>
       </w:r>
+      <w:bookmarkEnd w:id="1"/>
       <w:r>
         <w:t xml:space="preserve"> 和 </w:t>
       </w:r>
+      <w:bookmarkStart w:name="inline-math-9" w:id="1"/>
       <w:r>
         <w:t xml:space="preserve">S</w:t>
       </w:r>
+      <w:bookmarkEnd w:id="1"/>
       <w:r>
         <w:t xml:space="preserve">，长度和 </w:t>
       </w:r>
+      <w:bookmarkStart w:name="inline-math-10" w:id="1"/>
       <w:r>
         <w:t xml:space="preserve">x</w:t>
       </w:r>
+      <w:bookmarkEnd w:id="1"/>
       <w:r>
         <w:t xml:space="preserve"> 一样：</w:t>
       </w:r>
@@ -370,21 +402,39 @@
       <w:r>
         <w:t xml:space="preserve">也就是说，</w:t>
       </w:r>
-      <w:r>
-        <w:t xml:space="preserve">g_i</w:t>
-      </w:r>
+      <w:bookmarkStart w:name="inline-math-11" w:id="1"/>
+      <w:r>
+        <w:t xml:space="preserve">g</w:t>
+      </w:r>
+      <w:r>
+        <w:rPr>
+          <w:vertAlign w:val="subscript"/>
+        </w:rPr>
+        <w:t xml:space="preserve">i</w:t>
+      </w:r>
+      <w:bookmarkEnd w:id="1"/>
       <w:r>
         <w:t xml:space="preserve"> 是到第 </w:t>
       </w:r>
+      <w:bookmarkStart w:name="inline-math-12" w:id="1"/>
       <w:r>
         <w:t xml:space="preserve">i</w:t>
       </w:r>
+      <w:bookmarkEnd w:id="1"/>
       <w:r>
         <w:t xml:space="preserve"> 个元素为止的最大值，</w:t>
       </w:r>
-      <w:r>
-        <w:t xml:space="preserve">s_i</w:t>
-      </w:r>
+      <w:bookmarkStart w:name="inline-math-13" w:id="1"/>
+      <w:r>
+        <w:t xml:space="preserve">s</w:t>
+      </w:r>
+      <w:r>
+        <w:rPr>
+          <w:vertAlign w:val="subscript"/>
+        </w:rPr>
+        <w:t xml:space="preserve">i</w:t>
+      </w:r>
+      <w:bookmarkEnd w:id="1"/>
       <w:r>
         <w:t xml:space="preserve"> 是一个</w:t>
       </w:r>
@@ -398,6 +448,7 @@
       <w:r>
         <w:t xml:space="preserve"> softmax 分母的和。</w:t>
       </w:r>
+      <w:bookmarkStart w:name="inline-math-14" w:id="1"/>
       <w:r>
         <w:rPr>
           <w:b/>
@@ -405,6 +456,7 @@
         </w:rPr>
         <w:t xml:space="preserve">S</w:t>
       </w:r>
+      <w:bookmarkEnd w:id="1"/>
       <w:r>
         <w:rPr>
           <w:b/>
@@ -412,38 +464,54 @@
         </w:rPr>
         <w:t xml:space="preserve"> 里的数除了最后一个，都和 softmax 第二步求出的和不一样；但读到最后一个时，</w:t>
       </w:r>
+      <w:bookmarkStart w:name="inline-math-15" w:id="1"/>
       <w:r>
         <w:rPr>
           <w:b/>
           <w:bCs/>
         </w:rPr>
-        <w:t xml:space="preserve">s_N</w:t>
+        <w:t xml:space="preserve">s</w:t>
       </w:r>
       <w:r>
         <w:rPr>
           <w:b/>
           <w:bCs/>
+          <w:vertAlign w:val="subscript"/>
+        </w:rPr>
+        <w:t xml:space="preserve">N</w:t>
+      </w:r>
+      <w:bookmarkEnd w:id="1"/>
+      <w:r>
+        <w:rPr>
+          <w:b/>
+          <w:bCs/>
         </w:rPr>
         <w:t xml:space="preserve"> 正好等于 softmax 的分母。</w:t>
       </w:r>
       <w:r>
         <w:t xml:space="preserve"> 所以只要按顺序读一遍 </w:t>
       </w:r>
+      <w:bookmarkStart w:name="inline-math-16" w:id="1"/>
       <w:r>
         <w:t xml:space="preserve">x</w:t>
       </w:r>
+      <w:bookmarkEnd w:id="1"/>
       <w:r>
         <w:t xml:space="preserve">，同时算出 </w:t>
       </w:r>
+      <w:bookmarkStart w:name="inline-math-17" w:id="1"/>
       <w:r>
         <w:t xml:space="preserve">G</w:t>
       </w:r>
+      <w:bookmarkEnd w:id="1"/>
       <w:r>
         <w:t xml:space="preserve"> 和 </w:t>
       </w:r>
+      <w:bookmarkStart w:name="inline-math-18" w:id="1"/>
       <w:r>
         <w:t xml:space="preserve">S</w:t>
       </w:r>
+      <w:bookmarkEnd w:id="1"/>
       <w:r>
         <w:t xml:space="preserve">，就完成了步骤（1）和（2）。</w:t>
       </w:r>
@@ -452,27 +520,36 @@
       <w:r>
         <w:t xml:space="preserve">这里用 </w:t>
       </w:r>
+      <w:bookmarkStart w:name="inline-math-19" w:id="1"/>
       <w:r>
         <w:t xml:space="preserve">g</w:t>
       </w:r>
+      <w:bookmarkEnd w:id="1"/>
       <w:r>
         <w:t xml:space="preserve">（greatest）表示最大值，因为后面 </w:t>
       </w:r>
+      <w:bookmarkStart w:name="inline-math-20" w:id="1"/>
       <w:r>
         <w:t xml:space="preserve">m</w:t>
       </w:r>
+      <w:bookmarkEnd w:id="1"/>
       <w:r>
         <w:t xml:space="preserve"> 要留给 key 的下标；用 </w:t>
       </w:r>
+      <w:bookmarkStart w:name="inline-math-21" w:id="1"/>
       <w:r>
         <w:t xml:space="preserve">s</w:t>
       </w:r>
+      <w:bookmarkEnd w:id="1"/>
       <w:r>
         <w:t xml:space="preserve"> 表示 sum。</w:t>
       </w:r>
     </w:p>
     <w:p>
       <w:pPr>
+        <w:keepLines/>
+        <w:shd w:fill="FFF4CC"/>
+        <w:spacing w:after="160" w:before="160"/>
         <w:ind w:left="280" w:right="160"/>
       </w:pPr>
       <w:r>
@@ -480,9 +557,11 @@
       </w:r>
     </w:p>
     <w:p>
+      <w:bookmarkStart w:name="inline-math-22" w:id="1"/>
       <w:r>
         <w:t xml:space="preserve">S</w:t>
       </w:r>
+      <w:bookmarkEnd w:id="1"/>
       <w:r>
         <w:t xml:space="preserve"> 可以递推计算：</w:t>
       </w:r>
@@ -538,21 +617,67 @@
       <w:r>
         <w:t xml:space="preserve">每当最大值变大，旧的和要先乘上 </w:t>
       </w:r>
-      <w:r>
-        <w:t xml:space="preserve">e^(g_(i - 1) - g_i)</w:t>
-      </w:r>
+      <w:bookmarkStart w:name="inline-math-23" w:id="1"/>
+      <w:r>
+        <w:t xml:space="preserve">e</w:t>
+      </w:r>
+      <w:r>
+        <w:rPr>
+          <w:vertAlign w:val="superscript"/>
+        </w:rPr>
+        <w:t xml:space="preserve">g</w:t>
+      </w:r>
+      <w:r>
+        <w:rPr>
+          <w:position w:val="5"/>
+          <w:sz w:val="12"/>
+          <w:szCs w:val="12"/>
+        </w:rPr>
+        <w:t xml:space="preserve">i - 1</w:t>
+      </w:r>
+      <w:r>
+        <w:rPr>
+          <w:vertAlign w:val="superscript"/>
+        </w:rPr>
+        <w:t xml:space="preserve"> - g</w:t>
+      </w:r>
+      <w:r>
+        <w:rPr>
+          <w:position w:val="5"/>
+          <w:sz w:val="12"/>
+          <w:szCs w:val="12"/>
+        </w:rPr>
+        <w:t xml:space="preserve">i</w:t>
+      </w:r>
+      <w:bookmarkEnd w:id="1"/>
       <w:r>
         <w:t xml:space="preserve">，换算到新的最大值下，再加上新的一项。展开一下就能证明，递推出来的 </w:t>
       </w:r>
-      <w:r>
-        <w:t xml:space="preserve">s_i</w:t>
-      </w:r>
+      <w:bookmarkStart w:name="inline-math-24" w:id="1"/>
+      <w:r>
+        <w:t xml:space="preserve">s</w:t>
+      </w:r>
+      <w:r>
+        <w:rPr>
+          <w:vertAlign w:val="subscript"/>
+        </w:rPr>
+        <w:t xml:space="preserve">i</w:t>
+      </w:r>
+      <w:bookmarkEnd w:id="1"/>
       <w:r>
         <w:t xml:space="preserve"> 符合上面的定义，所以 </w:t>
       </w:r>
-      <w:r>
-        <w:t xml:space="preserve">s_N</w:t>
-      </w:r>
+      <w:bookmarkStart w:name="inline-math-25" w:id="1"/>
+      <w:r>
+        <w:t xml:space="preserve">s</w:t>
+      </w:r>
+      <w:r>
+        <w:rPr>
+          <w:vertAlign w:val="subscript"/>
+        </w:rPr>
+        <w:t xml:space="preserve">N</w:t>
+      </w:r>
+      <w:bookmarkEnd w:id="1"/>
       <w:r>
         <w:t xml:space="preserve"> 就是 softmax 的分母：</w:t>
       </w:r>
@@ -664,6 +789,7 @@
         </w:rPr>
         <w:t xml:space="preserve">Online softmax 把找最大值和求和合成了一遍。但要输出Softmax，还是得等最终的最大值和分母，所以还要再读一遍 </w:t>
       </w:r>
+      <w:bookmarkStart w:name="inline-math-26" w:id="1"/>
       <w:r>
         <w:rPr>
           <w:b/>
@@ -671,6 +797,7 @@
         </w:rPr>
         <w:t xml:space="preserve">x</w:t>
       </w:r>
+      <w:bookmarkEnd w:id="1"/>
       <w:r>
         <w:rPr>
           <w:b/>
@@ -835,7 +962,7 @@
       <w:r>
         <w:t xml:space="preserve"> 这也是为了控制数值范围。假设 q 和 k 的每个分量都独立，均值为 0、方差为 1，那么点积的方差就是 D（</w:t>
       </w:r>
-      <w:hyperlink w:history="1" r:id="rIdh0rpfj4jqa2grvr8zjz1h">
+      <w:hyperlink w:history="1" r:id="rIduj54npluotdrqwsoqjiag">
         <w:r>
           <w:rPr>
             <w:color w:val="1756A9"/>
@@ -928,45 +1055,60 @@
       <w:r>
         <w:t xml:space="preserve">用 </w:t>
       </w:r>
+      <w:bookmarkStart w:name="inline-math-27" w:id="1"/>
       <w:r>
         <w:t xml:space="preserve">X</w:t>
       </w:r>
+      <w:bookmarkEnd w:id="1"/>
       <w:r>
         <w:t xml:space="preserve"> 和 </w:t>
       </w:r>
+      <w:bookmarkStart w:name="inline-math-28" w:id="1"/>
       <w:r>
         <w:t xml:space="preserve">x</w:t>
       </w:r>
+      <w:bookmarkEnd w:id="1"/>
       <w:r>
         <w:t xml:space="preserve"> 表示 softmax 的输入，和前面统一；用 </w:t>
       </w:r>
+      <w:bookmarkStart w:name="inline-math-29" w:id="1"/>
       <w:r>
         <w:t xml:space="preserve">Y</w:t>
       </w:r>
+      <w:bookmarkEnd w:id="1"/>
       <w:r>
         <w:t xml:space="preserve"> 和 </w:t>
       </w:r>
+      <w:bookmarkStart w:name="inline-math-30" w:id="1"/>
       <w:r>
         <w:t xml:space="preserve">y</w:t>
       </w:r>
+      <w:bookmarkEnd w:id="1"/>
       <w:r>
         <w:t xml:space="preserve"> 表示 softmax 的结果（可惜 </w:t>
       </w:r>
+      <w:bookmarkStart w:name="inline-math-31" w:id="1"/>
       <w:r>
         <w:t xml:space="preserve">s</w:t>
       </w:r>
+      <w:bookmarkEnd w:id="1"/>
       <w:r>
         <w:t xml:space="preserve"> 已经被用了）；用 </w:t>
       </w:r>
+      <w:bookmarkStart w:name="inline-math-32" w:id="1"/>
       <w:r>
         <w:t xml:space="preserve">A</w:t>
       </w:r>
+      <w:bookmarkEnd w:id="1"/>
       <w:r>
         <w:t xml:space="preserve"> 表示 attention 的结果。</w:t>
       </w:r>
     </w:p>
     <w:p>
       <w:pPr>
+        <w:keepLines/>
+        <w:shd w:fill="FDE9E7"/>
+        <w:spacing w:after="160" w:before="160"/>
         <w:ind w:left="280" w:right="160"/>
       </w:pPr>
       <w:r>
@@ -1216,9 +1358,11 @@
       <w:r>
         <w:t xml:space="preserve">把类似的思路用在 </w:t>
       </w:r>
+      <w:bookmarkStart w:name="inline-math-33" w:id="1"/>
       <w:r>
         <w:t xml:space="preserve">Y ⋅ V</w:t>
       </w:r>
+      <w:bookmarkEnd w:id="1"/>
       <w:r>
         <w:t xml:space="preserve"> 上，可以得到：</w:t>
       </w:r>
@@ -1274,21 +1418,39 @@
       <w:r>
         <w:t xml:space="preserve">这里 </w:t>
       </w:r>
+      <w:bookmarkStart w:name="inline-math-34" w:id="1"/>
       <w:r>
         <w:t xml:space="preserve">V[m,:]</w:t>
       </w:r>
+      <w:bookmarkEnd w:id="1"/>
       <w:r>
         <w:t xml:space="preserve"> 是长度为 D 的一行，所以 </w:t>
       </w:r>
-      <w:r>
-        <w:t xml:space="preserve">vec(A)_m</w:t>
-      </w:r>
+      <w:bookmarkStart w:name="inline-math-35" w:id="1"/>
+      <w:r>
+        <w:t xml:space="preserve">vec(A)</w:t>
+      </w:r>
+      <w:r>
+        <w:rPr>
+          <w:vertAlign w:val="subscript"/>
+        </w:rPr>
+        <w:t xml:space="preserve">m</w:t>
+      </w:r>
+      <w:bookmarkEnd w:id="1"/>
       <w:r>
         <w:t xml:space="preserve"> 算的是一个 vector，而不是 scalar。这样做的好处是每个 </w:t>
       </w:r>
-      <w:r>
-        <w:t xml:space="preserve">y_m</w:t>
-      </w:r>
+      <w:bookmarkStart w:name="inline-math-36" w:id="1"/>
+      <w:r>
+        <w:t xml:space="preserve">y</w:t>
+      </w:r>
+      <w:r>
+        <w:rPr>
+          <w:vertAlign w:val="subscript"/>
+        </w:rPr>
+        <w:t xml:space="preserve">m</w:t>
+      </w:r>
+      <w:bookmarkEnd w:id="1"/>
       <w:r>
         <w:t xml:space="preserve"> 用完就可以丢掉，而且这个写法正好引出后面的 FlashAttention。</w:t>
       </w:r>
@@ -1521,21 +1683,42 @@
       <w:r>
         <w:t xml:space="preserve">循环（2）里的 </w:t>
       </w:r>
-      <w:r>
-        <w:t xml:space="preserve">y_m</w:t>
-      </w:r>
+      <w:bookmarkStart w:name="inline-math-37" w:id="1"/>
+      <w:r>
+        <w:t xml:space="preserve">y</w:t>
+      </w:r>
+      <w:r>
+        <w:rPr>
+          <w:vertAlign w:val="subscript"/>
+        </w:rPr>
+        <w:t xml:space="preserve">m</w:t>
+      </w:r>
+      <w:bookmarkEnd w:id="1"/>
       <w:r>
         <w:t xml:space="preserve"> 就是第 n 行的 </w:t>
       </w:r>
+      <w:bookmarkStart w:name="inline-math-38" w:id="1"/>
       <w:r>
         <w:t xml:space="preserve">Y[n,m]</w:t>
       </w:r>
+      <w:bookmarkEnd w:id="1"/>
       <w:r>
         <w:t xml:space="preserve">。记 </w:t>
       </w:r>
-      <w:r>
-        <w:t xml:space="preserve">vec(V)_m = V[m,:]</w:t>
-      </w:r>
+      <w:bookmarkStart w:name="inline-math-39" w:id="1"/>
+      <w:r>
+        <w:t xml:space="preserve">vec(V)</w:t>
+      </w:r>
+      <w:r>
+        <w:rPr>
+          <w:vertAlign w:val="subscript"/>
+        </w:rPr>
+        <w:t xml:space="preserve">m</w:t>
+      </w:r>
+      <w:r>
+        <w:t xml:space="preserve"> = V[m,:]</w:t>
+      </w:r>
+      <w:bookmarkEnd w:id="1"/>
       <w:r>
         <w:t xml:space="preserve">，那么：</w:t>
       </w:r>
@@ -1600,39 +1783,108 @@
       <w:r>
         <w:t xml:space="preserve">上述的循环（2）还有一个问题：它要等循环（1）跑完，拿到最终的 </w:t>
       </w:r>
-      <w:r>
-        <w:t xml:space="preserve">g_M</w:t>
-      </w:r>
+      <w:bookmarkStart w:name="inline-math-40" w:id="1"/>
+      <w:r>
+        <w:t xml:space="preserve">g</w:t>
+      </w:r>
+      <w:r>
+        <w:rPr>
+          <w:vertAlign w:val="subscript"/>
+        </w:rPr>
+        <w:t xml:space="preserve">M</w:t>
+      </w:r>
+      <w:bookmarkEnd w:id="1"/>
       <w:r>
         <w:t xml:space="preserve"> 和 </w:t>
       </w:r>
-      <w:r>
-        <w:t xml:space="preserve">s_M</w:t>
-      </w:r>
+      <w:bookmarkStart w:name="inline-math-41" w:id="1"/>
+      <w:r>
+        <w:t xml:space="preserve">s</w:t>
+      </w:r>
+      <w:r>
+        <w:rPr>
+          <w:vertAlign w:val="subscript"/>
+        </w:rPr>
+        <w:t xml:space="preserve">M</w:t>
+      </w:r>
+      <w:bookmarkEnd w:id="1"/>
       <w:r>
         <w:t xml:space="preserve"> 才能开始。这就形成了典型的数据依赖，会影响并行度、拖慢运行效率。我们可以用 online softmax 同样的思路，把 </w:t>
       </w:r>
-      <w:r>
-        <w:t xml:space="preserve">vec(A)_M</w:t>
-      </w:r>
+      <w:bookmarkStart w:name="inline-math-42" w:id="1"/>
+      <w:r>
+        <w:t xml:space="preserve">vec(A)</w:t>
+      </w:r>
+      <w:r>
+        <w:rPr>
+          <w:vertAlign w:val="subscript"/>
+        </w:rPr>
+        <w:t xml:space="preserve">M</w:t>
+      </w:r>
+      <w:bookmarkEnd w:id="1"/>
       <w:r>
         <w:t xml:space="preserve"> 的计算也改成递推 </w:t>
       </w:r>
-      <w:r>
-        <w:t xml:space="preserve">vec(A)_m = f(vec(A)_(m - 1))</w:t>
-      </w:r>
+      <w:bookmarkStart w:name="inline-math-43" w:id="1"/>
+      <w:r>
+        <w:t xml:space="preserve">vec(A)</w:t>
+      </w:r>
+      <w:r>
+        <w:rPr>
+          <w:vertAlign w:val="subscript"/>
+        </w:rPr>
+        <w:t xml:space="preserve">m</w:t>
+      </w:r>
+      <w:r>
+        <w:t xml:space="preserve"> = f(vec(A)</w:t>
+      </w:r>
+      <w:r>
+        <w:rPr>
+          <w:vertAlign w:val="subscript"/>
+        </w:rPr>
+        <w:t xml:space="preserve">m - 1</w:t>
+      </w:r>
+      <w:r>
+        <w:t xml:space="preserve">)</w:t>
+      </w:r>
+      <w:bookmarkEnd w:id="1"/>
       <w:r>
         <w:t xml:space="preserve">。做法是构造一个新的 </w:t>
       </w:r>
-      <w:r>
-        <w:t xml:space="preserve">vec(A)'_m</w:t>
-      </w:r>
+      <w:bookmarkStart w:name="inline-math-44" w:id="1"/>
+      <w:r>
+        <w:t xml:space="preserve">vec(A)′</w:t>
+      </w:r>
+      <w:r>
+        <w:rPr>
+          <w:vertAlign w:val="subscript"/>
+        </w:rPr>
+        <w:t xml:space="preserve">m</w:t>
+      </w:r>
+      <w:bookmarkEnd w:id="1"/>
       <w:r>
         <w:t xml:space="preserve"> 来去掉这个数据依赖。我们只需要保证它的最后一个单元与目标一致即可， </w:t>
       </w:r>
-      <w:r>
-        <w:t xml:space="preserve">vec(A)'_M = vec(A)_M</w:t>
-      </w:r>
+      <w:bookmarkStart w:name="inline-math-45" w:id="1"/>
+      <w:r>
+        <w:t xml:space="preserve">vec(A)′</w:t>
+      </w:r>
+      <w:r>
+        <w:rPr>
+          <w:vertAlign w:val="subscript"/>
+        </w:rPr>
+        <w:t xml:space="preserve">M</w:t>
+      </w:r>
+      <w:r>
+        <w:t xml:space="preserve"> = vec(A)</w:t>
+      </w:r>
+      <w:r>
+        <w:rPr>
+          <w:vertAlign w:val="subscript"/>
+        </w:rPr>
+        <w:t xml:space="preserve">M</w:t>
+      </w:r>
+      <w:bookmarkEnd w:id="1"/>
       <w:r>
         <w:t xml:space="preserve">，不需要中间过程也相等。</w:t>
       </w:r>
@@ -1688,9 +1940,11 @@
       <w:r>
         <w:t xml:space="preserve">当 </w:t>
       </w:r>
+      <w:bookmarkStart w:name="inline-math-46" w:id="1"/>
       <w:r>
         <w:t xml:space="preserve">m = M</w:t>
       </w:r>
+      <w:bookmarkEnd w:id="1"/>
       <w:r>
         <w:t xml:space="preserve"> 时：</w:t>
       </w:r>
@@ -1746,15 +2000,31 @@
       <w:r>
         <w:t xml:space="preserve">和上面的 </w:t>
       </w:r>
-      <w:r>
-        <w:t xml:space="preserve">vec(A)_M</w:t>
-      </w:r>
+      <w:bookmarkStart w:name="inline-math-47" w:id="1"/>
+      <w:r>
+        <w:t xml:space="preserve">vec(A)</w:t>
+      </w:r>
+      <w:r>
+        <w:rPr>
+          <w:vertAlign w:val="subscript"/>
+        </w:rPr>
+        <w:t xml:space="preserve">M</w:t>
+      </w:r>
+      <w:bookmarkEnd w:id="1"/>
       <w:r>
         <w:t xml:space="preserve"> 对比，看上去只是把 m 换成 i、把 M 换成 m。但 </w:t>
       </w:r>
-      <w:r>
-        <w:t xml:space="preserve">vec(A)'_m</w:t>
-      </w:r>
+      <w:bookmarkStart w:name="inline-math-48" w:id="1"/>
+      <w:r>
+        <w:t xml:space="preserve">vec(A)′</w:t>
+      </w:r>
+      <w:r>
+        <w:rPr>
+          <w:vertAlign w:val="subscript"/>
+        </w:rPr>
+        <w:t xml:space="preserve">m</w:t>
+      </w:r>
+      <w:bookmarkEnd w:id="1"/>
       <w:r>
         <w:t xml:space="preserve"> 的意思变了：它是只看前 m 个 key 时的 attention 结果。这样就可以用递推来算，不用把中间矩阵写到内存里（avoid materializing the matrix）。</w:t>
       </w:r>
@@ -1815,7 +2085,7 @@
       <w:r>
         <w:t xml:space="preserve">这其实就是 </w:t>
       </w:r>
-      <w:hyperlink w:history="1" r:id="rId7gkzbgec8xrmaxq_kt50i">
+      <w:hyperlink w:history="1" r:id="rIdmv5pgkas_3p347k4hn7_p">
         <w:r>
           <w:rPr>
             <w:color w:val="1756A9"/>
@@ -2193,7 +2463,7 @@
       <w:r>
         <w:t xml:space="preserve">这样安排的话，每换一个 query tile，就要把 key/value tile 再访问一遍。所以"一个 query tile 扫完所有 key”并不等于“所有输入只从外部内存读一次”。原始 FlashAttention 的循环顺序正好相反：key/value tile 在外层，query/output tile 被反复读写。实际的内存流量取决于 tile 大小、循环顺序和缓存（</w:t>
       </w:r>
-      <w:hyperlink w:history="1" r:id="rIdl5zhfwpnhws3q0pbr1olp">
+      <w:hyperlink w:history="1" r:id="rIdbf5xtwigsgrlrgknwyc1r">
         <w:r>
           <w:rPr>
             <w:color w:val="1756A9"/>
@@ -2210,7 +2480,7 @@
       <w:r>
         <w:t xml:space="preserve">还可以再省一点计算：不在每一步都除以 s，而是保留 A 的分子（也就是 S × A），每步只做 rescale 和累加，最后一步再除以 s。</w:t>
       </w:r>
-      <w:hyperlink w:history="1" r:id="rId6nqrgxmkh_9hh6lcqnwfb">
+      <w:hyperlink w:history="1" r:id="rIdghudx5t2uf6a0s_xhfgyo">
         <w:r>
           <w:rPr>
             <w:color w:val="1756A9"/>
@@ -2270,6 +2540,9 @@
     </w:p>
     <w:p>
       <w:pPr>
+        <w:keepLines/>
+        <w:shd w:fill="FFF4CC"/>
+        <w:spacing w:after="160" w:before="160"/>
         <w:ind w:left="280" w:right="160"/>
       </w:pPr>
       <w:r>

</xml_diff>

<commit_message>
Use OfficeCLI for DOCX export and rendering
</commit_message>
<xml_diff>
--- a/exports/understanding-flashattention.zh-cn/understanding-flashattention.zh-cn.docx
+++ b/exports/understanding-flashattention.zh-cn/understanding-flashattention.zh-cn.docx
@@ -1,25 +1,35 @@
 
 <file path=word/document.xml><?xml version="1.0" encoding="utf-8"?>
-<w:document xmlns:wpc="http://schemas.microsoft.com/office/word/2010/wordprocessingCanvas" xmlns:mc="http://schemas.openxmlformats.org/markup-compatibility/2006" xmlns:o="urn:schemas-microsoft-com:office:office" xmlns:r="http://schemas.openxmlformats.org/officeDocument/2006/relationships" xmlns:m="http://schemas.openxmlformats.org/officeDocument/2006/math" xmlns:v="urn:schemas-microsoft-com:vml" xmlns:wp14="http://schemas.microsoft.com/office/word/2010/wordprocessingDrawing" xmlns:wp="http://schemas.openxmlformats.org/drawingml/2006/wordprocessingDrawing" xmlns:w10="urn:schemas-microsoft-com:office:word" xmlns:w="http://schemas.openxmlformats.org/wordprocessingml/2006/main" xmlns:w14="http://schemas.microsoft.com/office/word/2010/wordml" xmlns:w15="http://schemas.microsoft.com/office/word/2012/wordml" xmlns:wpg="http://schemas.microsoft.com/office/word/2010/wordprocessingGroup" xmlns:wpi="http://schemas.microsoft.com/office/word/2010/wordprocessingInk" xmlns:wne="http://schemas.microsoft.com/office/word/2006/wordml" xmlns:wps="http://schemas.microsoft.com/office/word/2010/wordprocessingShape" xmlns:cx="http://schemas.microsoft.com/office/drawing/2014/chartex" xmlns:cx1="http://schemas.microsoft.com/office/drawing/2015/9/8/chartex" xmlns:cx2="http://schemas.microsoft.com/office/drawing/2015/10/21/chartex" xmlns:cx3="http://schemas.microsoft.com/office/drawing/2016/5/9/chartex" xmlns:cx4="http://schemas.microsoft.com/office/drawing/2016/5/10/chartex" xmlns:cx5="http://schemas.microsoft.com/office/drawing/2016/5/11/chartex" xmlns:cx6="http://schemas.microsoft.com/office/drawing/2016/5/12/chartex" xmlns:cx7="http://schemas.microsoft.com/office/drawing/2016/5/13/chartex" xmlns:cx8="http://schemas.microsoft.com/office/drawing/2016/5/14/chartex" xmlns:aink="http://schemas.microsoft.com/office/drawing/2016/ink" xmlns:am3d="http://schemas.microsoft.com/office/drawing/2017/model3d" xmlns:w16cex="http://schemas.microsoft.com/office/word/2018/wordml/cex" xmlns:w16cid="http://schemas.microsoft.com/office/word/2016/wordml/cid" xmlns:w16="http://schemas.microsoft.com/office/word/2018/wordml" xmlns:w16sdtdh="http://schemas.microsoft.com/office/word/2020/wordml/sdtdatahash" xmlns:w16se="http://schemas.microsoft.com/office/word/2015/wordml/symex" mc:Ignorable="w14 w15 wp14">
+<w:document xmlns:r="http://schemas.openxmlformats.org/officeDocument/2006/relationships" xmlns:m="http://schemas.openxmlformats.org/officeDocument/2006/math" xmlns:v="urn:schemas-microsoft-com:vml" xmlns:o="urn:schemas-microsoft-com:office:office" xmlns:w10="urn:schemas-microsoft-com:office:word" xmlns:wne="http://schemas.microsoft.com/office/word/2006/wordml" xmlns:wp="http://schemas.openxmlformats.org/drawingml/2006/wordprocessingDrawing" xmlns:wp14="http://schemas.microsoft.com/office/word/2010/wordprocessingDrawing" xmlns:w14="http://schemas.microsoft.com/office/word/2010/wordml" xmlns:a="http://schemas.openxmlformats.org/drawingml/2006/main" xmlns:pic="http://schemas.openxmlformats.org/drawingml/2006/picture" xmlns:wps="http://schemas.microsoft.com/office/word/2010/wordprocessingShape" xmlns:wpg="http://schemas.microsoft.com/office/word/2010/wordprocessingGroup" xmlns:wpi="http://schemas.microsoft.com/office/word/2010/wordprocessingInk" xmlns:wpc="http://schemas.microsoft.com/office/word/2010/wordprocessingCanvas" xmlns:w15="http://schemas.microsoft.com/office/word/2012/wordml" xmlns:mc="http://schemas.openxmlformats.org/markup-compatibility/2006" xmlns:w="http://schemas.openxmlformats.org/wordprocessingml/2006/main" mc:Ignorable="w14 w15 wp14">
   <w:body>
     <w:p>
       <w:pPr>
         <w:pStyle w:val="Title"/>
-      </w:pPr>
-      <w:r>
+        <w:keepNext/>
+      </w:pPr>
+      <w:r>
+        <w:rPr/>
         <w:t xml:space="preserve">理解 FlashAttention</w:t>
       </w:r>
     </w:p>
     <w:p>
-      <w:r>
+      <w:pPr>
+        <w:pStyle w:val="Normal"/>
+      </w:pPr>
+      <w:r>
+        <w:rPr/>
         <w:t xml:space="preserve">Softmax 是 Transformer 里很重要的一环。它本身的计算量不大，但由于数学上的数据依赖，按原始方法计算需要把数据完整读三遍，会耗费大量时间。</w:t>
       </w:r>
     </w:p>
     <w:p>
-      <w:r>
+      <w:pPr>
+        <w:pStyle w:val="Normal"/>
+      </w:pPr>
+      <w:r>
+        <w:rPr/>
         <w:t xml:space="preserve">Nvidia 的 paper “</w:t>
       </w:r>
-      <w:hyperlink w:history="1" r:id="rIdnhosj7g6tvbpbgny3oumz">
+      <w:hyperlink r:id="R554b5095e808465e">
         <w:r>
           <w:rPr>
             <w:color w:val="1756A9"/>
@@ -29,11 +39,15 @@
         </w:r>
       </w:hyperlink>
       <w:r>
+        <w:rPr/>
         <w:t xml:space="preserve">” 提出了 online softmax：以多做一点计算的代价换来少读一遍数据，把三遍降到两遍。</w:t>
       </w:r>
     </w:p>
     <w:p>
-      <w:hyperlink w:history="1" r:id="rIdyafcgjmooxegb5rxp-ab0">
+      <w:pPr>
+        <w:pStyle w:val="Normal"/>
+      </w:pPr>
+      <w:hyperlink r:id="R7e058cfef3244614">
         <w:r>
           <w:rPr>
             <w:color w:val="1756A9"/>
@@ -43,11 +57,16 @@
         </w:r>
       </w:hyperlink>
       <w:r>
+        <w:rPr/>
         <w:t xml:space="preserve"> 用了类似的思想，又往前走了一步：把 softmax 和后面乘 V 的矩阵乘法合进同一个循环，完整的 score 和 probability 矩阵不用再写回内存（DDR 或者 HBM）；再用 tiling （分块）把数据放在 GPU 的片上存储里复用。</w:t>
       </w:r>
     </w:p>
     <w:p>
-      <w:r>
+      <w:pPr>
+        <w:pStyle w:val="Normal"/>
+      </w:pPr>
+      <w:r>
+        <w:rPr/>
         <w:t xml:space="preserve">下面一步步推导。文中有一些数学公式，但只用到简单的代数；也配了可以按顺序运行的 Python 代码，方便理解。</w:t>
       </w:r>
     </w:p>
@@ -57,54 +76,59 @@
         <w:keepNext/>
       </w:pPr>
       <w:r>
+        <w:rPr/>
         <w:t xml:space="preserve">Softmax 的数学表达</w:t>
       </w:r>
     </w:p>
     <w:p>
-      <w:r>
+      <w:pPr>
+        <w:pStyle w:val="Normal"/>
+      </w:pPr>
+      <w:r>
+        <w:rPr/>
         <w:t xml:space="preserve">首先，softmax 作用在一维 vector  </w:t>
       </w:r>
       <w:bookmarkStart w:name="inline-math-1" w:id="1"/>
       <w:r>
+        <w:rPr/>
         <w:t xml:space="preserve">x</w:t>
       </w:r>
       <w:bookmarkEnd w:id="1"/>
       <w:r>
+        <w:rPr/>
         <w:t xml:space="preserve"> 上，而不是多维 tensor。</w:t>
       </w:r>
     </w:p>
     <w:p>
       <w:pPr>
+        <w:pStyle w:val="Normal"/>
         <w:keepLines/>
-        <w:spacing w:after="180" w:before="100"/>
+        <w:spacing w:before="100" w:after="180"/>
         <w:jc w:val="center"/>
       </w:pPr>
       <w:r>
         <w:drawing>
           <wp:inline distT="0" distB="0" distL="0" distR="0">
             <wp:extent cx="1756767" cy="610195"/>
-            <wp:effectExtent t="0" r="0" b="0" l="0"/>
-            <wp:docPr id="1" name="asset-001" descr=" \mathrm{softmax}(\vec{x})_i = \frac{e^{x_i}}{\sum_{j=1}^{N} e^{x_j}} " title="display-math"/>
+            <wp:effectExtent l="0" t="0" r="0" b="0"/>
+            <wp:docPr id="1" name="asset-001" descr=" \mathrm{softmax}(\vec{x})_i = \frac{e^{x_i}}{\sum_{j=1}^{N} e^{x_j}} "/>
             <wp:cNvGraphicFramePr>
-              <a:graphicFrameLocks xmlns:a="http://schemas.openxmlformats.org/drawingml/2006/main" noChangeAspect="1"/>
+              <a:graphicFrameLocks noChangeAspect="1"/>
             </wp:cNvGraphicFramePr>
-            <a:graphic xmlns:a="http://schemas.openxmlformats.org/drawingml/2006/main">
+            <a:graphic>
               <a:graphicData uri="http://schemas.openxmlformats.org/drawingml/2006/picture">
-                <pic:pic xmlns:pic="http://schemas.openxmlformats.org/drawingml/2006/picture">
+                <pic:pic>
                   <pic:nvPicPr>
-                    <pic:cNvPr id="0" name="" descr=""/>
-                    <pic:cNvPicPr>
-                      <a:picLocks noChangeAspect="1" noChangeArrowheads="1"/>
-                    </pic:cNvPicPr>
+                    <pic:cNvPr id="1" name="asset-001"/>
+                    <pic:cNvPicPr/>
                   </pic:nvPicPr>
                   <pic:blipFill>
-                    <a:blip r:embed="rId7" cstate="none"/>
-                    <a:srcRect/>
+                    <a:blip r:embed="R2c3d9c644cc64bff" cstate="print"/>
                     <a:stretch>
                       <a:fillRect/>
                     </a:stretch>
                   </pic:blipFill>
-                  <pic:spPr bwMode="auto">
+                  <pic:spPr>
                     <a:xfrm>
                       <a:off x="0" y="0"/>
                       <a:ext cx="1756767" cy="610195"/>
@@ -121,19 +145,26 @@
       </w:r>
     </w:p>
     <w:p>
-      <w:r>
+      <w:pPr>
+        <w:pStyle w:val="Normal"/>
+      </w:pPr>
+      <w:r>
+        <w:rPr/>
         <w:t xml:space="preserve">计算分两步：（1）算出每个 </w:t>
       </w:r>
-      <w:bookmarkStart w:name="inline-math-2" w:id="1"/>
-      <w:r>
+      <w:bookmarkStart w:name="inline-math-2" w:id="2"/>
+      <w:r>
+        <w:rPr/>
         <w:t xml:space="preserve">x</w:t>
       </w:r>
-      <w:bookmarkEnd w:id="1"/>
-      <w:r>
+      <w:bookmarkEnd w:id="2"/>
+      <w:r>
+        <w:rPr/>
         <w:t xml:space="preserve"> 的 </w:t>
       </w:r>
-      <w:bookmarkStart w:name="inline-math-3" w:id="1"/>
-      <w:r>
+      <w:bookmarkStart w:name="inline-math-3" w:id="3"/>
+      <w:r>
+        <w:rPr/>
         <w:t xml:space="preserve">e</w:t>
       </w:r>
       <w:r>
@@ -142,8 +173,9 @@
         </w:rPr>
         <w:t xml:space="preserve">x</w:t>
       </w:r>
-      <w:bookmarkEnd w:id="1"/>
-      <w:r>
+      <w:bookmarkEnd w:id="3"/>
+      <w:r>
+        <w:rPr/>
         <w:t xml:space="preserve"> 并加起来；（2）做除法。</w:t>
       </w:r>
     </w:p>
@@ -153,15 +185,21 @@
         <w:keepNext/>
       </w:pPr>
       <w:r>
+        <w:rPr/>
         <w:t xml:space="preserve">Safe softmax</w:t>
       </w:r>
     </w:p>
     <w:p>
-      <w:r>
+      <w:pPr>
+        <w:pStyle w:val="Normal"/>
+      </w:pPr>
+      <w:r>
+        <w:rPr/>
         <w:t xml:space="preserve">但 </w:t>
       </w:r>
-      <w:bookmarkStart w:name="inline-math-4" w:id="1"/>
-      <w:r>
+      <w:bookmarkStart w:name="inline-math-4" w:id="4"/>
+      <w:r>
+        <w:rPr/>
         <w:t xml:space="preserve">e</w:t>
       </w:r>
       <w:r>
@@ -170,59 +208,62 @@
         </w:rPr>
         <w:t xml:space="preserve">x</w:t>
       </w:r>
-      <w:bookmarkEnd w:id="1"/>
-      <w:r>
+      <w:bookmarkEnd w:id="4"/>
+      <w:r>
+        <w:rPr/>
         <w:t xml:space="preserve"> 增长很快，</w:t>
       </w:r>
-      <w:bookmarkStart w:name="inline-math-5" w:id="1"/>
-      <w:r>
+      <w:bookmarkStart w:name="inline-math-5" w:id="5"/>
+      <w:r>
+        <w:rPr/>
         <w:t xml:space="preserve">x</w:t>
       </w:r>
-      <w:bookmarkEnd w:id="1"/>
-      <w:r>
+      <w:bookmarkEnd w:id="5"/>
+      <w:r>
+        <w:rPr/>
         <w:t xml:space="preserve"> 稍大一点就容易溢出，用 float16 甚至更低精度时更明显。所以通常先把每个 </w:t>
       </w:r>
-      <w:bookmarkStart w:name="inline-math-6" w:id="1"/>
-      <w:r>
+      <w:bookmarkStart w:name="inline-math-6" w:id="6"/>
+      <w:r>
+        <w:rPr/>
         <w:t xml:space="preserve">x</w:t>
       </w:r>
-      <w:bookmarkEnd w:id="1"/>
-      <w:r>
+      <w:bookmarkEnd w:id="6"/>
+      <w:r>
+        <w:rPr/>
         <w:t xml:space="preserve"> 减去最大值，这就是 safe softmax：</w:t>
       </w:r>
     </w:p>
     <w:p>
       <w:pPr>
+        <w:pStyle w:val="Normal"/>
         <w:keepLines/>
-        <w:spacing w:after="180" w:before="100"/>
+        <w:spacing w:before="100" w:after="180"/>
         <w:jc w:val="center"/>
       </w:pPr>
       <w:r>
         <w:drawing>
           <wp:inline distT="0" distB="0" distL="0" distR="0">
             <wp:extent cx="2199531" cy="645616"/>
-            <wp:effectExtent t="0" r="0" b="0" l="0"/>
-            <wp:docPr id="1" name="asset-002" descr=" \mathrm{softmax}(\vec{x})_i = \frac{e^{x_i - \max(\vec{x})}}{\sum_{j=1}^{N} e^{x_j - \max(\vec{x})}} " title="display-math"/>
+            <wp:effectExtent l="0" t="0" r="0" b="0"/>
+            <wp:docPr id="2" name="asset-002" descr=" \mathrm{softmax}(\vec{x})_i = \frac{e^{x_i - \max(\vec{x})}}{\sum_{j=1}^{N} e^{x_j - \max(\vec{x})}} "/>
             <wp:cNvGraphicFramePr>
-              <a:graphicFrameLocks xmlns:a="http://schemas.openxmlformats.org/drawingml/2006/main" noChangeAspect="1"/>
+              <a:graphicFrameLocks noChangeAspect="1"/>
             </wp:cNvGraphicFramePr>
-            <a:graphic xmlns:a="http://schemas.openxmlformats.org/drawingml/2006/main">
+            <a:graphic>
               <a:graphicData uri="http://schemas.openxmlformats.org/drawingml/2006/picture">
-                <pic:pic xmlns:pic="http://schemas.openxmlformats.org/drawingml/2006/picture">
+                <pic:pic>
                   <pic:nvPicPr>
-                    <pic:cNvPr id="0" name="" descr=""/>
-                    <pic:cNvPicPr>
-                      <a:picLocks noChangeAspect="1" noChangeArrowheads="1"/>
-                    </pic:cNvPicPr>
+                    <pic:cNvPr id="2" name="asset-002"/>
+                    <pic:cNvPicPr/>
                   </pic:nvPicPr>
                   <pic:blipFill>
-                    <a:blip r:embed="rId8" cstate="none"/>
-                    <a:srcRect/>
+                    <a:blip r:embed="R3de70baf76d347e5" cstate="print"/>
                     <a:stretch>
                       <a:fillRect/>
                     </a:stretch>
                   </pic:blipFill>
-                  <pic:spPr bwMode="auto">
+                  <pic:spPr>
                     <a:xfrm>
                       <a:off x="0" y="0"/>
                       <a:ext cx="2199531" cy="645616"/>
@@ -239,60 +280,72 @@
       </w:r>
     </w:p>
     <w:p>
-      <w:r>
+      <w:pPr>
+        <w:pStyle w:val="Normal"/>
+      </w:pPr>
+      <w:r>
+        <w:rPr/>
         <w:t xml:space="preserve">分子和分母乘的是同一个因子，结果不变。减完以后指数都不大于 0，只要 </w:t>
       </w:r>
-      <w:bookmarkStart w:name="inline-math-7" w:id="1"/>
-      <w:r>
+      <w:bookmarkStart w:name="inline-math-7" w:id="7"/>
+      <w:r>
+        <w:rPr/>
         <w:t xml:space="preserve">x</w:t>
       </w:r>
-      <w:bookmarkEnd w:id="1"/>
-      <w:r>
+      <w:bookmarkEnd w:id="7"/>
+      <w:r>
+        <w:rPr/>
         <w:t xml:space="preserve"> 是有限值，就不会溢出。</w:t>
       </w:r>
     </w:p>
     <w:p>
-      <w:r>
+      <w:pPr>
+        <w:pStyle w:val="Normal"/>
+      </w:pPr>
+      <w:r>
+        <w:rPr/>
         <w:t xml:space="preserve">这样 softmax 就要读三遍数据：（1）找最大值；（2）求和；（3）做除法。严格来说这是三遍逻辑上的扫描，如果一行数据短到能一直留在片上，就不一定真的从DDR读三次。</w:t>
       </w:r>
     </w:p>
     <w:p>
-      <w:r>
+      <w:pPr>
+        <w:pStyle w:val="Normal"/>
+      </w:pPr>
+      <w:r>
+        <w:rPr/>
         <w:t xml:space="preserve">如果用 Python 来表示的话：</w:t>
       </w:r>
     </w:p>
     <w:p>
       <w:pPr>
+        <w:pStyle w:val="Normal"/>
         <w:keepLines/>
-        <w:spacing w:after="180" w:before="100"/>
+        <w:spacing w:before="100" w:after="180"/>
         <w:jc w:val="left"/>
       </w:pPr>
       <w:r>
         <w:drawing>
           <wp:inline distT="0" distB="0" distL="0" distR="0">
             <wp:extent cx="6096000" cy="2466975"/>
-            <wp:effectExtent t="0" r="0" b="0" l="0"/>
-            <wp:docPr id="1" name="asset-003" descr="import math import random  N = 8 vec_x = [random.random() for _ in range(N)] # 1st pass max_x = max(vec_x) # 2nd pass sum_ex = sum(math.exp(x - max_x) for x in vec_x) # 3rd pass softmax_x = [math.exp(x - max_x) / sum_ex for x in vec_x]" title="code-block"/>
+            <wp:effectExtent l="0" t="0" r="0" b="0"/>
+            <wp:docPr id="3" name="asset-003" descr="import math&#10;import random&#10;&#10;N = 8&#10;vec_x = [random.random() for _ in range(N)]&#10;# 1st pass&#10;max_x = max(vec_x)&#10;# 2nd pass&#10;sum_ex = sum(math.exp(x - max_x) for x in vec_x)&#10;# 3rd pass&#10;softmax_x = [math.exp(x - max_x) / sum_ex for x in vec_x]"/>
             <wp:cNvGraphicFramePr>
-              <a:graphicFrameLocks xmlns:a="http://schemas.openxmlformats.org/drawingml/2006/main" noChangeAspect="1"/>
+              <a:graphicFrameLocks noChangeAspect="1"/>
             </wp:cNvGraphicFramePr>
-            <a:graphic xmlns:a="http://schemas.openxmlformats.org/drawingml/2006/main">
+            <a:graphic>
               <a:graphicData uri="http://schemas.openxmlformats.org/drawingml/2006/picture">
-                <pic:pic xmlns:pic="http://schemas.openxmlformats.org/drawingml/2006/picture">
+                <pic:pic>
                   <pic:nvPicPr>
-                    <pic:cNvPr id="0" name="" descr=""/>
-                    <pic:cNvPicPr>
-                      <a:picLocks noChangeAspect="1" noChangeArrowheads="1"/>
-                    </pic:cNvPicPr>
+                    <pic:cNvPr id="3" name="asset-003"/>
+                    <pic:cNvPicPr/>
                   </pic:nvPicPr>
                   <pic:blipFill>
-                    <a:blip r:embed="rId9" cstate="none"/>
-                    <a:srcRect/>
+                    <a:blip r:embed="Rb0d445eb7ed24da2" cstate="print"/>
                     <a:stretch>
                       <a:fillRect/>
                     </a:stretch>
                   </pic:blipFill>
-                  <pic:spPr bwMode="auto">
+                  <pic:spPr>
                     <a:xfrm>
                       <a:off x="0" y="0"/>
                       <a:ext cx="6096000" cy="2466975"/>
@@ -314,75 +367,88 @@
         <w:keepNext/>
       </w:pPr>
       <w:r>
+        <w:rPr/>
         <w:t xml:space="preserve">Online softmax</w:t>
       </w:r>
     </w:p>
     <w:p>
-      <w:r>
+      <w:pPr>
+        <w:pStyle w:val="Normal"/>
+      </w:pPr>
+      <w:r>
+        <w:rPr/>
         <w:t xml:space="preserve">不过，上述三遍读取中的（1）和（2）其实可以合并：一边找最大值，一边求和。</w:t>
       </w:r>
     </w:p>
     <w:p>
-      <w:r>
+      <w:pPr>
+        <w:pStyle w:val="Normal"/>
+      </w:pPr>
+      <w:r>
+        <w:rPr/>
         <w:t xml:space="preserve">假设我们构造两个数组 </w:t>
       </w:r>
-      <w:bookmarkStart w:name="inline-math-8" w:id="1"/>
-      <w:r>
+      <w:bookmarkStart w:name="inline-math-8" w:id="8"/>
+      <w:r>
+        <w:rPr/>
         <w:t xml:space="preserve">G</w:t>
       </w:r>
-      <w:bookmarkEnd w:id="1"/>
-      <w:r>
+      <w:bookmarkEnd w:id="8"/>
+      <w:r>
+        <w:rPr/>
         <w:t xml:space="preserve"> 和 </w:t>
       </w:r>
-      <w:bookmarkStart w:name="inline-math-9" w:id="1"/>
-      <w:r>
+      <w:bookmarkStart w:name="inline-math-9" w:id="9"/>
+      <w:r>
+        <w:rPr/>
         <w:t xml:space="preserve">S</w:t>
       </w:r>
-      <w:bookmarkEnd w:id="1"/>
-      <w:r>
+      <w:bookmarkEnd w:id="9"/>
+      <w:r>
+        <w:rPr/>
         <w:t xml:space="preserve">，长度和 </w:t>
       </w:r>
-      <w:bookmarkStart w:name="inline-math-10" w:id="1"/>
-      <w:r>
+      <w:bookmarkStart w:name="inline-math-10" w:id="10"/>
+      <w:r>
+        <w:rPr/>
         <w:t xml:space="preserve">x</w:t>
       </w:r>
-      <w:bookmarkEnd w:id="1"/>
-      <w:r>
+      <w:bookmarkEnd w:id="10"/>
+      <w:r>
+        <w:rPr/>
         <w:t xml:space="preserve"> 一样：</w:t>
       </w:r>
     </w:p>
     <w:p>
       <w:pPr>
+        <w:pStyle w:val="Normal"/>
         <w:keepLines/>
-        <w:spacing w:after="180" w:before="100"/>
+        <w:spacing w:before="100" w:after="180"/>
         <w:jc w:val="center"/>
       </w:pPr>
       <w:r>
         <w:drawing>
           <wp:inline distT="0" distB="0" distL="0" distR="0">
             <wp:extent cx="2850356" cy="701576"/>
-            <wp:effectExtent t="0" r="0" b="0" l="0"/>
-            <wp:docPr id="1" name="asset-004" descr=" g_i = \max(x_1, \dots, x_i), \qquad s_i = \sum_{j=1}^{i} e^{x_j - g_i} " title="display-math"/>
+            <wp:effectExtent l="0" t="0" r="0" b="0"/>
+            <wp:docPr id="4" name="asset-004" descr=" g_i = \max(x_1, \dots, x_i), \qquad&#10;s_i = \sum_{j=1}^{i} e^{x_j - g_i} "/>
             <wp:cNvGraphicFramePr>
-              <a:graphicFrameLocks xmlns:a="http://schemas.openxmlformats.org/drawingml/2006/main" noChangeAspect="1"/>
+              <a:graphicFrameLocks noChangeAspect="1"/>
             </wp:cNvGraphicFramePr>
-            <a:graphic xmlns:a="http://schemas.openxmlformats.org/drawingml/2006/main">
+            <a:graphic>
               <a:graphicData uri="http://schemas.openxmlformats.org/drawingml/2006/picture">
-                <pic:pic xmlns:pic="http://schemas.openxmlformats.org/drawingml/2006/picture">
+                <pic:pic>
                   <pic:nvPicPr>
-                    <pic:cNvPr id="0" name="" descr=""/>
-                    <pic:cNvPicPr>
-                      <a:picLocks noChangeAspect="1" noChangeArrowheads="1"/>
-                    </pic:cNvPicPr>
+                    <pic:cNvPr id="4" name="asset-004"/>
+                    <pic:cNvPicPr/>
                   </pic:nvPicPr>
                   <pic:blipFill>
-                    <a:blip r:embed="rId10" cstate="none"/>
-                    <a:srcRect/>
+                    <a:blip r:embed="R765b67f0605e40ea" cstate="print"/>
                     <a:stretch>
                       <a:fillRect/>
                     </a:stretch>
                   </pic:blipFill>
-                  <pic:spPr bwMode="auto">
+                  <pic:spPr>
                     <a:xfrm>
                       <a:off x="0" y="0"/>
                       <a:ext cx="2850356" cy="701576"/>
@@ -399,11 +465,16 @@
       </w:r>
     </w:p>
     <w:p>
-      <w:r>
+      <w:pPr>
+        <w:pStyle w:val="Normal"/>
+      </w:pPr>
+      <w:r>
+        <w:rPr/>
         <w:t xml:space="preserve">也就是说，</w:t>
       </w:r>
-      <w:bookmarkStart w:name="inline-math-11" w:id="1"/>
-      <w:r>
+      <w:bookmarkStart w:name="inline-math-11" w:id="11"/>
+      <w:r>
+        <w:rPr/>
         <w:t xml:space="preserve">g</w:t>
       </w:r>
       <w:r>
@@ -412,20 +483,24 @@
         </w:rPr>
         <w:t xml:space="preserve">i</w:t>
       </w:r>
-      <w:bookmarkEnd w:id="1"/>
-      <w:r>
+      <w:bookmarkEnd w:id="11"/>
+      <w:r>
+        <w:rPr/>
         <w:t xml:space="preserve"> 是到第 </w:t>
       </w:r>
-      <w:bookmarkStart w:name="inline-math-12" w:id="1"/>
-      <w:r>
+      <w:bookmarkStart w:name="inline-math-12" w:id="12"/>
+      <w:r>
+        <w:rPr/>
         <w:t xml:space="preserve">i</w:t>
       </w:r>
-      <w:bookmarkEnd w:id="1"/>
-      <w:r>
+      <w:bookmarkEnd w:id="12"/>
+      <w:r>
+        <w:rPr/>
         <w:t xml:space="preserve"> 个元素为止的最大值，</w:t>
       </w:r>
-      <w:bookmarkStart w:name="inline-math-13" w:id="1"/>
-      <w:r>
+      <w:bookmarkStart w:name="inline-math-13" w:id="13"/>
+      <w:r>
+        <w:rPr/>
         <w:t xml:space="preserve">s</w:t>
       </w:r>
       <w:r>
@@ -434,170 +509,188 @@
         </w:rPr>
         <w:t xml:space="preserve">i</w:t>
       </w:r>
-      <w:bookmarkEnd w:id="1"/>
-      <w:r>
+      <w:bookmarkEnd w:id="13"/>
+      <w:r>
+        <w:rPr/>
         <w:t xml:space="preserve"> 是一个</w:t>
       </w:r>
       <w:r>
         <w:rPr>
           <w:b/>
-          <w:bCs/>
         </w:rPr>
         <w:t xml:space="preserve">类似</w:t>
       </w:r>
       <w:r>
+        <w:rPr/>
         <w:t xml:space="preserve"> softmax 分母的和。</w:t>
       </w:r>
-      <w:bookmarkStart w:name="inline-math-14" w:id="1"/>
+      <w:bookmarkStart w:name="inline-math-14" w:id="14"/>
       <w:r>
         <w:rPr>
           <w:b/>
-          <w:bCs/>
         </w:rPr>
         <w:t xml:space="preserve">S</w:t>
       </w:r>
-      <w:bookmarkEnd w:id="1"/>
+      <w:bookmarkEnd w:id="14"/>
       <w:r>
         <w:rPr>
           <w:b/>
-          <w:bCs/>
         </w:rPr>
         <w:t xml:space="preserve"> 里的数除了最后一个，都和 softmax 第二步求出的和不一样；但读到最后一个时，</w:t>
       </w:r>
-      <w:bookmarkStart w:name="inline-math-15" w:id="1"/>
+      <w:bookmarkStart w:name="inline-math-15" w:id="15"/>
       <w:r>
         <w:rPr>
           <w:b/>
-          <w:bCs/>
         </w:rPr>
         <w:t xml:space="preserve">s</w:t>
       </w:r>
       <w:r>
         <w:rPr>
           <w:b/>
-          <w:bCs/>
           <w:vertAlign w:val="subscript"/>
         </w:rPr>
         <w:t xml:space="preserve">N</w:t>
       </w:r>
-      <w:bookmarkEnd w:id="1"/>
+      <w:bookmarkEnd w:id="15"/>
       <w:r>
         <w:rPr>
           <w:b/>
-          <w:bCs/>
         </w:rPr>
         <w:t xml:space="preserve"> 正好等于 softmax 的分母。</w:t>
       </w:r>
       <w:r>
+        <w:rPr/>
         <w:t xml:space="preserve"> 所以只要按顺序读一遍 </w:t>
       </w:r>
-      <w:bookmarkStart w:name="inline-math-16" w:id="1"/>
-      <w:r>
+      <w:bookmarkStart w:name="inline-math-16" w:id="16"/>
+      <w:r>
+        <w:rPr/>
         <w:t xml:space="preserve">x</w:t>
       </w:r>
-      <w:bookmarkEnd w:id="1"/>
-      <w:r>
+      <w:bookmarkEnd w:id="16"/>
+      <w:r>
+        <w:rPr/>
         <w:t xml:space="preserve">，同时算出 </w:t>
       </w:r>
-      <w:bookmarkStart w:name="inline-math-17" w:id="1"/>
-      <w:r>
+      <w:bookmarkStart w:name="inline-math-17" w:id="17"/>
+      <w:r>
+        <w:rPr/>
         <w:t xml:space="preserve">G</w:t>
       </w:r>
-      <w:bookmarkEnd w:id="1"/>
-      <w:r>
+      <w:bookmarkEnd w:id="17"/>
+      <w:r>
+        <w:rPr/>
         <w:t xml:space="preserve"> 和 </w:t>
       </w:r>
-      <w:bookmarkStart w:name="inline-math-18" w:id="1"/>
-      <w:r>
+      <w:bookmarkStart w:name="inline-math-18" w:id="18"/>
+      <w:r>
+        <w:rPr/>
         <w:t xml:space="preserve">S</w:t>
       </w:r>
-      <w:bookmarkEnd w:id="1"/>
-      <w:r>
+      <w:bookmarkEnd w:id="18"/>
+      <w:r>
+        <w:rPr/>
         <w:t xml:space="preserve">，就完成了步骤（1）和（2）。</w:t>
       </w:r>
     </w:p>
     <w:p>
-      <w:r>
+      <w:pPr>
+        <w:pStyle w:val="Normal"/>
+      </w:pPr>
+      <w:r>
+        <w:rPr/>
         <w:t xml:space="preserve">这里用 </w:t>
       </w:r>
-      <w:bookmarkStart w:name="inline-math-19" w:id="1"/>
-      <w:r>
+      <w:bookmarkStart w:name="inline-math-19" w:id="19"/>
+      <w:r>
+        <w:rPr/>
         <w:t xml:space="preserve">g</w:t>
       </w:r>
-      <w:bookmarkEnd w:id="1"/>
-      <w:r>
+      <w:bookmarkEnd w:id="19"/>
+      <w:r>
+        <w:rPr/>
         <w:t xml:space="preserve">（greatest）表示最大值，因为后面 </w:t>
       </w:r>
-      <w:bookmarkStart w:name="inline-math-20" w:id="1"/>
-      <w:r>
+      <w:bookmarkStart w:name="inline-math-20" w:id="20"/>
+      <w:r>
+        <w:rPr/>
         <w:t xml:space="preserve">m</w:t>
       </w:r>
-      <w:bookmarkEnd w:id="1"/>
-      <w:r>
+      <w:bookmarkEnd w:id="20"/>
+      <w:r>
+        <w:rPr/>
         <w:t xml:space="preserve"> 要留给 key 的下标；用 </w:t>
       </w:r>
-      <w:bookmarkStart w:name="inline-math-21" w:id="1"/>
-      <w:r>
+      <w:bookmarkStart w:name="inline-math-21" w:id="21"/>
+      <w:r>
+        <w:rPr/>
         <w:t xml:space="preserve">s</w:t>
       </w:r>
-      <w:bookmarkEnd w:id="1"/>
-      <w:r>
+      <w:bookmarkEnd w:id="21"/>
+      <w:r>
+        <w:rPr/>
         <w:t xml:space="preserve"> 表示 sum。</w:t>
       </w:r>
     </w:p>
     <w:p>
       <w:pPr>
+        <w:pStyle w:val="Normal"/>
         <w:keepLines/>
-        <w:shd w:fill="FFF4CC"/>
-        <w:spacing w:after="160" w:before="160"/>
+        <w:shd w:val="clear" w:fill="FFF4CC"/>
+        <w:spacing w:before="160" w:after="160"/>
         <w:ind w:left="280" w:right="160"/>
       </w:pPr>
       <w:r>
+        <w:rPr/>
         <w:t xml:space="preserve">笔者：这种做法让我想起了 dynamic programming。</w:t>
       </w:r>
     </w:p>
     <w:p>
-      <w:bookmarkStart w:name="inline-math-22" w:id="1"/>
-      <w:r>
+      <w:pPr>
+        <w:pStyle w:val="Normal"/>
+      </w:pPr>
+      <w:bookmarkStart w:name="inline-math-22" w:id="22"/>
+      <w:r>
+        <w:rPr/>
         <w:t xml:space="preserve">S</w:t>
       </w:r>
-      <w:bookmarkEnd w:id="1"/>
-      <w:r>
+      <w:bookmarkEnd w:id="22"/>
+      <w:r>
+        <w:rPr/>
         <w:t xml:space="preserve"> 可以递推计算：</w:t>
       </w:r>
     </w:p>
     <w:p>
       <w:pPr>
+        <w:pStyle w:val="Normal"/>
         <w:keepLines/>
-        <w:spacing w:after="180" w:before="100"/>
+        <w:spacing w:before="100" w:after="180"/>
         <w:jc w:val="center"/>
       </w:pPr>
       <w:r>
         <w:drawing>
           <wp:inline distT="0" distB="0" distL="0" distR="0">
             <wp:extent cx="1958727" cy="665857"/>
-            <wp:effectExtent t="0" r="0" b="0" l="0"/>
-            <wp:docPr id="1" name="asset-005" descr=" \begin{aligned} s_1 &amp;= 1, \\ s_i &amp;= s_{i-1} \times e^{g_{i-1} - g_i} + e^{x_i - g_i}. \end{aligned} " title="display-math"/>
+            <wp:effectExtent l="0" t="0" r="0" b="0"/>
+            <wp:docPr id="5" name="asset-005" descr=" \begin{aligned}&#10;s_1 &amp;= 1, \\&#10;s_i &amp;= s_{i-1} \times e^{g_{i-1} - g_i} + e^{x_i - g_i}.&#10;\end{aligned} "/>
             <wp:cNvGraphicFramePr>
-              <a:graphicFrameLocks xmlns:a="http://schemas.openxmlformats.org/drawingml/2006/main" noChangeAspect="1"/>
+              <a:graphicFrameLocks noChangeAspect="1"/>
             </wp:cNvGraphicFramePr>
-            <a:graphic xmlns:a="http://schemas.openxmlformats.org/drawingml/2006/main">
+            <a:graphic>
               <a:graphicData uri="http://schemas.openxmlformats.org/drawingml/2006/picture">
-                <pic:pic xmlns:pic="http://schemas.openxmlformats.org/drawingml/2006/picture">
+                <pic:pic>
                   <pic:nvPicPr>
-                    <pic:cNvPr id="0" name="" descr=""/>
-                    <pic:cNvPicPr>
-                      <a:picLocks noChangeAspect="1" noChangeArrowheads="1"/>
-                    </pic:cNvPicPr>
+                    <pic:cNvPr id="5" name="asset-005"/>
+                    <pic:cNvPicPr/>
                   </pic:nvPicPr>
                   <pic:blipFill>
-                    <a:blip r:embed="rId11" cstate="none"/>
-                    <a:srcRect/>
+                    <a:blip r:embed="Rd6f9c6e0277f47a4" cstate="print"/>
                     <a:stretch>
                       <a:fillRect/>
                     </a:stretch>
                   </pic:blipFill>
-                  <pic:spPr bwMode="auto">
+                  <pic:spPr>
                     <a:xfrm>
                       <a:off x="0" y="0"/>
                       <a:ext cx="1958727" cy="665857"/>
@@ -614,11 +707,16 @@
       </w:r>
     </w:p>
     <w:p>
-      <w:r>
+      <w:pPr>
+        <w:pStyle w:val="Normal"/>
+      </w:pPr>
+      <w:r>
+        <w:rPr/>
         <w:t xml:space="preserve">每当最大值变大，旧的和要先乘上 </w:t>
       </w:r>
-      <w:bookmarkStart w:name="inline-math-23" w:id="1"/>
-      <w:r>
+      <w:bookmarkStart w:name="inline-math-23" w:id="23"/>
+      <w:r>
+        <w:rPr/>
         <w:t xml:space="preserve">e</w:t>
       </w:r>
       <w:r>
@@ -631,7 +729,6 @@
         <w:rPr>
           <w:position w:val="5"/>
           <w:sz w:val="12"/>
-          <w:szCs w:val="12"/>
         </w:rPr>
         <w:t xml:space="preserve">i - 1</w:t>
       </w:r>
@@ -645,16 +742,17 @@
         <w:rPr>
           <w:position w:val="5"/>
           <w:sz w:val="12"/>
-          <w:szCs w:val="12"/>
         </w:rPr>
         <w:t xml:space="preserve">i</w:t>
       </w:r>
-      <w:bookmarkEnd w:id="1"/>
-      <w:r>
+      <w:bookmarkEnd w:id="23"/>
+      <w:r>
+        <w:rPr/>
         <w:t xml:space="preserve">，换算到新的最大值下，再加上新的一项。展开一下就能证明，递推出来的 </w:t>
       </w:r>
-      <w:bookmarkStart w:name="inline-math-24" w:id="1"/>
-      <w:r>
+      <w:bookmarkStart w:name="inline-math-24" w:id="24"/>
+      <w:r>
+        <w:rPr/>
         <w:t xml:space="preserve">s</w:t>
       </w:r>
       <w:r>
@@ -663,12 +761,14 @@
         </w:rPr>
         <w:t xml:space="preserve">i</w:t>
       </w:r>
-      <w:bookmarkEnd w:id="1"/>
-      <w:r>
+      <w:bookmarkEnd w:id="24"/>
+      <w:r>
+        <w:rPr/>
         <w:t xml:space="preserve"> 符合上面的定义，所以 </w:t>
       </w:r>
-      <w:bookmarkStart w:name="inline-math-25" w:id="1"/>
-      <w:r>
+      <w:bookmarkStart w:name="inline-math-25" w:id="25"/>
+      <w:r>
+        <w:rPr/>
         <w:t xml:space="preserve">s</w:t>
       </w:r>
       <w:r>
@@ -677,43 +777,42 @@
         </w:rPr>
         <w:t xml:space="preserve">N</w:t>
       </w:r>
-      <w:bookmarkEnd w:id="1"/>
-      <w:r>
+      <w:bookmarkEnd w:id="25"/>
+      <w:r>
+        <w:rPr/>
         <w:t xml:space="preserve"> 就是 softmax 的分母：</w:t>
       </w:r>
     </w:p>
     <w:p>
       <w:pPr>
+        <w:pStyle w:val="Normal"/>
         <w:keepLines/>
-        <w:spacing w:after="180" w:before="100"/>
+        <w:spacing w:before="100" w:after="180"/>
         <w:jc w:val="center"/>
       </w:pPr>
       <w:r>
         <w:drawing>
           <wp:inline distT="0" distB="0" distL="0" distR="0">
             <wp:extent cx="2189411" cy="1866751"/>
-            <wp:effectExtent t="0" r="0" b="0" l="0"/>
-            <wp:docPr id="1" name="asset-006" descr=" \begin{aligned} s_i &amp;= e^{g_{i-1} - g_i} \sum_{j=1}^{i-1} e^{x_j - g_{i-1}} + e^{x_i - g_i} \\ &amp;= \sum_{j=1}^{i-1} e^{x_j - g_i} + e^{x_i - g_i} \\ &amp;= \sum_{j=1}^{i} e^{x_j - g_i}. \end{aligned} " title="display-math"/>
+            <wp:effectExtent l="0" t="0" r="0" b="0"/>
+            <wp:docPr id="6" name="asset-006" descr=" \begin{aligned}&#10;s_i &amp;= e^{g_{i-1} - g_i} \sum_{j=1}^{i-1} e^{x_j - g_{i-1}} + e^{x_i - g_i} \\&#10;&amp;= \sum_{j=1}^{i-1} e^{x_j - g_i} + e^{x_i - g_i} \\&#10;&amp;= \sum_{j=1}^{i} e^{x_j - g_i}.&#10;\end{aligned} "/>
             <wp:cNvGraphicFramePr>
-              <a:graphicFrameLocks xmlns:a="http://schemas.openxmlformats.org/drawingml/2006/main" noChangeAspect="1"/>
+              <a:graphicFrameLocks noChangeAspect="1"/>
             </wp:cNvGraphicFramePr>
-            <a:graphic xmlns:a="http://schemas.openxmlformats.org/drawingml/2006/main">
+            <a:graphic>
               <a:graphicData uri="http://schemas.openxmlformats.org/drawingml/2006/picture">
-                <pic:pic xmlns:pic="http://schemas.openxmlformats.org/drawingml/2006/picture">
+                <pic:pic>
                   <pic:nvPicPr>
-                    <pic:cNvPr id="0" name="" descr=""/>
-                    <pic:cNvPicPr>
-                      <a:picLocks noChangeAspect="1" noChangeArrowheads="1"/>
-                    </pic:cNvPicPr>
+                    <pic:cNvPr id="6" name="asset-006"/>
+                    <pic:cNvPicPr/>
                   </pic:nvPicPr>
                   <pic:blipFill>
-                    <a:blip r:embed="rId12" cstate="none"/>
-                    <a:srcRect/>
+                    <a:blip r:embed="R654b27a6312347c0" cstate="print"/>
                     <a:stretch>
                       <a:fillRect/>
                     </a:stretch>
                   </pic:blipFill>
-                  <pic:spPr bwMode="auto">
+                  <pic:spPr>
                     <a:xfrm>
                       <a:off x="0" y="0"/>
                       <a:ext cx="2189411" cy="1866751"/>
@@ -730,42 +829,44 @@
       </w:r>
     </w:p>
     <w:p>
-      <w:r>
+      <w:pPr>
+        <w:pStyle w:val="Normal"/>
+      </w:pPr>
+      <w:r>
+        <w:rPr/>
         <w:t xml:space="preserve">如果用 Python 来表示的话：</w:t>
       </w:r>
     </w:p>
     <w:p>
       <w:pPr>
+        <w:pStyle w:val="Normal"/>
         <w:keepLines/>
-        <w:spacing w:after="180" w:before="100"/>
+        <w:spacing w:before="100" w:after="180"/>
         <w:jc w:val="left"/>
       </w:pPr>
       <w:r>
         <w:drawing>
           <wp:inline distT="0" distB="0" distL="0" distR="0">
             <wp:extent cx="6096000" cy="2066925"/>
-            <wp:effectExtent t="0" r="0" b="0" l="0"/>
-            <wp:docPr id="1" name="asset-007" descr="s_prev = 1.0  # s_{i-1} g_prev = vec_x[0]  # g_{i-1} for i in range(1, N):  # starting from the 2nd element     x = vec_x[i]  # read x     g = max(g_prev, x)  # g_i     s = s_prev * math.exp(g_prev - g) + math.exp(x - g)  # s_i     s_prev, g_prev = s, g  # save as s_{i-1} and g_{i-1}  assert g_prev == max_x and math.isclose(s_prev, sum_ex)" title="code-block"/>
+            <wp:effectExtent l="0" t="0" r="0" b="0"/>
+            <wp:docPr id="7" name="asset-007" descr="s_prev = 1.0  # s_{i-1}&#10;g_prev = vec_x[0]  # g_{i-1}&#10;for i in range(1, N):  # starting from the 2nd element&#10;    x = vec_x[i]  # read x&#10;    g = max(g_prev, x)  # g_i&#10;    s = s_prev * math.exp(g_prev - g) + math.exp(x - g)  # s_i&#10;    s_prev, g_prev = s, g  # save as s_{i-1} and g_{i-1}&#10;&#10;assert g_prev == max_x and math.isclose(s_prev, sum_ex)"/>
             <wp:cNvGraphicFramePr>
-              <a:graphicFrameLocks xmlns:a="http://schemas.openxmlformats.org/drawingml/2006/main" noChangeAspect="1"/>
+              <a:graphicFrameLocks noChangeAspect="1"/>
             </wp:cNvGraphicFramePr>
-            <a:graphic xmlns:a="http://schemas.openxmlformats.org/drawingml/2006/main">
+            <a:graphic>
               <a:graphicData uri="http://schemas.openxmlformats.org/drawingml/2006/picture">
-                <pic:pic xmlns:pic="http://schemas.openxmlformats.org/drawingml/2006/picture">
+                <pic:pic>
                   <pic:nvPicPr>
-                    <pic:cNvPr id="0" name="" descr=""/>
-                    <pic:cNvPicPr>
-                      <a:picLocks noChangeAspect="1" noChangeArrowheads="1"/>
-                    </pic:cNvPicPr>
+                    <pic:cNvPr id="7" name="asset-007"/>
+                    <pic:cNvPicPr/>
                   </pic:nvPicPr>
                   <pic:blipFill>
-                    <a:blip r:embed="rId13" cstate="none"/>
-                    <a:srcRect/>
+                    <a:blip r:embed="R7e2fd22cd5ca47f3" cstate="print"/>
                     <a:stretch>
                       <a:fillRect/>
                     </a:stretch>
                   </pic:blipFill>
-                  <pic:spPr bwMode="auto">
+                  <pic:spPr>
                     <a:xfrm>
                       <a:off x="0" y="0"/>
                       <a:ext cx="6096000" cy="2066925"/>
@@ -782,26 +883,26 @@
       </w:r>
     </w:p>
     <w:p>
+      <w:pPr>
+        <w:pStyle w:val="Normal"/>
+      </w:pPr>
       <w:r>
         <w:rPr>
           <w:b/>
-          <w:bCs/>
         </w:rPr>
         <w:t xml:space="preserve">Online softmax 把找最大值和求和合成了一遍。但要输出Softmax，还是得等最终的最大值和分母，所以还要再读一遍 </w:t>
       </w:r>
-      <w:bookmarkStart w:name="inline-math-26" w:id="1"/>
+      <w:bookmarkStart w:name="inline-math-26" w:id="26"/>
       <w:r>
         <w:rPr>
           <w:b/>
-          <w:bCs/>
         </w:rPr>
         <w:t xml:space="preserve">x</w:t>
       </w:r>
-      <w:bookmarkEnd w:id="1"/>
+      <w:bookmarkEnd w:id="26"/>
       <w:r>
         <w:rPr>
           <w:b/>
-          <w:bCs/>
         </w:rPr>
         <w:t xml:space="preserve"> 做除法。这就是从三遍到两遍。</w:t>
       </w:r>
@@ -812,41 +913,40 @@
         <w:keepNext/>
       </w:pPr>
       <w:r>
+        <w:rPr/>
         <w:t xml:space="preserve">Attention 的数学表达</w:t>
       </w:r>
     </w:p>
     <w:p>
       <w:pPr>
+        <w:pStyle w:val="Normal"/>
         <w:keepLines/>
-        <w:spacing w:after="180" w:before="100"/>
+        <w:spacing w:before="100" w:after="180"/>
         <w:jc w:val="center"/>
       </w:pPr>
       <w:r>
         <w:drawing>
           <wp:inline distT="0" distB="0" distL="0" distR="0">
             <wp:extent cx="2579787" cy="581620"/>
-            <wp:effectExtent t="0" r="0" b="0" l="0"/>
-            <wp:docPr id="1" name="asset-008" descr=" \mathbb{A} = \mathrm{softmax}\left(\mathrm{mask}\left(\frac{\mathbb{Q} \cdot \mathbb{K}^T}{\sqrt{D}}\right)\right) \cdot \mathbb{V} " title="display-math"/>
+            <wp:effectExtent l="0" t="0" r="0" b="0"/>
+            <wp:docPr id="8" name="asset-008" descr=" \mathbb{A} = \mathrm{softmax}\left(\mathrm{mask}\left(\frac{\mathbb{Q} \cdot \mathbb{K}^T}{\sqrt{D}}\right)\right) \cdot \mathbb{V} "/>
             <wp:cNvGraphicFramePr>
-              <a:graphicFrameLocks xmlns:a="http://schemas.openxmlformats.org/drawingml/2006/main" noChangeAspect="1"/>
+              <a:graphicFrameLocks noChangeAspect="1"/>
             </wp:cNvGraphicFramePr>
-            <a:graphic xmlns:a="http://schemas.openxmlformats.org/drawingml/2006/main">
+            <a:graphic>
               <a:graphicData uri="http://schemas.openxmlformats.org/drawingml/2006/picture">
-                <pic:pic xmlns:pic="http://schemas.openxmlformats.org/drawingml/2006/picture">
+                <pic:pic>
                   <pic:nvPicPr>
-                    <pic:cNvPr id="0" name="" descr=""/>
-                    <pic:cNvPicPr>
-                      <a:picLocks noChangeAspect="1" noChangeArrowheads="1"/>
-                    </pic:cNvPicPr>
+                    <pic:cNvPr id="8" name="asset-008"/>
+                    <pic:cNvPicPr/>
                   </pic:nvPicPr>
                   <pic:blipFill>
-                    <a:blip r:embed="rId14" cstate="none"/>
-                    <a:srcRect/>
+                    <a:blip r:embed="R8696347caa3141c2" cstate="print"/>
                     <a:stretch>
                       <a:fillRect/>
                     </a:stretch>
                   </pic:blipFill>
-                  <pic:spPr bwMode="auto">
+                  <pic:spPr>
                     <a:xfrm>
                       <a:off x="0" y="0"/>
                       <a:ext cx="2579787" cy="581620"/>
@@ -863,106 +963,113 @@
       </w:r>
     </w:p>
     <w:p>
-      <w:r>
+      <w:pPr>
+        <w:pStyle w:val="Normal"/>
+      </w:pPr>
+      <w:r>
+        <w:rPr/>
         <w:t xml:space="preserve">其中 A、Q、K、V 都是二维矩阵，shape 依次是 </w:t>
       </w:r>
       <w:r>
         <w:rPr>
-          <w:rFonts w:ascii="Menlo" w:eastAsia="Heiti SC" w:hAnsi="Menlo"/>
+          <w:rFonts w:ascii="Menlo" w:hAnsi="Menlo" w:eastAsia="Heiti SC"/>
           <w:sz w:val="22"/>
-          <w:szCs w:val="22"/>
-          <w:shd w:fill="F1F3F5"/>
+          <w:shd w:val="clear" w:fill="F1F3F5"/>
         </w:rPr>
         <w:t xml:space="preserve">[N, D]</w:t>
       </w:r>
       <w:r>
+        <w:rPr/>
         <w:t xml:space="preserve">、</w:t>
       </w:r>
       <w:r>
         <w:rPr>
-          <w:rFonts w:ascii="Menlo" w:eastAsia="Heiti SC" w:hAnsi="Menlo"/>
+          <w:rFonts w:ascii="Menlo" w:hAnsi="Menlo" w:eastAsia="Heiti SC"/>
           <w:sz w:val="22"/>
-          <w:szCs w:val="22"/>
-          <w:shd w:fill="F1F3F5"/>
+          <w:shd w:val="clear" w:fill="F1F3F5"/>
         </w:rPr>
         <w:t xml:space="preserve">[N, D]</w:t>
       </w:r>
       <w:r>
+        <w:rPr/>
         <w:t xml:space="preserve">、</w:t>
       </w:r>
       <w:r>
         <w:rPr>
-          <w:rFonts w:ascii="Menlo" w:eastAsia="Heiti SC" w:hAnsi="Menlo"/>
+          <w:rFonts w:ascii="Menlo" w:hAnsi="Menlo" w:eastAsia="Heiti SC"/>
           <w:sz w:val="22"/>
-          <w:szCs w:val="22"/>
-          <w:shd w:fill="F1F3F5"/>
+          <w:shd w:val="clear" w:fill="F1F3F5"/>
         </w:rPr>
         <w:t xml:space="preserve">[M, D]</w:t>
       </w:r>
       <w:r>
+        <w:rPr/>
         <w:t xml:space="preserve">、</w:t>
       </w:r>
       <w:r>
         <w:rPr>
-          <w:rFonts w:ascii="Menlo" w:eastAsia="Heiti SC" w:hAnsi="Menlo"/>
+          <w:rFonts w:ascii="Menlo" w:hAnsi="Menlo" w:eastAsia="Heiti SC"/>
           <w:sz w:val="22"/>
-          <w:szCs w:val="22"/>
-          <w:shd w:fill="F1F3F5"/>
+          <w:shd w:val="clear" w:fill="F1F3F5"/>
         </w:rPr>
         <w:t xml:space="preserve">[M, D]</w:t>
       </w:r>
       <w:r>
+        <w:rPr/>
         <w:t xml:space="preserve">，D 是 head_dim。完整序列的 self-attention 里 </w:t>
       </w:r>
       <w:r>
         <w:rPr>
-          <w:rFonts w:ascii="Menlo" w:eastAsia="Heiti SC" w:hAnsi="Menlo"/>
+          <w:rFonts w:ascii="Menlo" w:hAnsi="Menlo" w:eastAsia="Heiti SC"/>
           <w:sz w:val="22"/>
-          <w:szCs w:val="22"/>
-          <w:shd w:fill="F1F3F5"/>
+          <w:shd w:val="clear" w:fill="F1F3F5"/>
         </w:rPr>
         <w:t xml:space="preserve">N == M</w:t>
       </w:r>
       <w:r>
+        <w:rPr/>
         <w:t xml:space="preserve">；decode 一个 token 时 </w:t>
       </w:r>
       <w:r>
         <w:rPr>
-          <w:rFonts w:ascii="Menlo" w:eastAsia="Heiti SC" w:hAnsi="Menlo"/>
+          <w:rFonts w:ascii="Menlo" w:hAnsi="Menlo" w:eastAsia="Heiti SC"/>
           <w:sz w:val="22"/>
-          <w:szCs w:val="22"/>
-          <w:shd w:fill="F1F3F5"/>
+          <w:shd w:val="clear" w:fill="F1F3F5"/>
         </w:rPr>
         <w:t xml:space="preserve">N = 1</w:t>
       </w:r>
       <w:r>
+        <w:rPr/>
         <w:t xml:space="preserve">，而 M 包含 KV cache 里的历史。</w:t>
       </w:r>
       <w:r>
         <w:rPr>
-          <w:rFonts w:ascii="Menlo" w:eastAsia="Heiti SC" w:hAnsi="Menlo"/>
+          <w:rFonts w:ascii="Menlo" w:hAnsi="Menlo" w:eastAsia="Heiti SC"/>
           <w:sz w:val="22"/>
-          <w:szCs w:val="22"/>
-          <w:shd w:fill="F1F3F5"/>
+          <w:shd w:val="clear" w:fill="F1F3F5"/>
         </w:rPr>
         <w:t xml:space="preserve">mask()</w:t>
       </w:r>
       <w:r>
+        <w:rPr/>
         <w:t xml:space="preserve"> 用来实现 causal mask 等各种 masking，它是 element-wise 操作，不影响后面的推导，所以先略过，文章最后再讲需要注意的地方。</w:t>
       </w:r>
     </w:p>
     <w:p>
+      <w:pPr>
+        <w:pStyle w:val="Normal"/>
+      </w:pPr>
       <w:r>
         <w:rPr>
           <w:b/>
-          <w:bCs/>
         </w:rPr>
         <w:t xml:space="preserve">为什么要除以 √D？</w:t>
       </w:r>
       <w:r>
+        <w:rPr/>
         <w:t xml:space="preserve"> 这也是为了控制数值范围。假设 q 和 k 的每个分量都独立，均值为 0、方差为 1，那么点积的方差就是 D（</w:t>
       </w:r>
-      <w:hyperlink w:history="1" r:id="rIduj54npluotdrqwsoqjiag">
+      <w:hyperlink r:id="R07735d1e0aab49a3">
         <w:r>
           <w:rPr>
             <w:color w:val="1756A9"/>
@@ -972,70 +1079,79 @@
         </w:r>
       </w:hyperlink>
       <w:r>
+        <w:rPr/>
         <w:t xml:space="preserve">）。除以 √D 之后方差回到 1，softmax 的分布不会过于极端，梯度不会太小，训练也更稳定。</w:t>
       </w:r>
     </w:p>
     <w:p>
+      <w:pPr>
+        <w:pStyle w:val="Normal"/>
+      </w:pPr>
       <w:r>
         <w:rPr>
           <w:b/>
-          <w:bCs/>
         </w:rPr>
         <w:t xml:space="preserve">简化 1</w:t>
       </w:r>
       <w:r>
+        <w:rPr/>
         <w:t xml:space="preserve">：1/√D 是常数。它的 scaling 通常在点积之前就作用在 Q 或 K 上，这样点积本身也不容易溢出。后面就不再写出来了。</w:t>
       </w:r>
     </w:p>
     <w:p>
+      <w:pPr>
+        <w:pStyle w:val="Normal"/>
+      </w:pPr>
       <w:r>
         <w:rPr>
           <w:b/>
-          <w:bCs/>
         </w:rPr>
         <w:t xml:space="preserve">简化 2</w:t>
       </w:r>
       <w:r>
+        <w:rPr/>
         <w:t xml:space="preserve">：后面也省略 masking（不同架构的 attention 所使用的 masking 不同，但均为常数操作）。</w:t>
       </w:r>
     </w:p>
     <w:p>
-      <w:r>
+      <w:pPr>
+        <w:pStyle w:val="Normal"/>
+      </w:pPr>
+      <w:r>
+        <w:rPr/>
         <w:t xml:space="preserve">简化以后，再用 X 和 Y 表示中间变量，attention 可以写成：</w:t>
       </w:r>
     </w:p>
     <w:p>
       <w:pPr>
+        <w:pStyle w:val="Normal"/>
         <w:keepLines/>
-        <w:spacing w:after="180" w:before="100"/>
+        <w:spacing w:before="100" w:after="180"/>
         <w:jc w:val="center"/>
       </w:pPr>
       <w:r>
         <w:drawing>
           <wp:inline distT="0" distB="0" distL="0" distR="0">
             <wp:extent cx="3568154" cy="388590"/>
-            <wp:effectExtent t="0" r="0" b="0" l="0"/>
-            <wp:docPr id="1" name="asset-009" descr=" \mathrm{softmax}(\mathbb{Q} \cdot \mathbb{K}^T) \cdot \mathbb{V} = \mathrm{softmax}(\mathbb{X}) \cdot \mathbb{V} = \mathbb{Y} \cdot \mathbb{V} = \mathbb{A} " title="display-math"/>
+            <wp:effectExtent l="0" t="0" r="0" b="0"/>
+            <wp:docPr id="9" name="asset-009" descr=" \mathrm{softmax}(\mathbb{Q} \cdot \mathbb{K}^T) \cdot \mathbb{V} = \mathrm{softmax}(\mathbb{X}) \cdot \mathbb{V} = \mathbb{Y} \cdot \mathbb{V} = \mathbb{A} "/>
             <wp:cNvGraphicFramePr>
-              <a:graphicFrameLocks xmlns:a="http://schemas.openxmlformats.org/drawingml/2006/main" noChangeAspect="1"/>
+              <a:graphicFrameLocks noChangeAspect="1"/>
             </wp:cNvGraphicFramePr>
-            <a:graphic xmlns:a="http://schemas.openxmlformats.org/drawingml/2006/main">
+            <a:graphic>
               <a:graphicData uri="http://schemas.openxmlformats.org/drawingml/2006/picture">
-                <pic:pic xmlns:pic="http://schemas.openxmlformats.org/drawingml/2006/picture">
+                <pic:pic>
                   <pic:nvPicPr>
-                    <pic:cNvPr id="0" name="" descr=""/>
-                    <pic:cNvPicPr>
-                      <a:picLocks noChangeAspect="1" noChangeArrowheads="1"/>
-                    </pic:cNvPicPr>
+                    <pic:cNvPr id="9" name="asset-009"/>
+                    <pic:cNvPicPr/>
                   </pic:nvPicPr>
                   <pic:blipFill>
-                    <a:blip r:embed="rId15" cstate="none"/>
-                    <a:srcRect/>
+                    <a:blip r:embed="R11c80888cbbd4ab0" cstate="print"/>
                     <a:stretch>
                       <a:fillRect/>
                     </a:stretch>
                   </pic:blipFill>
-                  <pic:spPr bwMode="auto">
+                  <pic:spPr>
                     <a:xfrm>
                       <a:off x="0" y="0"/>
                       <a:ext cx="3568154" cy="388590"/>
@@ -1052,73 +1168,90 @@
       </w:r>
     </w:p>
     <w:p>
-      <w:r>
+      <w:pPr>
+        <w:pStyle w:val="Normal"/>
+      </w:pPr>
+      <w:r>
+        <w:rPr/>
         <w:t xml:space="preserve">用 </w:t>
       </w:r>
-      <w:bookmarkStart w:name="inline-math-27" w:id="1"/>
-      <w:r>
+      <w:bookmarkStart w:name="inline-math-27" w:id="27"/>
+      <w:r>
+        <w:rPr/>
         <w:t xml:space="preserve">X</w:t>
       </w:r>
-      <w:bookmarkEnd w:id="1"/>
-      <w:r>
+      <w:bookmarkEnd w:id="27"/>
+      <w:r>
+        <w:rPr/>
         <w:t xml:space="preserve"> 和 </w:t>
       </w:r>
-      <w:bookmarkStart w:name="inline-math-28" w:id="1"/>
-      <w:r>
+      <w:bookmarkStart w:name="inline-math-28" w:id="28"/>
+      <w:r>
+        <w:rPr/>
         <w:t xml:space="preserve">x</w:t>
       </w:r>
-      <w:bookmarkEnd w:id="1"/>
-      <w:r>
+      <w:bookmarkEnd w:id="28"/>
+      <w:r>
+        <w:rPr/>
         <w:t xml:space="preserve"> 表示 softmax 的输入，和前面统一；用 </w:t>
       </w:r>
-      <w:bookmarkStart w:name="inline-math-29" w:id="1"/>
-      <w:r>
+      <w:bookmarkStart w:name="inline-math-29" w:id="29"/>
+      <w:r>
+        <w:rPr/>
         <w:t xml:space="preserve">Y</w:t>
       </w:r>
-      <w:bookmarkEnd w:id="1"/>
-      <w:r>
+      <w:bookmarkEnd w:id="29"/>
+      <w:r>
+        <w:rPr/>
         <w:t xml:space="preserve"> 和 </w:t>
       </w:r>
-      <w:bookmarkStart w:name="inline-math-30" w:id="1"/>
-      <w:r>
+      <w:bookmarkStart w:name="inline-math-30" w:id="30"/>
+      <w:r>
+        <w:rPr/>
         <w:t xml:space="preserve">y</w:t>
       </w:r>
-      <w:bookmarkEnd w:id="1"/>
-      <w:r>
+      <w:bookmarkEnd w:id="30"/>
+      <w:r>
+        <w:rPr/>
         <w:t xml:space="preserve"> 表示 softmax 的结果（可惜 </w:t>
       </w:r>
-      <w:bookmarkStart w:name="inline-math-31" w:id="1"/>
-      <w:r>
+      <w:bookmarkStart w:name="inline-math-31" w:id="31"/>
+      <w:r>
+        <w:rPr/>
         <w:t xml:space="preserve">s</w:t>
       </w:r>
-      <w:bookmarkEnd w:id="1"/>
-      <w:r>
+      <w:bookmarkEnd w:id="31"/>
+      <w:r>
+        <w:rPr/>
         <w:t xml:space="preserve"> 已经被用了）；用 </w:t>
       </w:r>
-      <w:bookmarkStart w:name="inline-math-32" w:id="1"/>
-      <w:r>
+      <w:bookmarkStart w:name="inline-math-32" w:id="32"/>
+      <w:r>
+        <w:rPr/>
         <w:t xml:space="preserve">A</w:t>
       </w:r>
-      <w:bookmarkEnd w:id="1"/>
-      <w:r>
+      <w:bookmarkEnd w:id="32"/>
+      <w:r>
+        <w:rPr/>
         <w:t xml:space="preserve"> 表示 attention 的结果。</w:t>
       </w:r>
     </w:p>
     <w:p>
       <w:pPr>
+        <w:pStyle w:val="Normal"/>
         <w:keepLines/>
-        <w:shd w:fill="FDE9E7"/>
-        <w:spacing w:after="160" w:before="160"/>
+        <w:shd w:val="clear" w:fill="FDE9E7"/>
+        <w:spacing w:before="160" w:after="160"/>
         <w:ind w:left="280" w:right="160"/>
       </w:pPr>
       <w:r>
         <w:rPr>
           <w:b/>
-          <w:bCs/>
         </w:rPr>
         <w:t xml:space="preserve">注意</w:t>
       </w:r>
       <w:r>
+        <w:rPr/>
         <w:t xml:space="preserve">：在 LLM 里，batch_size 和 num_head 这两个维度只是在重复独立的 attention 计算。对其中每一个计算来说，N 和 M 取决于序列长度，是运行时才知道的动态变量（runtime dynamic variable）；D 是 head_dim，编译时就确定了（compile-time static variable）。这一点对性能优化非常重要。</w:t>
       </w:r>
     </w:p>
@@ -1128,11 +1261,16 @@
         <w:keepNext/>
       </w:pPr>
       <w:r>
+        <w:rPr/>
         <w:t xml:space="preserve">应用 online softmax 到 attention 上</w:t>
       </w:r>
     </w:p>
     <w:p>
-      <w:r>
+      <w:pPr>
+        <w:pStyle w:val="Normal"/>
+      </w:pPr>
+      <w:r>
+        <w:rPr/>
         <w:t xml:space="preserve">把 online softmax 用到 attention 上，会有下面两个循环。</w:t>
       </w:r>
     </w:p>
@@ -1142,82 +1280,85 @@
         <w:keepNext/>
       </w:pPr>
       <w:r>
+        <w:rPr/>
         <w:t xml:space="preserve">循环（1）</w:t>
       </w:r>
     </w:p>
     <w:p>
-      <w:r>
+      <w:pPr>
+        <w:pStyle w:val="Normal"/>
+      </w:pPr>
+      <w:r>
+        <w:rPr/>
         <w:t xml:space="preserve">完全套用 online softmax 的做法。为了不混淆，用 </w:t>
       </w:r>
       <w:r>
         <w:rPr>
-          <w:rFonts w:ascii="Menlo" w:eastAsia="Heiti SC" w:hAnsi="Menlo"/>
+          <w:rFonts w:ascii="Menlo" w:hAnsi="Menlo" w:eastAsia="Heiti SC"/>
           <w:sz w:val="22"/>
-          <w:szCs w:val="22"/>
-          <w:shd w:fill="F1F3F5"/>
+          <w:shd w:val="clear" w:fill="F1F3F5"/>
         </w:rPr>
         <w:t xml:space="preserve">n</w:t>
       </w:r>
       <w:r>
+        <w:rPr/>
         <w:t xml:space="preserve">、</w:t>
       </w:r>
       <w:r>
         <w:rPr>
-          <w:rFonts w:ascii="Menlo" w:eastAsia="Heiti SC" w:hAnsi="Menlo"/>
+          <w:rFonts w:ascii="Menlo" w:hAnsi="Menlo" w:eastAsia="Heiti SC"/>
           <w:sz w:val="22"/>
-          <w:szCs w:val="22"/>
-          <w:shd w:fill="F1F3F5"/>
+          <w:shd w:val="clear" w:fill="F1F3F5"/>
         </w:rPr>
         <w:t xml:space="preserve">m</w:t>
       </w:r>
       <w:r>
+        <w:rPr/>
         <w:t xml:space="preserve">、</w:t>
       </w:r>
       <w:r>
         <w:rPr>
-          <w:rFonts w:ascii="Menlo" w:eastAsia="Heiti SC" w:hAnsi="Menlo"/>
+          <w:rFonts w:ascii="Menlo" w:hAnsi="Menlo" w:eastAsia="Heiti SC"/>
           <w:sz w:val="22"/>
-          <w:szCs w:val="22"/>
-          <w:shd w:fill="F1F3F5"/>
+          <w:shd w:val="clear" w:fill="F1F3F5"/>
         </w:rPr>
         <w:t xml:space="preserve">d</w:t>
       </w:r>
       <w:r>
+        <w:rPr/>
         <w:t xml:space="preserve"> 分别表示 N、M、D 三个维度上的下标：</w:t>
       </w:r>
     </w:p>
     <w:p>
       <w:pPr>
+        <w:pStyle w:val="Normal"/>
         <w:keepLines/>
-        <w:spacing w:after="180" w:before="100"/>
+        <w:spacing w:before="100" w:after="180"/>
         <w:jc w:val="center"/>
       </w:pPr>
       <w:r>
         <w:drawing>
           <wp:inline distT="0" distB="0" distL="0" distR="0">
             <wp:extent cx="2445693" cy="398115"/>
-            <wp:effectExtent t="0" r="0" b="0" l="0"/>
-            <wp:docPr id="1" name="asset-010" descr=" x_{n,m} = \mathbb{X}[n,m] = \mathbb{Q}[n,:] \cdot \mathbb{K}^T[:,m] " title="display-math"/>
+            <wp:effectExtent l="0" t="0" r="0" b="0"/>
+            <wp:docPr id="10" name="asset-010" descr=" x_{n,m} = \mathbb{X}[n,m] = \mathbb{Q}[n,:] \cdot \mathbb{K}^T[:,m] "/>
             <wp:cNvGraphicFramePr>
-              <a:graphicFrameLocks xmlns:a="http://schemas.openxmlformats.org/drawingml/2006/main" noChangeAspect="1"/>
+              <a:graphicFrameLocks noChangeAspect="1"/>
             </wp:cNvGraphicFramePr>
-            <a:graphic xmlns:a="http://schemas.openxmlformats.org/drawingml/2006/main">
+            <a:graphic>
               <a:graphicData uri="http://schemas.openxmlformats.org/drawingml/2006/picture">
-                <pic:pic xmlns:pic="http://schemas.openxmlformats.org/drawingml/2006/picture">
+                <pic:pic>
                   <pic:nvPicPr>
-                    <pic:cNvPr id="0" name="" descr=""/>
-                    <pic:cNvPicPr>
-                      <a:picLocks noChangeAspect="1" noChangeArrowheads="1"/>
-                    </pic:cNvPicPr>
+                    <pic:cNvPr id="10" name="asset-010"/>
+                    <pic:cNvPicPr/>
                   </pic:nvPicPr>
                   <pic:blipFill>
-                    <a:blip r:embed="rId16" cstate="none"/>
-                    <a:srcRect/>
+                    <a:blip r:embed="R61f50d436bc347a6" cstate="print"/>
                     <a:stretch>
                       <a:fillRect/>
                     </a:stretch>
                   </pic:blipFill>
-                  <pic:spPr bwMode="auto">
+                  <pic:spPr>
                     <a:xfrm>
                       <a:off x="0" y="0"/>
                       <a:ext cx="2445693" cy="398115"/>
@@ -1234,102 +1375,104 @@
       </w:r>
     </w:p>
     <w:p>
-      <w:r>
+      <w:pPr>
+        <w:pStyle w:val="Normal"/>
+      </w:pPr>
+      <w:r>
+        <w:rPr/>
         <w:t xml:space="preserve">矩阵 X 的 shape 是 </w:t>
       </w:r>
       <w:r>
         <w:rPr>
-          <w:rFonts w:ascii="Menlo" w:eastAsia="Heiti SC" w:hAnsi="Menlo"/>
+          <w:rFonts w:ascii="Menlo" w:hAnsi="Menlo" w:eastAsia="Heiti SC"/>
           <w:sz w:val="22"/>
-          <w:szCs w:val="22"/>
-          <w:shd w:fill="F1F3F5"/>
+          <w:shd w:val="clear" w:fill="F1F3F5"/>
         </w:rPr>
         <w:t xml:space="preserve">[N, M]</w:t>
       </w:r>
       <w:r>
+        <w:rPr/>
         <w:t xml:space="preserve">，但 softmax 只作用在它的 inner dimension 上，outer dimension 只是重复同样的循环。所以简单起见，只看 X 的一行。</w:t>
       </w:r>
       <w:r>
         <w:rPr>
-          <w:rFonts w:ascii="Menlo" w:eastAsia="Heiti SC" w:hAnsi="Menlo"/>
+          <w:rFonts w:ascii="Menlo" w:hAnsi="Menlo" w:eastAsia="Heiti SC"/>
           <w:sz w:val="22"/>
-          <w:szCs w:val="22"/>
-          <w:shd w:fill="F1F3F5"/>
+          <w:shd w:val="clear" w:fill="F1F3F5"/>
         </w:rPr>
         <w:t xml:space="preserve">n</w:t>
       </w:r>
       <w:r>
+        <w:rPr/>
         <w:t xml:space="preserve"> 是外循环 </w:t>
       </w:r>
       <w:r>
         <w:rPr>
-          <w:rFonts w:ascii="Menlo" w:eastAsia="Heiti SC" w:hAnsi="Menlo"/>
+          <w:rFonts w:ascii="Menlo" w:hAnsi="Menlo" w:eastAsia="Heiti SC"/>
           <w:sz w:val="22"/>
-          <w:szCs w:val="22"/>
-          <w:shd w:fill="F1F3F5"/>
+          <w:shd w:val="clear" w:fill="F1F3F5"/>
         </w:rPr>
         <w:t xml:space="preserve">for n in range(N)</w:t>
       </w:r>
       <w:r>
+        <w:rPr/>
         <w:t xml:space="preserve"> 的变量，</w:t>
       </w:r>
       <w:r>
         <w:rPr>
-          <w:rFonts w:ascii="Menlo" w:eastAsia="Heiti SC" w:hAnsi="Menlo"/>
+          <w:rFonts w:ascii="Menlo" w:hAnsi="Menlo" w:eastAsia="Heiti SC"/>
           <w:sz w:val="22"/>
-          <w:szCs w:val="22"/>
-          <w:shd w:fill="F1F3F5"/>
+          <w:shd w:val="clear" w:fill="F1F3F5"/>
         </w:rPr>
         <w:t xml:space="preserve">m</w:t>
       </w:r>
       <w:r>
+        <w:rPr/>
         <w:t xml:space="preserve"> 是内循环 </w:t>
       </w:r>
       <w:r>
         <w:rPr>
-          <w:rFonts w:ascii="Menlo" w:eastAsia="Heiti SC" w:hAnsi="Menlo"/>
+          <w:rFonts w:ascii="Menlo" w:hAnsi="Menlo" w:eastAsia="Heiti SC"/>
           <w:sz w:val="22"/>
-          <w:szCs w:val="22"/>
-          <w:shd w:fill="F1F3F5"/>
+          <w:shd w:val="clear" w:fill="F1F3F5"/>
         </w:rPr>
         <w:t xml:space="preserve">for m in range(M)</w:t>
       </w:r>
       <w:r>
+        <w:rPr/>
         <w:t xml:space="preserve"> 的变量：</w:t>
       </w:r>
     </w:p>
     <w:p>
       <w:pPr>
+        <w:pStyle w:val="Normal"/>
         <w:keepLines/>
-        <w:spacing w:after="180" w:before="100"/>
+        <w:spacing w:before="100" w:after="180"/>
         <w:jc w:val="center"/>
       </w:pPr>
       <w:r>
         <w:drawing>
           <wp:inline distT="0" distB="0" distL="0" distR="0">
             <wp:extent cx="2245221" cy="911721"/>
-            <wp:effectExtent t="0" r="0" b="0" l="0"/>
-            <wp:docPr id="1" name="asset-011" descr=" \begin{aligned} x_m &amp;= \mathbb{Q}[n,:] \cdot \mathbb{K}^T[:,m], \\ g_m &amp;= \max(g_{m-1}, x_m), \\ s_m &amp;= s_{m-1} \times e^{g_{m-1} - g_m} + e^{x_m - g_m}. \end{aligned} " title="display-math"/>
+            <wp:effectExtent l="0" t="0" r="0" b="0"/>
+            <wp:docPr id="11" name="asset-011" descr=" \begin{aligned}&#10;x_m &amp;= \mathbb{Q}[n,:] \cdot \mathbb{K}^T[:,m], \\&#10;g_m &amp;= \max(g_{m-1}, x_m), \\&#10;s_m &amp;= s_{m-1} \times e^{g_{m-1} - g_m} + e^{x_m - g_m}.&#10;\end{aligned} "/>
             <wp:cNvGraphicFramePr>
-              <a:graphicFrameLocks xmlns:a="http://schemas.openxmlformats.org/drawingml/2006/main" noChangeAspect="1"/>
+              <a:graphicFrameLocks noChangeAspect="1"/>
             </wp:cNvGraphicFramePr>
-            <a:graphic xmlns:a="http://schemas.openxmlformats.org/drawingml/2006/main">
+            <a:graphic>
               <a:graphicData uri="http://schemas.openxmlformats.org/drawingml/2006/picture">
-                <pic:pic xmlns:pic="http://schemas.openxmlformats.org/drawingml/2006/picture">
+                <pic:pic>
                   <pic:nvPicPr>
-                    <pic:cNvPr id="0" name="" descr=""/>
-                    <pic:cNvPicPr>
-                      <a:picLocks noChangeAspect="1" noChangeArrowheads="1"/>
-                    </pic:cNvPicPr>
+                    <pic:cNvPr id="11" name="asset-011"/>
+                    <pic:cNvPicPr/>
                   </pic:nvPicPr>
                   <pic:blipFill>
-                    <a:blip r:embed="rId17" cstate="none"/>
-                    <a:srcRect/>
+                    <a:blip r:embed="Re6e17364ecad421f" cstate="print"/>
                     <a:stretch>
                       <a:fillRect/>
                     </a:stretch>
                   </pic:blipFill>
-                  <pic:spPr bwMode="auto">
+                  <pic:spPr>
                     <a:xfrm>
                       <a:off x="0" y="0"/>
                       <a:ext cx="2245221" cy="911721"/>
@@ -1349,56 +1492,62 @@
       <w:pPr>
         <w:pStyle w:val="Heading2"/>
         <w:keepNext/>
-      </w:pPr>
-      <w:r>
+        <w:pageBreakBefore/>
+      </w:pPr>
+      <w:r>
+        <w:rPr/>
         <w:t xml:space="preserve">循环（2）</w:t>
       </w:r>
     </w:p>
     <w:p>
-      <w:r>
+      <w:pPr>
+        <w:pStyle w:val="Normal"/>
+      </w:pPr>
+      <w:r>
+        <w:rPr/>
         <w:t xml:space="preserve">把类似的思路用在 </w:t>
       </w:r>
-      <w:bookmarkStart w:name="inline-math-33" w:id="1"/>
-      <w:r>
+      <w:bookmarkStart w:name="inline-math-33" w:id="33"/>
+      <w:r>
+        <w:rPr/>
         <w:t xml:space="preserve">Y ⋅ V</w:t>
       </w:r>
-      <w:bookmarkEnd w:id="1"/>
-      <w:r>
+      <w:bookmarkEnd w:id="33"/>
+      <w:r>
+        <w:rPr/>
         <w:t xml:space="preserve"> 上，可以得到：</w:t>
       </w:r>
     </w:p>
     <w:p>
       <w:pPr>
+        <w:pStyle w:val="Normal"/>
         <w:keepLines/>
-        <w:spacing w:after="180" w:before="100"/>
+        <w:spacing w:before="100" w:after="180"/>
         <w:jc w:val="center"/>
       </w:pPr>
       <w:r>
         <w:drawing>
           <wp:inline distT="0" distB="0" distL="0" distR="0">
             <wp:extent cx="2004864" cy="1115616"/>
-            <wp:effectExtent t="0" r="0" b="0" l="0"/>
-            <wp:docPr id="1" name="asset-012" descr=" \begin{aligned} y_m &amp;= \frac{e^{x_m - g_M}}{s_M}, \\ \vec{A}_0 &amp;= \vec{0}, \\ \vec{A}_m &amp;= \vec{A}_{m-1} + y_m \times \mathbb{V}[m,:]. \end{aligned} " title="display-math"/>
+            <wp:effectExtent l="0" t="0" r="0" b="0"/>
+            <wp:docPr id="12" name="asset-012" descr=" \begin{aligned}&#10;y_m &amp;= \frac{e^{x_m - g_M}}{s_M}, \\&#10;\vec{A}_0 &amp;= \vec{0}, \\&#10;\vec{A}_m &amp;= \vec{A}_{m-1} + y_m \times \mathbb{V}[m,:].&#10;\end{aligned} "/>
             <wp:cNvGraphicFramePr>
-              <a:graphicFrameLocks xmlns:a="http://schemas.openxmlformats.org/drawingml/2006/main" noChangeAspect="1"/>
+              <a:graphicFrameLocks noChangeAspect="1"/>
             </wp:cNvGraphicFramePr>
-            <a:graphic xmlns:a="http://schemas.openxmlformats.org/drawingml/2006/main">
+            <a:graphic>
               <a:graphicData uri="http://schemas.openxmlformats.org/drawingml/2006/picture">
-                <pic:pic xmlns:pic="http://schemas.openxmlformats.org/drawingml/2006/picture">
+                <pic:pic>
                   <pic:nvPicPr>
-                    <pic:cNvPr id="0" name="" descr=""/>
-                    <pic:cNvPicPr>
-                      <a:picLocks noChangeAspect="1" noChangeArrowheads="1"/>
-                    </pic:cNvPicPr>
+                    <pic:cNvPr id="12" name="asset-012"/>
+                    <pic:cNvPicPr/>
                   </pic:nvPicPr>
                   <pic:blipFill>
-                    <a:blip r:embed="rId18" cstate="none"/>
-                    <a:srcRect/>
+                    <a:blip r:embed="R83a0be739a9b451f" cstate="print"/>
                     <a:stretch>
                       <a:fillRect/>
                     </a:stretch>
                   </pic:blipFill>
-                  <pic:spPr bwMode="auto">
+                  <pic:spPr>
                     <a:xfrm>
                       <a:off x="0" y="0"/>
                       <a:ext cx="2004864" cy="1115616"/>
@@ -1415,19 +1564,26 @@
       </w:r>
     </w:p>
     <w:p>
-      <w:r>
+      <w:pPr>
+        <w:pStyle w:val="Normal"/>
+      </w:pPr>
+      <w:r>
+        <w:rPr/>
         <w:t xml:space="preserve">这里 </w:t>
       </w:r>
-      <w:bookmarkStart w:name="inline-math-34" w:id="1"/>
-      <w:r>
+      <w:bookmarkStart w:name="inline-math-34" w:id="34"/>
+      <w:r>
+        <w:rPr/>
         <w:t xml:space="preserve">V[m,:]</w:t>
       </w:r>
-      <w:bookmarkEnd w:id="1"/>
-      <w:r>
+      <w:bookmarkEnd w:id="34"/>
+      <w:r>
+        <w:rPr/>
         <w:t xml:space="preserve"> 是长度为 D 的一行，所以 </w:t>
       </w:r>
-      <w:bookmarkStart w:name="inline-math-35" w:id="1"/>
-      <w:r>
+      <w:bookmarkStart w:name="inline-math-35" w:id="35"/>
+      <w:r>
+        <w:rPr/>
         <w:t xml:space="preserve">vec(A)</w:t>
       </w:r>
       <w:r>
@@ -1436,12 +1592,14 @@
         </w:rPr>
         <w:t xml:space="preserve">m</w:t>
       </w:r>
-      <w:bookmarkEnd w:id="1"/>
-      <w:r>
+      <w:bookmarkEnd w:id="35"/>
+      <w:r>
+        <w:rPr/>
         <w:t xml:space="preserve"> 算的是一个 vector，而不是 scalar。这样做的好处是每个 </w:t>
       </w:r>
-      <w:bookmarkStart w:name="inline-math-36" w:id="1"/>
-      <w:r>
+      <w:bookmarkStart w:name="inline-math-36" w:id="36"/>
+      <w:r>
+        <w:rPr/>
         <w:t xml:space="preserve">y</w:t>
       </w:r>
       <w:r>
@@ -1450,8 +1608,9 @@
         </w:rPr>
         <w:t xml:space="preserve">m</w:t>
       </w:r>
-      <w:bookmarkEnd w:id="1"/>
-      <w:r>
+      <w:bookmarkEnd w:id="36"/>
+      <w:r>
+        <w:rPr/>
         <w:t xml:space="preserve"> 用完就可以丢掉，而且这个写法正好引出后面的 FlashAttention。</w:t>
       </w:r>
     </w:p>
@@ -1461,58 +1620,64 @@
         <w:keepNext/>
       </w:pPr>
       <w:r>
+        <w:rPr/>
         <w:t xml:space="preserve">如何理解？</w:t>
       </w:r>
     </w:p>
     <w:p>
-      <w:r>
+      <w:pPr>
+        <w:pStyle w:val="Normal"/>
+      </w:pPr>
+      <w:r>
+        <w:rPr/>
         <w:t xml:space="preserve">如果你跟我一样觉得这一步有点绕，可以这么理解：</w:t>
       </w:r>
       <w:r>
         <w:rPr>
           <w:b/>
-          <w:bCs/>
         </w:rPr>
         <w:t xml:space="preserve">只是把矩阵乘法的内外循环换了一下，再把中间结果存起来。</w:t>
       </w:r>
     </w:p>
     <w:p>
-      <w:r>
+      <w:pPr>
+        <w:pStyle w:val="Normal"/>
+      </w:pPr>
+      <w:r>
+        <w:rPr/>
         <w:t xml:space="preserve">这里我们解释一下原理细节。先看一个普通的矩阵乘法：</w:t>
       </w:r>
     </w:p>
     <w:p>
       <w:pPr>
+        <w:pStyle w:val="Normal"/>
         <w:keepLines/>
-        <w:spacing w:after="180" w:before="100"/>
+        <w:spacing w:before="100" w:after="180"/>
         <w:jc w:val="center"/>
       </w:pPr>
       <w:r>
         <w:drawing>
           <wp:inline distT="0" distB="0" distL="0" distR="0">
             <wp:extent cx="3394621" cy="681038"/>
-            <wp:effectExtent t="0" r="0" b="0" l="0"/>
-            <wp:docPr id="1" name="asset-013" descr=" \mathbb{A}[n,d] = \mathbb{Y}[n,:] \cdot \mathbb{V}[:,d] = \sum_{m=1}^{M} \mathbb{Y}[n,m] \times \mathbb{V}[m,d] " title="display-math"/>
+            <wp:effectExtent l="0" t="0" r="0" b="0"/>
+            <wp:docPr id="13" name="asset-013" descr=" \mathbb{A}[n,d] = \mathbb{Y}[n,:] \cdot \mathbb{V}[:,d] = \sum_{m=1}^{M} \mathbb{Y}[n,m] \times \mathbb{V}[m,d] "/>
             <wp:cNvGraphicFramePr>
-              <a:graphicFrameLocks xmlns:a="http://schemas.openxmlformats.org/drawingml/2006/main" noChangeAspect="1"/>
+              <a:graphicFrameLocks noChangeAspect="1"/>
             </wp:cNvGraphicFramePr>
-            <a:graphic xmlns:a="http://schemas.openxmlformats.org/drawingml/2006/main">
+            <a:graphic>
               <a:graphicData uri="http://schemas.openxmlformats.org/drawingml/2006/picture">
-                <pic:pic xmlns:pic="http://schemas.openxmlformats.org/drawingml/2006/picture">
+                <pic:pic>
                   <pic:nvPicPr>
-                    <pic:cNvPr id="0" name="" descr=""/>
-                    <pic:cNvPicPr>
-                      <a:picLocks noChangeAspect="1" noChangeArrowheads="1"/>
-                    </pic:cNvPicPr>
+                    <pic:cNvPr id="13" name="asset-013"/>
+                    <pic:cNvPicPr/>
                   </pic:nvPicPr>
                   <pic:blipFill>
-                    <a:blip r:embed="rId19" cstate="none"/>
-                    <a:srcRect/>
+                    <a:blip r:embed="R84a36610fcd742b6" cstate="print"/>
                     <a:stretch>
                       <a:fillRect/>
                     </a:stretch>
                   </pic:blipFill>
-                  <pic:spPr bwMode="auto">
+                  <pic:spPr>
                     <a:xfrm>
                       <a:off x="0" y="0"/>
                       <a:ext cx="3394621" cy="681038"/>
@@ -1530,36 +1695,34 @@
     </w:p>
     <w:p>
       <w:pPr>
+        <w:pStyle w:val="Normal"/>
         <w:keepLines/>
-        <w:spacing w:after="180" w:before="100"/>
+        <w:spacing w:before="100" w:after="180"/>
         <w:jc w:val="left"/>
       </w:pPr>
       <w:r>
         <w:drawing>
           <wp:inline distT="0" distB="0" distL="0" distR="0">
             <wp:extent cx="6096000" cy="2066925"/>
-            <wp:effectExtent t="0" r="0" b="0" l="0"/>
-            <wp:docPr id="1" name="asset-014" descr="M, D = 6, 4 matrix_y = [[random.random() for _ in range(M)] for _ in range(N)] matrix_v = [[random.random() for _ in range(D)] for _ in range(M)]  matrix_a = [[0.0] * D for _ in range(N)] for n in range(N):     for d in range(D):         for m in range(M):             matrix_a[n][d] += matrix_y[n][m] * matrix_v[m][d]" title="code-block"/>
+            <wp:effectExtent l="0" t="0" r="0" b="0"/>
+            <wp:docPr id="14" name="asset-014" descr="M, D = 6, 4&#10;matrix_y = [[random.random() for _ in range(M)] for _ in range(N)]&#10;matrix_v = [[random.random() for _ in range(D)] for _ in range(M)]&#10;&#10;matrix_a = [[0.0] * D for _ in range(N)]&#10;for n in range(N):&#10;    for d in range(D):&#10;        for m in range(M):&#10;            matrix_a[n][d] += matrix_y[n][m] * matrix_v[m][d]"/>
             <wp:cNvGraphicFramePr>
-              <a:graphicFrameLocks xmlns:a="http://schemas.openxmlformats.org/drawingml/2006/main" noChangeAspect="1"/>
+              <a:graphicFrameLocks noChangeAspect="1"/>
             </wp:cNvGraphicFramePr>
-            <a:graphic xmlns:a="http://schemas.openxmlformats.org/drawingml/2006/main">
+            <a:graphic>
               <a:graphicData uri="http://schemas.openxmlformats.org/drawingml/2006/picture">
-                <pic:pic xmlns:pic="http://schemas.openxmlformats.org/drawingml/2006/picture">
+                <pic:pic>
                   <pic:nvPicPr>
-                    <pic:cNvPr id="0" name="" descr=""/>
-                    <pic:cNvPicPr>
-                      <a:picLocks noChangeAspect="1" noChangeArrowheads="1"/>
-                    </pic:cNvPicPr>
+                    <pic:cNvPr id="14" name="asset-014"/>
+                    <pic:cNvPicPr/>
                   </pic:nvPicPr>
                   <pic:blipFill>
-                    <a:blip r:embed="rId20" cstate="none"/>
-                    <a:srcRect/>
+                    <a:blip r:embed="R3feb0740d30c491f" cstate="print"/>
                     <a:stretch>
                       <a:fillRect/>
                     </a:stretch>
                   </pic:blipFill>
-                  <pic:spPr bwMode="auto">
+                  <pic:spPr>
                     <a:xfrm>
                       <a:off x="0" y="0"/>
                       <a:ext cx="6096000" cy="2066925"/>
@@ -1576,42 +1739,44 @@
       </w:r>
     </w:p>
     <w:p>
-      <w:r>
+      <w:pPr>
+        <w:pStyle w:val="Normal"/>
+      </w:pPr>
+      <w:r>
+        <w:rPr/>
         <w:t xml:space="preserve">如果把循环 D 和循环 M 换个位置，结果完全一样，只是计算顺序变了：原来是一个一个算 A 的 element，现在是先存着 A 一整行的中间值（partial sum），再不断往上累加。</w:t>
       </w:r>
     </w:p>
     <w:p>
       <w:pPr>
+        <w:pStyle w:val="Normal"/>
         <w:keepLines/>
-        <w:spacing w:after="180" w:before="100"/>
+        <w:spacing w:before="100" w:after="180"/>
         <w:jc w:val="left"/>
       </w:pPr>
       <w:r>
         <w:drawing>
           <wp:inline distT="0" distB="0" distL="0" distR="0">
             <wp:extent cx="6096000" cy="1666875"/>
-            <wp:effectExtent t="0" r="0" b="0" l="0"/>
-            <wp:docPr id="1" name="asset-015" descr="matrix_a2 = [[0.0] * D for _ in range(N)] for n in range(N):     for m in range(M):         for d in range(D):             matrix_a2[n][d] += matrix_y[n][m] * matrix_v[m][d]  assert matrix_a2 == matrix_a" title="code-block"/>
+            <wp:effectExtent l="0" t="0" r="0" b="0"/>
+            <wp:docPr id="15" name="asset-015" descr="matrix_a2 = [[0.0] * D for _ in range(N)]&#10;for n in range(N):&#10;    for m in range(M):&#10;        for d in range(D):&#10;            matrix_a2[n][d] += matrix_y[n][m] * matrix_v[m][d]&#10;&#10;assert matrix_a2 == matrix_a"/>
             <wp:cNvGraphicFramePr>
-              <a:graphicFrameLocks xmlns:a="http://schemas.openxmlformats.org/drawingml/2006/main" noChangeAspect="1"/>
+              <a:graphicFrameLocks noChangeAspect="1"/>
             </wp:cNvGraphicFramePr>
-            <a:graphic xmlns:a="http://schemas.openxmlformats.org/drawingml/2006/main">
+            <a:graphic>
               <a:graphicData uri="http://schemas.openxmlformats.org/drawingml/2006/picture">
-                <pic:pic xmlns:pic="http://schemas.openxmlformats.org/drawingml/2006/picture">
+                <pic:pic>
                   <pic:nvPicPr>
-                    <pic:cNvPr id="0" name="" descr=""/>
-                    <pic:cNvPicPr>
-                      <a:picLocks noChangeAspect="1" noChangeArrowheads="1"/>
-                    </pic:cNvPicPr>
+                    <pic:cNvPr id="15" name="asset-015"/>
+                    <pic:cNvPicPr/>
                   </pic:nvPicPr>
                   <pic:blipFill>
-                    <a:blip r:embed="rId21" cstate="none"/>
-                    <a:srcRect/>
+                    <a:blip r:embed="Rbb3744cd2906482e" cstate="print"/>
                     <a:stretch>
                       <a:fillRect/>
                     </a:stretch>
                   </pic:blipFill>
-                  <pic:spPr bwMode="auto">
+                  <pic:spPr>
                     <a:xfrm>
                       <a:off x="0" y="0"/>
                       <a:ext cx="6096000" cy="1666875"/>
@@ -1628,42 +1793,44 @@
       </w:r>
     </w:p>
     <w:p>
-      <w:r>
+      <w:pPr>
+        <w:pStyle w:val="Normal"/>
+      </w:pPr>
+      <w:r>
+        <w:rPr/>
         <w:t xml:space="preserve">对应的数学表达变成了是：</w:t>
       </w:r>
     </w:p>
     <w:p>
       <w:pPr>
+        <w:pStyle w:val="Normal"/>
         <w:keepLines/>
-        <w:spacing w:after="180" w:before="100"/>
+        <w:spacing w:before="100" w:after="180"/>
         <w:jc w:val="center"/>
       </w:pPr>
       <w:r>
         <w:drawing>
           <wp:inline distT="0" distB="0" distL="0" distR="0">
             <wp:extent cx="2197298" cy="681038"/>
-            <wp:effectExtent t="0" r="0" b="0" l="0"/>
-            <wp:docPr id="1" name="asset-016" descr=" \mathbb{A}[n,:] = \sum_{m=1}^{M} \mathbb{Y}[n,m] \times \mathbb{V}[m,:] " title="display-math"/>
+            <wp:effectExtent l="0" t="0" r="0" b="0"/>
+            <wp:docPr id="16" name="asset-016" descr=" \mathbb{A}[n,:] = \sum_{m=1}^{M} \mathbb{Y}[n,m] \times \mathbb{V}[m,:] "/>
             <wp:cNvGraphicFramePr>
-              <a:graphicFrameLocks xmlns:a="http://schemas.openxmlformats.org/drawingml/2006/main" noChangeAspect="1"/>
+              <a:graphicFrameLocks noChangeAspect="1"/>
             </wp:cNvGraphicFramePr>
-            <a:graphic xmlns:a="http://schemas.openxmlformats.org/drawingml/2006/main">
+            <a:graphic>
               <a:graphicData uri="http://schemas.openxmlformats.org/drawingml/2006/picture">
-                <pic:pic xmlns:pic="http://schemas.openxmlformats.org/drawingml/2006/picture">
+                <pic:pic>
                   <pic:nvPicPr>
-                    <pic:cNvPr id="0" name="" descr=""/>
-                    <pic:cNvPicPr>
-                      <a:picLocks noChangeAspect="1" noChangeArrowheads="1"/>
-                    </pic:cNvPicPr>
+                    <pic:cNvPr id="16" name="asset-016"/>
+                    <pic:cNvPicPr/>
                   </pic:nvPicPr>
                   <pic:blipFill>
-                    <a:blip r:embed="rId22" cstate="none"/>
-                    <a:srcRect/>
+                    <a:blip r:embed="R7d3425f27d124e07" cstate="print"/>
                     <a:stretch>
                       <a:fillRect/>
                     </a:stretch>
                   </pic:blipFill>
-                  <pic:spPr bwMode="auto">
+                  <pic:spPr>
                     <a:xfrm>
                       <a:off x="0" y="0"/>
                       <a:ext cx="2197298" cy="681038"/>
@@ -1680,11 +1847,16 @@
       </w:r>
     </w:p>
     <w:p>
-      <w:r>
+      <w:pPr>
+        <w:pStyle w:val="Normal"/>
+      </w:pPr>
+      <w:r>
+        <w:rPr/>
         <w:t xml:space="preserve">循环（2）里的 </w:t>
       </w:r>
-      <w:bookmarkStart w:name="inline-math-37" w:id="1"/>
-      <w:r>
+      <w:bookmarkStart w:name="inline-math-37" w:id="37"/>
+      <w:r>
+        <w:rPr/>
         <w:t xml:space="preserve">y</w:t>
       </w:r>
       <w:r>
@@ -1693,20 +1865,24 @@
         </w:rPr>
         <w:t xml:space="preserve">m</w:t>
       </w:r>
-      <w:bookmarkEnd w:id="1"/>
-      <w:r>
+      <w:bookmarkEnd w:id="37"/>
+      <w:r>
+        <w:rPr/>
         <w:t xml:space="preserve"> 就是第 n 行的 </w:t>
       </w:r>
-      <w:bookmarkStart w:name="inline-math-38" w:id="1"/>
-      <w:r>
+      <w:bookmarkStart w:name="inline-math-38" w:id="38"/>
+      <w:r>
+        <w:rPr/>
         <w:t xml:space="preserve">Y[n,m]</w:t>
       </w:r>
-      <w:bookmarkEnd w:id="1"/>
-      <w:r>
+      <w:bookmarkEnd w:id="38"/>
+      <w:r>
+        <w:rPr/>
         <w:t xml:space="preserve">。记 </w:t>
       </w:r>
-      <w:bookmarkStart w:name="inline-math-39" w:id="1"/>
-      <w:r>
+      <w:bookmarkStart w:name="inline-math-39" w:id="39"/>
+      <w:r>
+        <w:rPr/>
         <w:t xml:space="preserve">vec(V)</w:t>
       </w:r>
       <w:r>
@@ -1716,45 +1892,45 @@
         <w:t xml:space="preserve">m</w:t>
       </w:r>
       <w:r>
+        <w:rPr/>
         <w:t xml:space="preserve"> = V[m,:]</w:t>
       </w:r>
-      <w:bookmarkEnd w:id="1"/>
-      <w:r>
+      <w:bookmarkEnd w:id="39"/>
+      <w:r>
+        <w:rPr/>
         <w:t xml:space="preserve">，那么：</w:t>
       </w:r>
     </w:p>
     <w:p>
       <w:pPr>
+        <w:pStyle w:val="Normal"/>
         <w:keepLines/>
-        <w:spacing w:after="180" w:before="100"/>
+        <w:spacing w:before="100" w:after="180"/>
         <w:jc w:val="center"/>
       </w:pPr>
       <w:r>
         <w:drawing>
           <wp:inline distT="0" distB="0" distL="0" distR="0">
             <wp:extent cx="3415308" cy="681038"/>
-            <wp:effectExtent t="0" r="0" b="0" l="0"/>
-            <wp:docPr id="1" name="asset-017" descr=" \mathbb{A}[n,:] = \vec{A}_M = \sum_{m=1}^{M} y_m \times \vec{V}_m = \sum_{m=1}^{M} \frac{e^{x_m - g_M}}{s_M} \times \vec{V}_m " title="display-math"/>
+            <wp:effectExtent l="0" t="0" r="0" b="0"/>
+            <wp:docPr id="17" name="asset-017" descr=" \mathbb{A}[n,:] = \vec{A}_M = \sum_{m=1}^{M} y_m \times \vec{V}_m = \sum_{m=1}^{M} \frac{e^{x_m - g_M}}{s_M} \times \vec{V}_m "/>
             <wp:cNvGraphicFramePr>
-              <a:graphicFrameLocks xmlns:a="http://schemas.openxmlformats.org/drawingml/2006/main" noChangeAspect="1"/>
+              <a:graphicFrameLocks noChangeAspect="1"/>
             </wp:cNvGraphicFramePr>
-            <a:graphic xmlns:a="http://schemas.openxmlformats.org/drawingml/2006/main">
+            <a:graphic>
               <a:graphicData uri="http://schemas.openxmlformats.org/drawingml/2006/picture">
-                <pic:pic xmlns:pic="http://schemas.openxmlformats.org/drawingml/2006/picture">
+                <pic:pic>
                   <pic:nvPicPr>
-                    <pic:cNvPr id="0" name="" descr=""/>
-                    <pic:cNvPicPr>
-                      <a:picLocks noChangeAspect="1" noChangeArrowheads="1"/>
-                    </pic:cNvPicPr>
+                    <pic:cNvPr id="17" name="asset-017"/>
+                    <pic:cNvPicPr/>
                   </pic:nvPicPr>
                   <pic:blipFill>
-                    <a:blip r:embed="rId23" cstate="none"/>
-                    <a:srcRect/>
+                    <a:blip r:embed="Re4dba090b5504c2d" cstate="print"/>
                     <a:stretch>
                       <a:fillRect/>
                     </a:stretch>
                   </pic:blipFill>
-                  <pic:spPr bwMode="auto">
+                  <pic:spPr>
                     <a:xfrm>
                       <a:off x="0" y="0"/>
                       <a:ext cx="3415308" cy="681038"/>
@@ -1776,15 +1952,21 @@
         <w:keepNext/>
       </w:pPr>
       <w:r>
+        <w:rPr/>
         <w:t xml:space="preserve">优化循环（2）：消除数据依赖、提高并行度</w:t>
       </w:r>
     </w:p>
     <w:p>
-      <w:r>
+      <w:pPr>
+        <w:pStyle w:val="Normal"/>
+      </w:pPr>
+      <w:r>
+        <w:rPr/>
         <w:t xml:space="preserve">上述的循环（2）还有一个问题：它要等循环（1）跑完，拿到最终的 </w:t>
       </w:r>
-      <w:bookmarkStart w:name="inline-math-40" w:id="1"/>
-      <w:r>
+      <w:bookmarkStart w:name="inline-math-40" w:id="40"/>
+      <w:r>
+        <w:rPr/>
         <w:t xml:space="preserve">g</w:t>
       </w:r>
       <w:r>
@@ -1793,12 +1975,14 @@
         </w:rPr>
         <w:t xml:space="preserve">M</w:t>
       </w:r>
-      <w:bookmarkEnd w:id="1"/>
-      <w:r>
+      <w:bookmarkEnd w:id="40"/>
+      <w:r>
+        <w:rPr/>
         <w:t xml:space="preserve"> 和 </w:t>
       </w:r>
-      <w:bookmarkStart w:name="inline-math-41" w:id="1"/>
-      <w:r>
+      <w:bookmarkStart w:name="inline-math-41" w:id="41"/>
+      <w:r>
+        <w:rPr/>
         <w:t xml:space="preserve">s</w:t>
       </w:r>
       <w:r>
@@ -1807,12 +1991,14 @@
         </w:rPr>
         <w:t xml:space="preserve">M</w:t>
       </w:r>
-      <w:bookmarkEnd w:id="1"/>
-      <w:r>
+      <w:bookmarkEnd w:id="41"/>
+      <w:r>
+        <w:rPr/>
         <w:t xml:space="preserve"> 才能开始。这就形成了典型的数据依赖，会影响并行度、拖慢运行效率。我们可以用 online softmax 同样的思路，把 </w:t>
       </w:r>
-      <w:bookmarkStart w:name="inline-math-42" w:id="1"/>
-      <w:r>
+      <w:bookmarkStart w:name="inline-math-42" w:id="42"/>
+      <w:r>
+        <w:rPr/>
         <w:t xml:space="preserve">vec(A)</w:t>
       </w:r>
       <w:r>
@@ -1821,12 +2007,14 @@
         </w:rPr>
         <w:t xml:space="preserve">M</w:t>
       </w:r>
-      <w:bookmarkEnd w:id="1"/>
-      <w:r>
+      <w:bookmarkEnd w:id="42"/>
+      <w:r>
+        <w:rPr/>
         <w:t xml:space="preserve"> 的计算也改成递推 </w:t>
       </w:r>
-      <w:bookmarkStart w:name="inline-math-43" w:id="1"/>
-      <w:r>
+      <w:bookmarkStart w:name="inline-math-43" w:id="43"/>
+      <w:r>
+        <w:rPr/>
         <w:t xml:space="preserve">vec(A)</w:t>
       </w:r>
       <w:r>
@@ -1836,6 +2024,7 @@
         <w:t xml:space="preserve">m</w:t>
       </w:r>
       <w:r>
+        <w:rPr/>
         <w:t xml:space="preserve"> = f(vec(A)</w:t>
       </w:r>
       <w:r>
@@ -1845,14 +2034,17 @@
         <w:t xml:space="preserve">m - 1</w:t>
       </w:r>
       <w:r>
+        <w:rPr/>
         <w:t xml:space="preserve">)</w:t>
       </w:r>
-      <w:bookmarkEnd w:id="1"/>
-      <w:r>
+      <w:bookmarkEnd w:id="43"/>
+      <w:r>
+        <w:rPr/>
         <w:t xml:space="preserve">。做法是构造一个新的 </w:t>
       </w:r>
-      <w:bookmarkStart w:name="inline-math-44" w:id="1"/>
-      <w:r>
+      <w:bookmarkStart w:name="inline-math-44" w:id="44"/>
+      <w:r>
+        <w:rPr/>
         <w:t xml:space="preserve">vec(A)′</w:t>
       </w:r>
       <w:r>
@@ -1861,12 +2053,14 @@
         </w:rPr>
         <w:t xml:space="preserve">m</w:t>
       </w:r>
-      <w:bookmarkEnd w:id="1"/>
-      <w:r>
+      <w:bookmarkEnd w:id="44"/>
+      <w:r>
+        <w:rPr/>
         <w:t xml:space="preserve"> 来去掉这个数据依赖。我们只需要保证它的最后一个单元与目标一致即可， </w:t>
       </w:r>
-      <w:bookmarkStart w:name="inline-math-45" w:id="1"/>
-      <w:r>
+      <w:bookmarkStart w:name="inline-math-45" w:id="45"/>
+      <w:r>
+        <w:rPr/>
         <w:t xml:space="preserve">vec(A)′</w:t>
       </w:r>
       <w:r>
@@ -1876,6 +2070,7 @@
         <w:t xml:space="preserve">M</w:t>
       </w:r>
       <w:r>
+        <w:rPr/>
         <w:t xml:space="preserve"> = vec(A)</w:t>
       </w:r>
       <w:r>
@@ -1884,43 +2079,42 @@
         </w:rPr>
         <w:t xml:space="preserve">M</w:t>
       </w:r>
-      <w:bookmarkEnd w:id="1"/>
-      <w:r>
+      <w:bookmarkEnd w:id="45"/>
+      <w:r>
+        <w:rPr/>
         <w:t xml:space="preserve">，不需要中间过程也相等。</w:t>
       </w:r>
     </w:p>
     <w:p>
       <w:pPr>
+        <w:pStyle w:val="Normal"/>
         <w:keepLines/>
-        <w:spacing w:after="180" w:before="100"/>
+        <w:spacing w:before="100" w:after="180"/>
         <w:jc w:val="center"/>
       </w:pPr>
       <w:r>
         <w:drawing>
           <wp:inline distT="0" distB="0" distL="0" distR="0">
             <wp:extent cx="1572667" cy="654695"/>
-            <wp:effectExtent t="0" r="0" b="0" l="0"/>
-            <wp:docPr id="1" name="asset-018" descr=" \vec{A}'_m = \sum_{i=1}^{m} \frac{e^{x_i - g_m}}{s_m} \times \vec{V}_i " title="display-math"/>
+            <wp:effectExtent l="0" t="0" r="0" b="0"/>
+            <wp:docPr id="18" name="asset-018" descr=" \vec{A}'_m = \sum_{i=1}^{m} \frac{e^{x_i - g_m}}{s_m} \times \vec{V}_i "/>
             <wp:cNvGraphicFramePr>
-              <a:graphicFrameLocks xmlns:a="http://schemas.openxmlformats.org/drawingml/2006/main" noChangeAspect="1"/>
+              <a:graphicFrameLocks noChangeAspect="1"/>
             </wp:cNvGraphicFramePr>
-            <a:graphic xmlns:a="http://schemas.openxmlformats.org/drawingml/2006/main">
+            <a:graphic>
               <a:graphicData uri="http://schemas.openxmlformats.org/drawingml/2006/picture">
-                <pic:pic xmlns:pic="http://schemas.openxmlformats.org/drawingml/2006/picture">
+                <pic:pic>
                   <pic:nvPicPr>
-                    <pic:cNvPr id="0" name="" descr=""/>
-                    <pic:cNvPicPr>
-                      <a:picLocks noChangeAspect="1" noChangeArrowheads="1"/>
-                    </pic:cNvPicPr>
+                    <pic:cNvPr id="18" name="asset-018"/>
+                    <pic:cNvPicPr/>
                   </pic:nvPicPr>
                   <pic:blipFill>
-                    <a:blip r:embed="rId24" cstate="none"/>
-                    <a:srcRect/>
+                    <a:blip r:embed="R0a337e5932cd4f25" cstate="print"/>
                     <a:stretch>
                       <a:fillRect/>
                     </a:stretch>
                   </pic:blipFill>
-                  <pic:spPr bwMode="auto">
+                  <pic:spPr>
                     <a:xfrm>
                       <a:off x="0" y="0"/>
                       <a:ext cx="1572667" cy="654695"/>
@@ -1937,50 +2131,54 @@
       </w:r>
     </w:p>
     <w:p>
-      <w:r>
+      <w:pPr>
+        <w:pStyle w:val="Normal"/>
+      </w:pPr>
+      <w:r>
+        <w:rPr/>
         <w:t xml:space="preserve">当 </w:t>
       </w:r>
-      <w:bookmarkStart w:name="inline-math-46" w:id="1"/>
-      <w:r>
+      <w:bookmarkStart w:name="inline-math-46" w:id="46"/>
+      <w:r>
+        <w:rPr/>
         <w:t xml:space="preserve">m = M</w:t>
       </w:r>
-      <w:bookmarkEnd w:id="1"/>
-      <w:r>
+      <w:bookmarkEnd w:id="46"/>
+      <w:r>
+        <w:rPr/>
         <w:t xml:space="preserve"> 时：</w:t>
       </w:r>
     </w:p>
     <w:p>
       <w:pPr>
+        <w:pStyle w:val="Normal"/>
         <w:keepLines/>
-        <w:spacing w:after="180" w:before="100"/>
+        <w:spacing w:before="100" w:after="180"/>
         <w:jc w:val="center"/>
       </w:pPr>
       <w:r>
         <w:drawing>
           <wp:inline distT="0" distB="0" distL="0" distR="0">
             <wp:extent cx="2068413" cy="682675"/>
-            <wp:effectExtent t="0" r="0" b="0" l="0"/>
-            <wp:docPr id="1" name="asset-019" descr=" \vec{A}'_M = \sum_{i=1}^{M} \frac{e^{x_i - g_M}}{s_M} \times \vec{V}_i = \vec{A}_M " title="display-math"/>
+            <wp:effectExtent l="0" t="0" r="0" b="0"/>
+            <wp:docPr id="19" name="asset-019" descr=" \vec{A}'_M = \sum_{i=1}^{M} \frac{e^{x_i - g_M}}{s_M} \times \vec{V}_i = \vec{A}_M "/>
             <wp:cNvGraphicFramePr>
-              <a:graphicFrameLocks xmlns:a="http://schemas.openxmlformats.org/drawingml/2006/main" noChangeAspect="1"/>
+              <a:graphicFrameLocks noChangeAspect="1"/>
             </wp:cNvGraphicFramePr>
-            <a:graphic xmlns:a="http://schemas.openxmlformats.org/drawingml/2006/main">
+            <a:graphic>
               <a:graphicData uri="http://schemas.openxmlformats.org/drawingml/2006/picture">
-                <pic:pic xmlns:pic="http://schemas.openxmlformats.org/drawingml/2006/picture">
+                <pic:pic>
                   <pic:nvPicPr>
-                    <pic:cNvPr id="0" name="" descr=""/>
-                    <pic:cNvPicPr>
-                      <a:picLocks noChangeAspect="1" noChangeArrowheads="1"/>
-                    </pic:cNvPicPr>
+                    <pic:cNvPr id="19" name="asset-019"/>
+                    <pic:cNvPicPr/>
                   </pic:nvPicPr>
                   <pic:blipFill>
-                    <a:blip r:embed="rId25" cstate="none"/>
-                    <a:srcRect/>
+                    <a:blip r:embed="Rd61bf964fbf94a6d" cstate="print"/>
                     <a:stretch>
                       <a:fillRect/>
                     </a:stretch>
                   </pic:blipFill>
-                  <pic:spPr bwMode="auto">
+                  <pic:spPr>
                     <a:xfrm>
                       <a:off x="0" y="0"/>
                       <a:ext cx="2068413" cy="682675"/>
@@ -1997,11 +2195,16 @@
       </w:r>
     </w:p>
     <w:p>
-      <w:r>
+      <w:pPr>
+        <w:pStyle w:val="Normal"/>
+      </w:pPr>
+      <w:r>
+        <w:rPr/>
         <w:t xml:space="preserve">和上面的 </w:t>
       </w:r>
-      <w:bookmarkStart w:name="inline-math-47" w:id="1"/>
-      <w:r>
+      <w:bookmarkStart w:name="inline-math-47" w:id="47"/>
+      <w:r>
+        <w:rPr/>
         <w:t xml:space="preserve">vec(A)</w:t>
       </w:r>
       <w:r>
@@ -2010,12 +2213,14 @@
         </w:rPr>
         <w:t xml:space="preserve">M</w:t>
       </w:r>
-      <w:bookmarkEnd w:id="1"/>
-      <w:r>
+      <w:bookmarkEnd w:id="47"/>
+      <w:r>
+        <w:rPr/>
         <w:t xml:space="preserve"> 对比，看上去只是把 m 换成 i、把 M 换成 m。但 </w:t>
       </w:r>
-      <w:bookmarkStart w:name="inline-math-48" w:id="1"/>
-      <w:r>
+      <w:bookmarkStart w:name="inline-math-48" w:id="48"/>
+      <w:r>
+        <w:rPr/>
         <w:t xml:space="preserve">vec(A)′</w:t>
       </w:r>
       <w:r>
@@ -2024,48 +2229,51 @@
         </w:rPr>
         <w:t xml:space="preserve">m</w:t>
       </w:r>
-      <w:bookmarkEnd w:id="1"/>
-      <w:r>
+      <w:bookmarkEnd w:id="48"/>
+      <w:r>
+        <w:rPr/>
         <w:t xml:space="preserve"> 的意思变了：它是只看前 m 个 key 时的 attention 结果。这样就可以用递推来算，不用把中间矩阵写到内存里（avoid materializing the matrix）。</w:t>
       </w:r>
     </w:p>
     <w:p>
-      <w:r>
+      <w:pPr>
+        <w:pStyle w:val="Normal"/>
+      </w:pPr>
+      <w:r>
+        <w:rPr/>
         <w:t xml:space="preserve">展开后得到：</w:t>
       </w:r>
     </w:p>
     <w:p>
       <w:pPr>
+        <w:pStyle w:val="Normal"/>
         <w:keepLines/>
-        <w:spacing w:after="180" w:before="100"/>
+        <w:spacing w:before="100" w:after="180"/>
         <w:jc w:val="center"/>
       </w:pPr>
       <w:r>
         <w:drawing>
           <wp:inline distT="0" distB="0" distL="0" distR="0">
             <wp:extent cx="3300115" cy="1009650"/>
-            <wp:effectExtent t="0" r="0" b="0" l="0"/>
-            <wp:docPr id="1" name="asset-020" descr=" \begin{aligned} \vec{A}'_1 &amp;= \frac{e^{x_1 - g_1}}{s_1} \times \vec{V}_1 = \vec{V}_1, \\ \vec{A}'_m &amp;= \vec{A}'_{m-1} \times \frac{s_{m-1} \times e^{g_{m-1} - g_m}}{s_m} + \frac{e^{x_m - g_m}}{s_m} \times \vec{V}_m. \end{aligned} " title="display-math"/>
+            <wp:effectExtent l="0" t="0" r="0" b="0"/>
+            <wp:docPr id="20" name="asset-020" descr=" \begin{aligned}&#10;\vec{A}'_1 &amp;= \frac{e^{x_1 - g_1}}{s_1} \times \vec{V}_1 = \vec{V}_1, \\&#10;\vec{A}'_m &amp;= \vec{A}'_{m-1} \times \frac{s_{m-1} \times e^{g_{m-1} - g_m}}{s_m} + \frac{e^{x_m - g_m}}{s_m} \times \vec{V}_m.&#10;\end{aligned} "/>
             <wp:cNvGraphicFramePr>
-              <a:graphicFrameLocks xmlns:a="http://schemas.openxmlformats.org/drawingml/2006/main" noChangeAspect="1"/>
+              <a:graphicFrameLocks noChangeAspect="1"/>
             </wp:cNvGraphicFramePr>
-            <a:graphic xmlns:a="http://schemas.openxmlformats.org/drawingml/2006/main">
+            <a:graphic>
               <a:graphicData uri="http://schemas.openxmlformats.org/drawingml/2006/picture">
-                <pic:pic xmlns:pic="http://schemas.openxmlformats.org/drawingml/2006/picture">
+                <pic:pic>
                   <pic:nvPicPr>
-                    <pic:cNvPr id="0" name="" descr=""/>
-                    <pic:cNvPicPr>
-                      <a:picLocks noChangeAspect="1" noChangeArrowheads="1"/>
-                    </pic:cNvPicPr>
+                    <pic:cNvPr id="20" name="asset-020"/>
+                    <pic:cNvPicPr/>
                   </pic:nvPicPr>
                   <pic:blipFill>
-                    <a:blip r:embed="rId26" cstate="none"/>
-                    <a:srcRect/>
+                    <a:blip r:embed="R68b81d90194843fe" cstate="print"/>
                     <a:stretch>
                       <a:fillRect/>
                     </a:stretch>
                   </pic:blipFill>
-                  <pic:spPr bwMode="auto">
+                  <pic:spPr>
                     <a:xfrm>
                       <a:off x="0" y="0"/>
                       <a:ext cx="3300115" cy="1009650"/>
@@ -2082,10 +2290,14 @@
       </w:r>
     </w:p>
     <w:p>
-      <w:r>
+      <w:pPr>
+        <w:pStyle w:val="Normal"/>
+      </w:pPr>
+      <w:r>
+        <w:rPr/>
         <w:t xml:space="preserve">这其实就是 </w:t>
       </w:r>
-      <w:hyperlink w:history="1" r:id="rIdmv5pgkas_3p347k4hn7_p">
+      <w:hyperlink r:id="R9512f5da3a49411d">
         <w:r>
           <w:rPr>
             <w:color w:val="1756A9"/>
@@ -2095,6 +2307,7 @@
         </w:r>
       </w:hyperlink>
       <w:r>
+        <w:rPr/>
         <w:t xml:space="preserve"> 里按 block 做 rescaling 的方法，只不过这里每次只处理一个 key。</w:t>
       </w:r>
     </w:p>
@@ -2104,55 +2317,60 @@
         <w:keepNext/>
       </w:pPr>
       <w:r>
+        <w:rPr/>
         <w:t xml:space="preserve">合并两个循环</w:t>
       </w:r>
     </w:p>
     <w:p>
-      <w:r>
+      <w:pPr>
+        <w:pStyle w:val="Normal"/>
+      </w:pPr>
+      <w:r>
+        <w:rPr/>
         <w:t xml:space="preserve">循环（1）和优化后的循环（2）思路一样：在循环里算中间值，只保证最终结果正确。所以可以把它们合并成一个循环。写成矩阵形式，同一个循环里有四步：</w:t>
       </w:r>
     </w:p>
     <w:p>
+      <w:pPr>
+        <w:pStyle w:val="Normal"/>
+      </w:pPr>
       <w:r>
         <w:rPr>
           <w:b/>
-          <w:bCs/>
         </w:rPr>
         <w:t xml:space="preserve">1. Score</w:t>
       </w:r>
     </w:p>
     <w:p>
       <w:pPr>
+        <w:pStyle w:val="Normal"/>
         <w:keepLines/>
-        <w:spacing w:after="180" w:before="100"/>
+        <w:spacing w:before="100" w:after="180"/>
         <w:jc w:val="center"/>
       </w:pPr>
       <w:r>
         <w:drawing>
           <wp:inline distT="0" distB="0" distL="0" distR="0">
             <wp:extent cx="1940868" cy="398115"/>
-            <wp:effectExtent t="0" r="0" b="0" l="0"/>
-            <wp:docPr id="1" name="asset-021" descr=" \mathbb{X}[n,m] = \mathbb{Q}[n,:] \cdot \mathbb{K}^T[:,m] " title="display-math"/>
+            <wp:effectExtent l="0" t="0" r="0" b="0"/>
+            <wp:docPr id="21" name="asset-021" descr=" \mathbb{X}[n,m] = \mathbb{Q}[n,:] \cdot \mathbb{K}^T[:,m] "/>
             <wp:cNvGraphicFramePr>
-              <a:graphicFrameLocks xmlns:a="http://schemas.openxmlformats.org/drawingml/2006/main" noChangeAspect="1"/>
+              <a:graphicFrameLocks noChangeAspect="1"/>
             </wp:cNvGraphicFramePr>
-            <a:graphic xmlns:a="http://schemas.openxmlformats.org/drawingml/2006/main">
+            <a:graphic>
               <a:graphicData uri="http://schemas.openxmlformats.org/drawingml/2006/picture">
-                <pic:pic xmlns:pic="http://schemas.openxmlformats.org/drawingml/2006/picture">
+                <pic:pic>
                   <pic:nvPicPr>
-                    <pic:cNvPr id="0" name="" descr=""/>
-                    <pic:cNvPicPr>
-                      <a:picLocks noChangeAspect="1" noChangeArrowheads="1"/>
-                    </pic:cNvPicPr>
+                    <pic:cNvPr id="21" name="asset-021"/>
+                    <pic:cNvPicPr/>
                   </pic:nvPicPr>
                   <pic:blipFill>
-                    <a:blip r:embed="rId27" cstate="none"/>
-                    <a:srcRect/>
+                    <a:blip r:embed="R8c57bca5a7834f31" cstate="print"/>
                     <a:stretch>
                       <a:fillRect/>
                     </a:stretch>
                   </pic:blipFill>
-                  <pic:spPr bwMode="auto">
+                  <pic:spPr>
                     <a:xfrm>
                       <a:off x="0" y="0"/>
                       <a:ext cx="1940868" cy="398115"/>
@@ -2169,46 +2387,46 @@
       </w:r>
     </w:p>
     <w:p>
+      <w:pPr>
+        <w:pStyle w:val="Normal"/>
+      </w:pPr>
       <w:r>
         <w:rPr>
           <w:b/>
-          <w:bCs/>
         </w:rPr>
         <w:t xml:space="preserve">2. Max</w:t>
       </w:r>
     </w:p>
     <w:p>
       <w:pPr>
+        <w:pStyle w:val="Normal"/>
         <w:keepLines/>
-        <w:spacing w:after="180" w:before="100"/>
+        <w:spacing w:before="100" w:after="180"/>
         <w:jc w:val="center"/>
       </w:pPr>
       <w:r>
         <w:drawing>
           <wp:inline distT="0" distB="0" distL="0" distR="0">
             <wp:extent cx="2673102" cy="665857"/>
-            <wp:effectExtent t="0" r="0" b="0" l="0"/>
-            <wp:docPr id="1" name="asset-022" descr=" \begin{aligned} \mathbb{G}[n,1] &amp;= \mathbb{X}[n,1], \\ \mathbb{G}[n,m] &amp;= \max(\mathbb{G}[n,m-1], \mathbb{X}[n,m]). \end{aligned} " title="display-math"/>
+            <wp:effectExtent l="0" t="0" r="0" b="0"/>
+            <wp:docPr id="22" name="asset-022" descr=" \begin{aligned}&#10;\mathbb{G}[n,1] &amp;= \mathbb{X}[n,1], \\&#10;\mathbb{G}[n,m] &amp;= \max(\mathbb{G}[n,m-1], \mathbb{X}[n,m]).&#10;\end{aligned} "/>
             <wp:cNvGraphicFramePr>
-              <a:graphicFrameLocks xmlns:a="http://schemas.openxmlformats.org/drawingml/2006/main" noChangeAspect="1"/>
+              <a:graphicFrameLocks noChangeAspect="1"/>
             </wp:cNvGraphicFramePr>
-            <a:graphic xmlns:a="http://schemas.openxmlformats.org/drawingml/2006/main">
+            <a:graphic>
               <a:graphicData uri="http://schemas.openxmlformats.org/drawingml/2006/picture">
-                <pic:pic xmlns:pic="http://schemas.openxmlformats.org/drawingml/2006/picture">
+                <pic:pic>
                   <pic:nvPicPr>
-                    <pic:cNvPr id="0" name="" descr=""/>
-                    <pic:cNvPicPr>
-                      <a:picLocks noChangeAspect="1" noChangeArrowheads="1"/>
-                    </pic:cNvPicPr>
+                    <pic:cNvPr id="22" name="asset-022"/>
+                    <pic:cNvPicPr/>
                   </pic:nvPicPr>
                   <pic:blipFill>
-                    <a:blip r:embed="rId28" cstate="none"/>
-                    <a:srcRect/>
+                    <a:blip r:embed="R616989d38eb34fba" cstate="print"/>
                     <a:stretch>
                       <a:fillRect/>
                     </a:stretch>
                   </pic:blipFill>
-                  <pic:spPr bwMode="auto">
+                  <pic:spPr>
                     <a:xfrm>
                       <a:off x="0" y="0"/>
                       <a:ext cx="2673102" cy="665857"/>
@@ -2225,46 +2443,46 @@
       </w:r>
     </w:p>
     <w:p>
+      <w:pPr>
+        <w:pStyle w:val="Normal"/>
+      </w:pPr>
       <w:r>
         <w:rPr>
           <w:b/>
-          <w:bCs/>
         </w:rPr>
         <w:t xml:space="preserve">3. Sum</w:t>
       </w:r>
     </w:p>
     <w:p>
       <w:pPr>
+        <w:pStyle w:val="Normal"/>
         <w:keepLines/>
-        <w:spacing w:after="180" w:before="100"/>
+        <w:spacing w:before="100" w:after="180"/>
         <w:jc w:val="center"/>
       </w:pPr>
       <w:r>
         <w:drawing>
           <wp:inline distT="0" distB="0" distL="0" distR="0">
             <wp:extent cx="3837831" cy="681484"/>
-            <wp:effectExtent t="0" r="0" b="0" l="0"/>
-            <wp:docPr id="1" name="asset-023" descr=" \begin{aligned} \mathbb{S}[n,1] &amp;= 1, \\ \mathbb{S}[n,m] &amp;= \mathbb{S}[n,m-1] \times e^{\mathbb{G}[n,m-1] - \mathbb{G}[n,m]} + e^{\mathbb{X}[n,m] - \mathbb{G}[n,m]}. \end{aligned} " title="display-math"/>
+            <wp:effectExtent l="0" t="0" r="0" b="0"/>
+            <wp:docPr id="23" name="asset-023" descr=" \begin{aligned}&#10;\mathbb{S}[n,1] &amp;= 1, \\&#10;\mathbb{S}[n,m] &amp;= \mathbb{S}[n,m-1] \times e^{\mathbb{G}[n,m-1] - \mathbb{G}[n,m]} + e^{\mathbb{X}[n,m] - \mathbb{G}[n,m]}.&#10;\end{aligned} "/>
             <wp:cNvGraphicFramePr>
-              <a:graphicFrameLocks xmlns:a="http://schemas.openxmlformats.org/drawingml/2006/main" noChangeAspect="1"/>
+              <a:graphicFrameLocks noChangeAspect="1"/>
             </wp:cNvGraphicFramePr>
-            <a:graphic xmlns:a="http://schemas.openxmlformats.org/drawingml/2006/main">
+            <a:graphic>
               <a:graphicData uri="http://schemas.openxmlformats.org/drawingml/2006/picture">
-                <pic:pic xmlns:pic="http://schemas.openxmlformats.org/drawingml/2006/picture">
+                <pic:pic>
                   <pic:nvPicPr>
-                    <pic:cNvPr id="0" name="" descr=""/>
-                    <pic:cNvPicPr>
-                      <a:picLocks noChangeAspect="1" noChangeArrowheads="1"/>
-                    </pic:cNvPicPr>
+                    <pic:cNvPr id="23" name="asset-023"/>
+                    <pic:cNvPicPr/>
                   </pic:nvPicPr>
                   <pic:blipFill>
-                    <a:blip r:embed="rId29" cstate="none"/>
-                    <a:srcRect/>
+                    <a:blip r:embed="Rafd344fba81a4e84" cstate="print"/>
                     <a:stretch>
                       <a:fillRect/>
                     </a:stretch>
                   </pic:blipFill>
-                  <pic:spPr bwMode="auto">
+                  <pic:spPr>
                     <a:xfrm>
                       <a:off x="0" y="0"/>
                       <a:ext cx="3837831" cy="681484"/>
@@ -2281,46 +2499,46 @@
       </w:r>
     </w:p>
     <w:p>
+      <w:pPr>
+        <w:pStyle w:val="Normal"/>
+      </w:pPr>
       <w:r>
         <w:rPr>
           <w:b/>
-          <w:bCs/>
         </w:rPr>
         <w:t xml:space="preserve">4. Attention</w:t>
       </w:r>
     </w:p>
     <w:p>
       <w:pPr>
+        <w:pStyle w:val="Normal"/>
         <w:keepLines/>
-        <w:spacing w:after="180" w:before="100"/>
+        <w:spacing w:before="100" w:after="180"/>
         <w:jc w:val="center"/>
       </w:pPr>
       <w:r>
         <w:drawing>
           <wp:inline distT="0" distB="0" distL="0" distR="0">
             <wp:extent cx="5506641" cy="1078260"/>
-            <wp:effectExtent t="0" r="0" b="0" l="0"/>
-            <wp:docPr id="1" name="asset-024" descr=" \begin{aligned} \mathbb{A}_1[n,:] &amp;= \frac{e^{\mathbb{X}[n,1] - \mathbb{G}[n,1]}}{\mathbb{S}[n,1]} \times \mathbb{V}[1,:], \\ \mathbb{A}_m[n,:] &amp;= \mathbb{A}_{m-1}[n,:] \times \frac{\mathbb{S}[n,m-1] \times e^{\mathbb{G}[n,m-1] - \mathbb{G}[n,m]}}{\mathbb{S}[n,m]} + \frac{e^{\mathbb{X}[n,m] - \mathbb{G}[n,m]}}{\mathbb{S}[n,m]} \times \mathbb{V}[m,:]. \end{aligned} " title="display-math"/>
+            <wp:effectExtent l="0" t="0" r="0" b="0"/>
+            <wp:docPr id="24" name="asset-024" descr=" \begin{aligned}&#10;\mathbb{A}_1[n,:] &amp;= \frac{e^{\mathbb{X}[n,1] - \mathbb{G}[n,1]}}{\mathbb{S}[n,1]} \times \mathbb{V}[1,:], \\&#10;\mathbb{A}_m[n,:] &amp;= \mathbb{A}_{m-1}[n,:] \times \frac{\mathbb{S}[n,m-1] \times e^{\mathbb{G}[n,m-1] - \mathbb{G}[n,m]}}{\mathbb{S}[n,m]} + \frac{e^{\mathbb{X}[n,m] - \mathbb{G}[n,m]}}{\mathbb{S}[n,m]} \times \mathbb{V}[m,:].&#10;\end{aligned} "/>
             <wp:cNvGraphicFramePr>
-              <a:graphicFrameLocks xmlns:a="http://schemas.openxmlformats.org/drawingml/2006/main" noChangeAspect="1"/>
+              <a:graphicFrameLocks noChangeAspect="1"/>
             </wp:cNvGraphicFramePr>
-            <a:graphic xmlns:a="http://schemas.openxmlformats.org/drawingml/2006/main">
+            <a:graphic>
               <a:graphicData uri="http://schemas.openxmlformats.org/drawingml/2006/picture">
-                <pic:pic xmlns:pic="http://schemas.openxmlformats.org/drawingml/2006/picture">
+                <pic:pic>
                   <pic:nvPicPr>
-                    <pic:cNvPr id="0" name="" descr=""/>
-                    <pic:cNvPicPr>
-                      <a:picLocks noChangeAspect="1" noChangeArrowheads="1"/>
-                    </pic:cNvPicPr>
+                    <pic:cNvPr id="24" name="asset-024"/>
+                    <pic:cNvPicPr/>
                   </pic:nvPicPr>
                   <pic:blipFill>
-                    <a:blip r:embed="rId30" cstate="none"/>
-                    <a:srcRect/>
+                    <a:blip r:embed="R86e7780c5a054f22" cstate="print"/>
                     <a:stretch>
                       <a:fillRect/>
                     </a:stretch>
                   </pic:blipFill>
-                  <pic:spPr bwMode="auto">
+                  <pic:spPr>
                     <a:xfrm>
                       <a:off x="0" y="0"/>
                       <a:ext cx="5506641" cy="1078260"/>
@@ -2337,42 +2555,44 @@
       </w:r>
     </w:p>
     <w:p>
-      <w:r>
+      <w:pPr>
+        <w:pStyle w:val="Normal"/>
+      </w:pPr>
+      <w:r>
+        <w:rPr/>
         <w:t xml:space="preserve">用 Python 表示（不含 scaling 和 masking）：</w:t>
       </w:r>
     </w:p>
     <w:p>
       <w:pPr>
+        <w:pStyle w:val="Normal"/>
         <w:keepLines/>
-        <w:spacing w:after="180" w:before="100"/>
+        <w:spacing w:before="100" w:after="180"/>
         <w:jc w:val="left"/>
       </w:pPr>
       <w:r>
         <w:drawing>
           <wp:inline distT="0" distB="0" distL="0" distR="0">
             <wp:extent cx="6096000" cy="4867275"/>
-            <wp:effectExtent t="0" r="0" b="0" l="0"/>
-            <wp:docPr id="1" name="asset-025" descr="matrix_q = [[random.random() for _ in range(D)] for _ in range(N)] matrix_k = [[random.random() for _ in range(D)] for _ in range(M)] matrix_v = [[random.random() for _ in range(D)] for _ in range(M)] matrix_a = [[0.0] * D for _ in range(N)]  for n in range(N):     for m in range(M):         x = 0.0         for d in range(D):             x += matrix_q[n][d] * matrix_k[m][d]          g = max(g_prev, x) if m &gt; 0 else x         e = math.exp(x - g) if m &gt; 0 else 1.0         s = s_prev * math.exp(g_prev - g) + e if m &gt; 0 else 1.0          for d in range(D):             if m &gt; 0:                 matrix_a[n][d] = (matrix_a[n][d] * s_prev * math.exp(g_prev - g) + e * matrix_v[m][d]) / s             else:                 matrix_a[n][d] = e * matrix_v[0][d] / s         g_prev = g         s_prev = s" title="code-block"/>
+            <wp:effectExtent l="0" t="0" r="0" b="0"/>
+            <wp:docPr id="25" name="asset-025" descr="matrix_q = [[random.random() for _ in range(D)] for _ in range(N)]&#10;matrix_k = [[random.random() for _ in range(D)] for _ in range(M)]&#10;matrix_v = [[random.random() for _ in range(D)] for _ in range(M)]&#10;matrix_a = [[0.0] * D for _ in range(N)]&#10;&#10;for n in range(N):&#10;    for m in range(M):&#10;        x = 0.0&#10;        for d in range(D):&#10;            x += matrix_q[n][d] * matrix_k[m][d]&#10;&#10;        g = max(g_prev, x) if m &gt; 0 else x&#10;        e = math.exp(x - g) if m &gt; 0 else 1.0&#10;        s = s_prev * math.exp(g_prev - g) + e if m &gt; 0 else 1.0&#10;&#10;        for d in range(D):&#10;            if m &gt; 0:&#10;                matrix_a[n][d] = (matrix_a[n][d] * s_prev * math.exp(g_prev - g) + e * matrix_v[m][d]) / s&#10;            else:&#10;                matrix_a[n][d] = e * matrix_v[0][d] / s&#10;        g_prev = g&#10;        s_prev = s"/>
             <wp:cNvGraphicFramePr>
-              <a:graphicFrameLocks xmlns:a="http://schemas.openxmlformats.org/drawingml/2006/main" noChangeAspect="1"/>
+              <a:graphicFrameLocks noChangeAspect="1"/>
             </wp:cNvGraphicFramePr>
-            <a:graphic xmlns:a="http://schemas.openxmlformats.org/drawingml/2006/main">
+            <a:graphic>
               <a:graphicData uri="http://schemas.openxmlformats.org/drawingml/2006/picture">
-                <pic:pic xmlns:pic="http://schemas.openxmlformats.org/drawingml/2006/picture">
+                <pic:pic>
                   <pic:nvPicPr>
-                    <pic:cNvPr id="0" name="" descr=""/>
-                    <pic:cNvPicPr>
-                      <a:picLocks noChangeAspect="1" noChangeArrowheads="1"/>
-                    </pic:cNvPicPr>
+                    <pic:cNvPr id="25" name="asset-025"/>
+                    <pic:cNvPicPr/>
                   </pic:nvPicPr>
                   <pic:blipFill>
-                    <a:blip r:embed="rId31" cstate="none"/>
-                    <a:srcRect/>
+                    <a:blip r:embed="Rae0bc4bbad6043cf" cstate="print"/>
                     <a:stretch>
                       <a:fillRect/>
                     </a:stretch>
                   </pic:blipFill>
-                  <pic:spPr bwMode="auto">
+                  <pic:spPr>
                     <a:xfrm>
                       <a:off x="0" y="0"/>
                       <a:ext cx="6096000" cy="4867275"/>
@@ -2389,42 +2609,44 @@
       </w:r>
     </w:p>
     <w:p>
-      <w:r>
+      <w:pPr>
+        <w:pStyle w:val="Normal"/>
+      </w:pPr>
+      <w:r>
+        <w:rPr/>
         <w:t xml:space="preserve">最后和直接计算的结果对比一下：</w:t>
       </w:r>
     </w:p>
     <w:p>
       <w:pPr>
+        <w:pStyle w:val="Normal"/>
         <w:keepLines/>
-        <w:spacing w:after="180" w:before="100"/>
+        <w:spacing w:before="100" w:after="180"/>
         <w:jc w:val="left"/>
       </w:pPr>
       <w:r>
         <w:drawing>
           <wp:inline distT="0" distB="0" distL="0" distR="0">
             <wp:extent cx="6096000" cy="2066925"/>
-            <wp:effectExtent t="0" r="0" b="0" l="0"/>
-            <wp:docPr id="1" name="asset-026" descr="for n in range(N):     scores = [sum(q * k for q, k in zip(matrix_q[n], key)) for key in matrix_k]     max_x = max(scores)     sum_ex = sum(math.exp(x - max_x) for x in scores)     for d in range(D):         expected = sum(math.exp(x - max_x) / sum_ex * matrix_v[m][d] for m, x in enumerate(scores))         assert math.isclose(matrix_a[n][d], expected)" title="code-block"/>
+            <wp:effectExtent l="0" t="0" r="0" b="0"/>
+            <wp:docPr id="26" name="asset-026" descr="for n in range(N):&#10;    scores = [sum(q * k for q, k in zip(matrix_q[n], key)) for key in matrix_k]&#10;    max_x = max(scores)&#10;    sum_ex = sum(math.exp(x - max_x) for x in scores)&#10;    for d in range(D):&#10;        expected = sum(math.exp(x - max_x) / sum_ex * matrix_v[m][d] for m, x in enumerate(scores))&#10;        assert math.isclose(matrix_a[n][d], expected)"/>
             <wp:cNvGraphicFramePr>
-              <a:graphicFrameLocks xmlns:a="http://schemas.openxmlformats.org/drawingml/2006/main" noChangeAspect="1"/>
+              <a:graphicFrameLocks noChangeAspect="1"/>
             </wp:cNvGraphicFramePr>
-            <a:graphic xmlns:a="http://schemas.openxmlformats.org/drawingml/2006/main">
+            <a:graphic>
               <a:graphicData uri="http://schemas.openxmlformats.org/drawingml/2006/picture">
-                <pic:pic xmlns:pic="http://schemas.openxmlformats.org/drawingml/2006/picture">
+                <pic:pic>
                   <pic:nvPicPr>
-                    <pic:cNvPr id="0" name="" descr=""/>
-                    <pic:cNvPicPr>
-                      <a:picLocks noChangeAspect="1" noChangeArrowheads="1"/>
-                    </pic:cNvPicPr>
+                    <pic:cNvPr id="26" name="asset-026"/>
+                    <pic:cNvPicPr/>
                   </pic:nvPicPr>
                   <pic:blipFill>
-                    <a:blip r:embed="rId32" cstate="none"/>
-                    <a:srcRect/>
+                    <a:blip r:embed="Rbb408829a1ba46a4" cstate="print"/>
                     <a:stretch>
                       <a:fillRect/>
                     </a:stretch>
                   </pic:blipFill>
-                  <pic:spPr bwMode="auto">
+                  <pic:spPr>
                     <a:xfrm>
                       <a:off x="0" y="0"/>
                       <a:ext cx="6096000" cy="2066925"/>
@@ -2444,26 +2666,40 @@
       <w:pPr>
         <w:pStyle w:val="Heading1"/>
         <w:keepNext/>
-      </w:pPr>
-      <w:r>
+        <w:pageBreakBefore/>
+      </w:pPr>
+      <w:r>
+        <w:rPr/>
         <w:t xml:space="preserve">从循环到 tiling</w:t>
       </w:r>
     </w:p>
     <w:p>
-      <w:r>
+      <w:pPr>
+        <w:pStyle w:val="Normal"/>
+      </w:pPr>
+      <w:r>
+        <w:rPr/>
         <w:t xml:space="preserve">上面的循环解释了为什么 softmax 可以和矩阵乘法融合，但每次只处理一个 key，矩阵数据还没有得到充分复用。这就要靠 tiling。</w:t>
       </w:r>
     </w:p>
     <w:p>
-      <w:r>
+      <w:pPr>
+        <w:pStyle w:val="Normal"/>
+      </w:pPr>
+      <w:r>
+        <w:rPr/>
         <w:t xml:space="preserve">一种设计方法是把一个 query tile 和它对应的行状态（G、S、A 中对应的行）留在片上，然后逐个读入 key/value tile。每读入一个 tile，先算局部的 score，更新每行的最大值和指数和，再算局部的加权和，同时修正旧的输出。这个 tile 的 score 和 weight 用完就丢掉，下一个 tile 接着用更新后的状态。</w:t>
       </w:r>
     </w:p>
     <w:p>
-      <w:r>
+      <w:pPr>
+        <w:pStyle w:val="Normal"/>
+      </w:pPr>
+      <w:r>
+        <w:rPr/>
         <w:t xml:space="preserve">这样安排的话，每换一个 query tile，就要把 key/value tile 再访问一遍。所以"一个 query tile 扫完所有 key”并不等于“所有输入只从外部内存读一次”。原始 FlashAttention 的循环顺序正好相反：key/value tile 在外层，query/output tile 被反复读写。实际的内存流量取决于 tile 大小、循环顺序和缓存（</w:t>
       </w:r>
-      <w:hyperlink w:history="1" r:id="rIdbf5xtwigsgrlrgknwyc1r">
+      <w:hyperlink r:id="R810fdd3ff54d4f90">
         <w:r>
           <w:rPr>
             <w:color w:val="1756A9"/>
@@ -2473,14 +2709,19 @@
         </w:r>
       </w:hyperlink>
       <w:r>
+        <w:rPr/>
         <w:t xml:space="preserve">）。</w:t>
       </w:r>
     </w:p>
     <w:p>
-      <w:r>
+      <w:pPr>
+        <w:pStyle w:val="Normal"/>
+      </w:pPr>
+      <w:r>
+        <w:rPr/>
         <w:t xml:space="preserve">还可以再省一点计算：不在每一步都除以 s，而是保留 A 的分子（也就是 S × A），每步只做 rescale 和累加，最后一步再除以 s。</w:t>
       </w:r>
-      <w:hyperlink w:history="1" r:id="rIdghudx5t2uf6a0s_xhfgyo">
+      <w:hyperlink r:id="R9170e0f303b04854">
         <w:r>
           <w:rPr>
             <w:color w:val="1756A9"/>
@@ -2490,6 +2731,7 @@
         </w:r>
       </w:hyperlink>
       <w:r>
+        <w:rPr/>
         <w:t xml:space="preserve"> 就用这个办法减少了非矩阵运算。最大值变化时，分子仍然要 rescale。</w:t>
       </w:r>
     </w:p>
@@ -2499,257 +2741,165 @@
         <w:keepNext/>
       </w:pPr>
       <w:r>
+        <w:rPr/>
         <w:t xml:space="preserve">留给实现的问题</w:t>
       </w:r>
     </w:p>
     <w:p>
       <w:pPr>
-        <w:pStyle w:val="ListParagraph"/>
+        <w:pStyle w:val="Normal"/>
         <w:numPr>
           <w:ilvl w:val="0"/>
-          <w:numId w:val="2"/>
+          <w:numId w:val="1"/>
         </w:numPr>
       </w:pPr>
       <w:r>
+        <w:rPr/>
         <w:t xml:space="preserve">真正做硬件实现时，还有很多事要决定：这些状态放在哪里，反馈更新怎么调度，矩阵运算和归一化之间怎么交换数据。</w:t>
       </w:r>
     </w:p>
     <w:p>
       <w:pPr>
-        <w:pStyle w:val="ListParagraph"/>
+        <w:pStyle w:val="Normal"/>
         <w:numPr>
           <w:ilvl w:val="0"/>
-          <w:numId w:val="2"/>
+          <w:numId w:val="1"/>
         </w:numPr>
       </w:pPr>
       <w:r>
+        <w:rPr/>
         <w:t xml:space="preserve">Masking 也要单独处理。Mask 本身是 element-wise 操作，但如果一行的前缀全被 mask 掉，最大值就是负无穷，负无穷减负无穷没有定义，上面的初始化就不能直接用了。</w:t>
       </w:r>
     </w:p>
     <w:p>
       <w:pPr>
-        <w:pStyle w:val="ListParagraph"/>
+        <w:pStyle w:val="Normal"/>
         <w:numPr>
           <w:ilvl w:val="0"/>
-          <w:numId w:val="2"/>
+          <w:numId w:val="1"/>
         </w:numPr>
       </w:pPr>
       <w:r>
+        <w:rPr/>
         <w:t xml:space="preserve">另外，数学上等价不代表浮点结果逐位相同，计算顺序变了，结果不一定一模一样。</w:t>
       </w:r>
     </w:p>
     <w:p>
       <w:pPr>
+        <w:pStyle w:val="Normal"/>
         <w:keepLines/>
-        <w:shd w:fill="FFF4CC"/>
-        <w:spacing w:after="160" w:before="160"/>
+        <w:shd w:val="clear" w:fill="FFF4CC"/>
+        <w:spacing w:before="160" w:after="160"/>
         <w:ind w:left="280" w:right="160"/>
       </w:pPr>
       <w:r>
+        <w:rPr/>
         <w:t xml:space="preserve">笔者：整个推导的核心只有一个思路：</w:t>
       </w:r>
       <w:r>
         <w:rPr>
           <w:b/>
-          <w:bCs/>
         </w:rPr>
         <w:t xml:space="preserve">只要最终结果正确，中间结果可以换一种含义。Online softmax 用它处理分母，FlashAttention 再把它用到输出上。</w:t>
       </w:r>
     </w:p>
     <w:sectPr>
-      <w:pgSz w:w="12240" w:h="15840" w:orient="portrait"/>
-      <w:pgMar w:top="1000" w:right="1100" w:bottom="1000" w:left="1100" w:header="708" w:footer="708" w:gutter="0"/>
-      <w:pgNumType/>
-      <w:docGrid w:linePitch="360"/>
+      <w:pgSz w:w="12240" w:h="15840"/>
+      <w:pgMar w:top="1000" w:right="1100" w:bottom="1000" w:left="1100"/>
+      <w:docGrid w:type="default"/>
     </w:sectPr>
   </w:body>
 </w:document>
 </file>
 
-<file path=word/comments.xml><?xml version="1.0" encoding="utf-8"?>
-<w:comments xmlns:cx="http://schemas.microsoft.com/office/drawing/2014/chartex" xmlns:cx1="http://schemas.microsoft.com/office/drawing/2015/9/8/chartex" xmlns:cx2="http://schemas.microsoft.com/office/drawing/2015/10/21/chartex" xmlns:cx3="http://schemas.microsoft.com/office/drawing/2016/5/9/chartex" xmlns:cx4="http://schemas.microsoft.com/office/drawing/2016/5/10/chartex" xmlns:cx5="http://schemas.microsoft.com/office/drawing/2016/5/11/chartex" xmlns:cx6="http://schemas.microsoft.com/office/drawing/2016/5/12/chartex" xmlns:cx7="http://schemas.microsoft.com/office/drawing/2016/5/13/chartex" xmlns:cx8="http://schemas.microsoft.com/office/drawing/2016/5/14/chartex" xmlns:mc="http://schemas.openxmlformats.org/markup-compatibility/2006" xmlns:aink="http://schemas.microsoft.com/office/drawing/2016/ink" xmlns:am3d="http://schemas.microsoft.com/office/drawing/2017/model3d" xmlns:o="urn:schemas-microsoft-com:office:office" xmlns:r="http://schemas.openxmlformats.org/officeDocument/2006/relationships" xmlns:m="http://schemas.openxmlformats.org/officeDocument/2006/math" xmlns:v="urn:schemas-microsoft-com:vml" xmlns:wp14="http://schemas.microsoft.com/office/word/2010/wordprocessingDrawing" xmlns:wp="http://schemas.openxmlformats.org/drawingml/2006/wordprocessingDrawing" xmlns:w10="urn:schemas-microsoft-com:office:word" xmlns:w="http://schemas.openxmlformats.org/wordprocessingml/2006/main" xmlns:w14="http://schemas.microsoft.com/office/word/2010/wordml" xmlns:w15="http://schemas.microsoft.com/office/word/2012/wordml" xmlns:w16cex="http://schemas.microsoft.com/office/word/2018/wordml/cex" xmlns:w16cid="http://schemas.microsoft.com/office/word/2016/wordml/cid" xmlns:w16="http://schemas.microsoft.com/office/word/2018/wordml" xmlns:w16sdtdh="http://schemas.microsoft.com/office/word/2020/wordml/sdtdatahash" xmlns:w16se="http://schemas.microsoft.com/office/word/2015/wordml/symex" xmlns:wpg="http://schemas.microsoft.com/office/word/2010/wordprocessingGroup" xmlns:wpi="http://schemas.microsoft.com/office/word/2010/wordprocessingInk" xmlns:wne="http://schemas.microsoft.com/office/word/2006/wordml" xmlns:wps="http://schemas.microsoft.com/office/word/2010/wordprocessingShape"/>
-</file>
-
-<file path=word/endnotes.xml><?xml version="1.0" encoding="utf-8"?>
-<w:endnotes xmlns:wpc="http://schemas.microsoft.com/office/word/2010/wordprocessingCanvas" xmlns:mc="http://schemas.openxmlformats.org/markup-compatibility/2006" xmlns:o="urn:schemas-microsoft-com:office:office" xmlns:r="http://schemas.openxmlformats.org/officeDocument/2006/relationships" xmlns:m="http://schemas.openxmlformats.org/officeDocument/2006/math" xmlns:v="urn:schemas-microsoft-com:vml" xmlns:wp14="http://schemas.microsoft.com/office/word/2010/wordprocessingDrawing" xmlns:wp="http://schemas.openxmlformats.org/drawingml/2006/wordprocessingDrawing" xmlns:w10="urn:schemas-microsoft-com:office:word" xmlns:w="http://schemas.openxmlformats.org/wordprocessingml/2006/main" xmlns:w14="http://schemas.microsoft.com/office/word/2010/wordml" xmlns:w15="http://schemas.microsoft.com/office/word/2012/wordml" xmlns:wpg="http://schemas.microsoft.com/office/word/2010/wordprocessingGroup" xmlns:wpi="http://schemas.microsoft.com/office/word/2010/wordprocessingInk" xmlns:wne="http://schemas.microsoft.com/office/word/2006/wordml" xmlns:wps="http://schemas.microsoft.com/office/word/2010/wordprocessingShape" mc:Ignorable="w14 w15 wp14">
-  <w:endnote w:type="separator" w:id="-1">
-    <w:p>
-      <w:pPr>
-        <w:spacing w:after="0" w:line="240" w:lineRule="auto"/>
-      </w:pPr>
-      <w:r>
-        <w:rPr>
-          <w:rStyle w:val="EndnoteReference"/>
-        </w:rPr>
-        <w:endnoteRef/>
-      </w:r>
-      <w:r>
-        <w:separator/>
-      </w:r>
-    </w:p>
-  </w:endnote>
-  <w:endnote w:type="continuationSeparator" w:id="0">
-    <w:p>
-      <w:pPr>
-        <w:spacing w:after="0" w:line="240" w:lineRule="auto"/>
-      </w:pPr>
-      <w:r>
-        <w:rPr>
-          <w:rStyle w:val="EndnoteReference"/>
-        </w:rPr>
-        <w:endnoteRef/>
-      </w:r>
-      <w:r>
-        <w:continuationSeparator/>
-      </w:r>
-    </w:p>
-  </w:endnote>
-</w:endnotes>
-</file>
-
-<file path=word/footnotes.xml><?xml version="1.0" encoding="utf-8"?>
-<w:footnotes xmlns:wpc="http://schemas.microsoft.com/office/word/2010/wordprocessingCanvas" xmlns:mc="http://schemas.openxmlformats.org/markup-compatibility/2006" xmlns:o="urn:schemas-microsoft-com:office:office" xmlns:r="http://schemas.openxmlformats.org/officeDocument/2006/relationships" xmlns:m="http://schemas.openxmlformats.org/officeDocument/2006/math" xmlns:v="urn:schemas-microsoft-com:vml" xmlns:wp14="http://schemas.microsoft.com/office/word/2010/wordprocessingDrawing" xmlns:wp="http://schemas.openxmlformats.org/drawingml/2006/wordprocessingDrawing" xmlns:w10="urn:schemas-microsoft-com:office:word" xmlns:w="http://schemas.openxmlformats.org/wordprocessingml/2006/main" xmlns:w14="http://schemas.microsoft.com/office/word/2010/wordml" xmlns:w15="http://schemas.microsoft.com/office/word/2012/wordml" xmlns:wpg="http://schemas.microsoft.com/office/word/2010/wordprocessingGroup" xmlns:wpi="http://schemas.microsoft.com/office/word/2010/wordprocessingInk" xmlns:wne="http://schemas.microsoft.com/office/word/2006/wordml" xmlns:wps="http://schemas.microsoft.com/office/word/2010/wordprocessingShape" mc:Ignorable="w14 w15 wp14">
-  <w:footnote w:type="separator" w:id="-1">
-    <w:p>
-      <w:pPr>
-        <w:spacing w:after="0" w:line="240" w:lineRule="auto"/>
-      </w:pPr>
-      <w:r>
-        <w:rPr>
-          <w:rStyle w:val="FootnoteReference"/>
-        </w:rPr>
-        <w:footnoteRef/>
-      </w:r>
-      <w:r>
-        <w:separator/>
-      </w:r>
-    </w:p>
-  </w:footnote>
-  <w:footnote w:type="continuationSeparator" w:id="0">
-    <w:p>
-      <w:pPr>
-        <w:spacing w:after="0" w:line="240" w:lineRule="auto"/>
-      </w:pPr>
-      <w:r>
-        <w:rPr>
-          <w:rStyle w:val="FootnoteReference"/>
-        </w:rPr>
-        <w:footnoteRef/>
-      </w:r>
-      <w:r>
-        <w:continuationSeparator/>
-      </w:r>
-    </w:p>
-  </w:footnote>
-</w:footnotes>
-</file>
-
 <file path=word/numbering.xml><?xml version="1.0" encoding="utf-8"?>
-<w:numbering xmlns:wpc="http://schemas.microsoft.com/office/word/2010/wordprocessingCanvas" xmlns:mc="http://schemas.openxmlformats.org/markup-compatibility/2006" xmlns:o="urn:schemas-microsoft-com:office:office" xmlns:r="http://schemas.openxmlformats.org/officeDocument/2006/relationships" xmlns:m="http://schemas.openxmlformats.org/officeDocument/2006/math" xmlns:v="urn:schemas-microsoft-com:vml" xmlns:wp14="http://schemas.microsoft.com/office/word/2010/wordprocessingDrawing" xmlns:wp="http://schemas.openxmlformats.org/drawingml/2006/wordprocessingDrawing" xmlns:w10="urn:schemas-microsoft-com:office:word" xmlns:w="http://schemas.openxmlformats.org/wordprocessingml/2006/main" xmlns:w14="http://schemas.microsoft.com/office/word/2010/wordml" xmlns:w15="http://schemas.microsoft.com/office/word/2012/wordml" xmlns:wpg="http://schemas.microsoft.com/office/word/2010/wordprocessingGroup" xmlns:wpi="http://schemas.microsoft.com/office/word/2010/wordprocessingInk" xmlns:wne="http://schemas.microsoft.com/office/word/2006/wordml" xmlns:wps="http://schemas.microsoft.com/office/word/2010/wordprocessingShape" mc:Ignorable="w14 w15 wp14">
-  <w:abstractNum w:abstractNumId="1" w15:restartNumberingAfterBreak="0">
+<w:numbering xmlns:w="http://schemas.openxmlformats.org/wordprocessingml/2006/main">
+  <w:abstractNum w:abstractNumId="0">
     <w:multiLevelType w:val="hybridMultilevel"/>
-    <w:lvl w:ilvl="0" w15:tentative="1">
-      <w:start w:val="1"/>
-      <w:numFmt w:val="bullet"/>
-      <w:lvlText w:val="●"/>
-      <w:lvlJc w:val="left"/>
-      <w:pPr>
-        <w:ind w:left="720" w:hanging="360"/>
-      </w:pPr>
-    </w:lvl>
-    <w:lvl w:ilvl="1" w15:tentative="1">
-      <w:start w:val="1"/>
-      <w:numFmt w:val="bullet"/>
-      <w:lvlText w:val="○"/>
-      <w:lvlJc w:val="left"/>
-      <w:pPr>
-        <w:ind w:left="1440" w:hanging="360"/>
-      </w:pPr>
-    </w:lvl>
-    <w:lvl w:ilvl="2" w15:tentative="1">
-      <w:start w:val="1"/>
-      <w:numFmt w:val="bullet"/>
-      <w:lvlText w:val="■"/>
-      <w:lvlJc w:val="left"/>
-      <w:pPr>
-        <w:ind w:left="2160" w:hanging="360"/>
-      </w:pPr>
-    </w:lvl>
-    <w:lvl w:ilvl="3" w15:tentative="1">
-      <w:start w:val="1"/>
-      <w:numFmt w:val="bullet"/>
-      <w:lvlText w:val="●"/>
-      <w:lvlJc w:val="left"/>
-      <w:pPr>
-        <w:ind w:left="2880" w:hanging="360"/>
-      </w:pPr>
-    </w:lvl>
-    <w:lvl w:ilvl="4" w15:tentative="1">
-      <w:start w:val="1"/>
-      <w:numFmt w:val="bullet"/>
-      <w:lvlText w:val="○"/>
-      <w:lvlJc w:val="left"/>
-      <w:pPr>
-        <w:ind w:left="3600" w:hanging="360"/>
-      </w:pPr>
-    </w:lvl>
-    <w:lvl w:ilvl="5" w15:tentative="1">
-      <w:start w:val="1"/>
-      <w:numFmt w:val="bullet"/>
-      <w:lvlText w:val="■"/>
-      <w:lvlJc w:val="left"/>
-      <w:pPr>
-        <w:ind w:left="4320" w:hanging="360"/>
-      </w:pPr>
-    </w:lvl>
-    <w:lvl w:ilvl="6" w15:tentative="1">
-      <w:start w:val="1"/>
-      <w:numFmt w:val="bullet"/>
-      <w:lvlText w:val="●"/>
-      <w:lvlJc w:val="left"/>
-      <w:pPr>
-        <w:ind w:left="5040" w:hanging="360"/>
-      </w:pPr>
-    </w:lvl>
-    <w:lvl w:ilvl="7" w15:tentative="1">
-      <w:start w:val="1"/>
-      <w:numFmt w:val="bullet"/>
-      <w:lvlText w:val="●"/>
-      <w:lvlJc w:val="left"/>
-      <w:pPr>
-        <w:ind w:left="5760" w:hanging="360"/>
-      </w:pPr>
-    </w:lvl>
-    <w:lvl w:ilvl="8" w15:tentative="1">
-      <w:start w:val="1"/>
-      <w:numFmt w:val="bullet"/>
-      <w:lvlText w:val="●"/>
-      <w:lvlJc w:val="left"/>
-      <w:pPr>
-        <w:ind w:left="6480" w:hanging="360"/>
-      </w:pPr>
-    </w:lvl>
-  </w:abstractNum>
-  <w:abstractNum w:abstractNumId="2" w15:restartNumberingAfterBreak="0">
-    <w:multiLevelType w:val="hybridMultilevel"/>
-    <w:lvl w:ilvl="0" w15:tentative="1">
+    <w:lvl w:ilvl="0">
       <w:start w:val="1"/>
       <w:numFmt w:val="decimal"/>
       <w:lvlText w:val="%1."/>
       <w:lvlJc w:val="left"/>
       <w:pPr>
-        <w:ind w:left="360" w:hanging="280"/>
+        <w:ind w:left="360" w:hanging="360"/>
+      </w:pPr>
+    </w:lvl>
+    <w:lvl w:ilvl="1">
+      <w:start w:val="1"/>
+      <w:numFmt w:val="decimal"/>
+      <w:lvlText w:val="%2."/>
+      <w:lvlJc w:val="left"/>
+      <w:pPr>
+        <w:ind w:left="1440" w:hanging="360"/>
+      </w:pPr>
+    </w:lvl>
+    <w:lvl w:ilvl="2">
+      <w:start w:val="1"/>
+      <w:numFmt w:val="decimal"/>
+      <w:lvlText w:val="%3."/>
+      <w:lvlJc w:val="left"/>
+      <w:pPr>
+        <w:ind w:left="2160" w:hanging="360"/>
+      </w:pPr>
+    </w:lvl>
+    <w:lvl w:ilvl="3">
+      <w:start w:val="1"/>
+      <w:numFmt w:val="decimal"/>
+      <w:lvlText w:val="%4."/>
+      <w:lvlJc w:val="left"/>
+      <w:pPr>
+        <w:ind w:left="2880" w:hanging="360"/>
+      </w:pPr>
+    </w:lvl>
+    <w:lvl w:ilvl="4">
+      <w:start w:val="1"/>
+      <w:numFmt w:val="decimal"/>
+      <w:lvlText w:val="%5."/>
+      <w:lvlJc w:val="left"/>
+      <w:pPr>
+        <w:ind w:left="3600" w:hanging="360"/>
+      </w:pPr>
+    </w:lvl>
+    <w:lvl w:ilvl="5">
+      <w:start w:val="1"/>
+      <w:numFmt w:val="decimal"/>
+      <w:lvlText w:val="%6."/>
+      <w:lvlJc w:val="left"/>
+      <w:pPr>
+        <w:ind w:left="4320" w:hanging="360"/>
+      </w:pPr>
+    </w:lvl>
+    <w:lvl w:ilvl="6">
+      <w:start w:val="1"/>
+      <w:numFmt w:val="decimal"/>
+      <w:lvlText w:val="%7."/>
+      <w:lvlJc w:val="left"/>
+      <w:pPr>
+        <w:ind w:left="5040" w:hanging="360"/>
+      </w:pPr>
+    </w:lvl>
+    <w:lvl w:ilvl="7">
+      <w:start w:val="1"/>
+      <w:numFmt w:val="decimal"/>
+      <w:lvlText w:val="%8."/>
+      <w:lvlJc w:val="left"/>
+      <w:pPr>
+        <w:ind w:left="5760" w:hanging="360"/>
+      </w:pPr>
+    </w:lvl>
+    <w:lvl w:ilvl="8">
+      <w:start w:val="1"/>
+      <w:numFmt w:val="decimal"/>
+      <w:lvlText w:val="%9."/>
+      <w:lvlJc w:val="left"/>
+      <w:pPr>
+        <w:ind w:left="6480" w:hanging="360"/>
       </w:pPr>
     </w:lvl>
   </w:abstractNum>
   <w:num w:numId="1">
-    <w:abstractNumId w:val="1"/>
-    <w:lvlOverride w:ilvl="0">
-      <w:startOverride w:val="1"/>
-    </w:lvlOverride>
-  </w:num>
-  <w:num w:numId="2">
-    <w:abstractNumId w:val="2"/>
+    <w:abstractNumId w:val="0"/>
     <w:lvlOverride w:ilvl="0">
       <w:startOverride w:val="1"/>
     </w:lvlOverride>
@@ -2758,222 +2908,85 @@
 </file>
 
 <file path=word/styles.xml><?xml version="1.0" encoding="utf-8"?>
-<w:styles xmlns:mc="http://schemas.openxmlformats.org/markup-compatibility/2006" xmlns:r="http://schemas.openxmlformats.org/officeDocument/2006/relationships" xmlns:w="http://schemas.openxmlformats.org/wordprocessingml/2006/main" xmlns:w14="http://schemas.microsoft.com/office/word/2010/wordml" xmlns:w15="http://schemas.microsoft.com/office/word/2012/wordml" mc:Ignorable="w14 w15">
+<w:styles xmlns:w14="http://schemas.microsoft.com/office/word/2010/wordml" xmlns:mc="http://schemas.openxmlformats.org/markup-compatibility/2006" xmlns:w="http://schemas.openxmlformats.org/wordprocessingml/2006/main" mc:Ignorable="w14">
   <w:docDefaults>
     <w:rPrDefault>
       <w:rPr>
-        <w:rFonts w:ascii="Arial" w:eastAsia="Heiti SC" w:hAnsi="Arial"/>
+        <w:rFonts w:ascii="Arial" w:hAnsi="Arial" w:eastAsia="Heiti SC" w:cs="Arial"/>
         <w:color w:val="171717"/>
         <w:sz w:val="24"/>
         <w:szCs w:val="24"/>
-        <w:lang w:val="en-US" w:eastAsia="zh-CN"/>
       </w:rPr>
     </w:rPrDefault>
     <w:pPrDefault>
       <w:pPr>
-        <w:widowControl/>
-        <w:wordWrap w:val="0"/>
-        <w:spacing w:after="160" w:line="300"/>
+        <w:spacing w:after="120" w:line="288" w:lineRule="auto"/>
       </w:pPr>
     </w:pPrDefault>
   </w:docDefaults>
+  <w:style w:type="paragraph" w:styleId="Normal">
+    <w:name w:val="Normal"/>
+    <w:pPr>
+      <w:widowControl xmlns:w="http://schemas.openxmlformats.org/wordprocessingml/2006/main" w:val="1"/>
+      <w:wordWrap xmlns:w="http://schemas.openxmlformats.org/wordprocessingml/2006/main" w:val="0"/>
+      <w:spacing w:after="120" w:line="288" w:lineRule="auto"/>
+    </w:pPr>
+    <w:rPr>
+      <w:rFonts w:ascii="Arial" w:hAnsi="Arial" w:eastAsia="Heiti SC"/>
+      <w:color w:val="171717"/>
+      <w:sz w:val="24"/>
+    </w:rPr>
+  </w:style>
   <w:style w:type="paragraph" w:styleId="Title">
     <w:name w:val="Title"/>
     <w:basedOn w:val="Normal"/>
-    <w:next w:val="Normal"/>
-    <w:qFormat/>
     <w:pPr>
-      <w:keepNext/>
-      <w:spacing w:after="240" w:before="0"/>
+      <w:keepNext xmlns:w="http://schemas.openxmlformats.org/wordprocessingml/2006/main" w:val="1"/>
+      <w:spacing w:before="0" w:after="240"/>
     </w:pPr>
     <w:rPr>
-      <w:rFonts w:ascii="Arial" w:eastAsia="Heiti SC" w:hAnsi="Arial"/>
       <w:b/>
-      <w:bCs/>
       <w:color w:val="000000"/>
       <w:sz w:val="40"/>
-      <w:szCs w:val="40"/>
     </w:rPr>
   </w:style>
   <w:style w:type="paragraph" w:styleId="Heading1">
-    <w:name w:val="Heading 1"/>
+    <w:name w:val="Heading1"/>
     <w:basedOn w:val="Normal"/>
-    <w:next w:val="Normal"/>
-    <w:qFormat/>
     <w:pPr>
-      <w:keepNext/>
-      <w:spacing w:after="140" w:before="280"/>
+      <w:keepNext xmlns:w="http://schemas.openxmlformats.org/wordprocessingml/2006/main" w:val="1"/>
+      <w:spacing w:before="280" w:after="140"/>
     </w:pPr>
     <w:rPr>
-      <w:rFonts w:ascii="Arial" w:eastAsia="Heiti SC" w:hAnsi="Arial"/>
       <w:b/>
-      <w:bCs/>
       <w:color w:val="000000"/>
       <w:sz w:val="30"/>
-      <w:szCs w:val="30"/>
     </w:rPr>
   </w:style>
   <w:style w:type="paragraph" w:styleId="Heading2">
-    <w:name w:val="Heading 2"/>
+    <w:name w:val="Heading2"/>
     <w:basedOn w:val="Normal"/>
-    <w:next w:val="Normal"/>
-    <w:qFormat/>
     <w:pPr>
-      <w:keepNext/>
-      <w:spacing w:after="100" w:before="200"/>
+      <w:keepNext xmlns:w="http://schemas.openxmlformats.org/wordprocessingml/2006/main" w:val="1"/>
+      <w:spacing w:before="200" w:after="100"/>
     </w:pPr>
     <w:rPr>
-      <w:rFonts w:ascii="Arial" w:eastAsia="Heiti SC" w:hAnsi="Arial"/>
       <w:b/>
-      <w:bCs/>
       <w:color w:val="000000"/>
       <w:sz w:val="26"/>
-      <w:szCs w:val="26"/>
     </w:rPr>
   </w:style>
   <w:style w:type="paragraph" w:styleId="Heading3">
-    <w:name w:val="Heading 3"/>
+    <w:name w:val="Heading3"/>
     <w:basedOn w:val="Normal"/>
-    <w:next w:val="Normal"/>
-    <w:qFormat/>
     <w:pPr>
-      <w:keepNext/>
+      <w:keepNext xmlns:w="http://schemas.openxmlformats.org/wordprocessingml/2006/main" w:val="1"/>
+      <w:spacing w:before="160" w:after="100"/>
     </w:pPr>
     <w:rPr>
-      <w:rFonts w:ascii="Arial" w:eastAsia="Heiti SC" w:hAnsi="Arial"/>
       <w:b/>
-      <w:bCs/>
       <w:color w:val="000000"/>
       <w:sz w:val="24"/>
-      <w:szCs w:val="24"/>
-    </w:rPr>
-  </w:style>
-  <w:style w:type="paragraph" w:styleId="Heading4">
-    <w:name w:val="Heading 4"/>
-    <w:basedOn w:val="Normal"/>
-    <w:next w:val="Normal"/>
-    <w:qFormat/>
-    <w:rPr>
-      <w:i/>
-      <w:iCs/>
-      <w:color w:val="2E74B5"/>
-    </w:rPr>
-  </w:style>
-  <w:style w:type="paragraph" w:styleId="Heading5">
-    <w:name w:val="Heading 5"/>
-    <w:basedOn w:val="Normal"/>
-    <w:next w:val="Normal"/>
-    <w:qFormat/>
-    <w:rPr>
-      <w:color w:val="2E74B5"/>
-    </w:rPr>
-  </w:style>
-  <w:style w:type="paragraph" w:styleId="Heading6">
-    <w:name w:val="Heading 6"/>
-    <w:basedOn w:val="Normal"/>
-    <w:next w:val="Normal"/>
-    <w:qFormat/>
-    <w:rPr>
-      <w:color w:val="1F4D78"/>
-    </w:rPr>
-  </w:style>
-  <w:style w:type="paragraph" w:styleId="Strong">
-    <w:name w:val="Strong"/>
-    <w:basedOn w:val="Normal"/>
-    <w:next w:val="Normal"/>
-    <w:qFormat/>
-    <w:rPr>
-      <w:b/>
-      <w:bCs/>
-    </w:rPr>
-  </w:style>
-  <w:style w:type="paragraph" w:styleId="ListParagraph">
-    <w:name w:val="List Paragraph"/>
-    <w:basedOn w:val="Normal"/>
-    <w:qFormat/>
-  </w:style>
-  <w:style w:type="character" w:styleId="Hyperlink">
-    <w:name w:val="Hyperlink"/>
-    <w:basedOn w:val="DefaultParagraphFont"/>
-    <w:uiPriority w:val="99"/>
-    <w:unhideWhenUsed/>
-    <w:rPr>
-      <w:color w:val="0563C1"/>
-      <w:u w:val="single"/>
-    </w:rPr>
-  </w:style>
-  <w:style w:type="character" w:styleId="FootnoteReference">
-    <w:name w:val="footnote reference"/>
-    <w:basedOn w:val="DefaultParagraphFont"/>
-    <w:uiPriority w:val="99"/>
-    <w:semiHidden/>
-    <w:unhideWhenUsed/>
-    <w:rPr>
-      <w:vertAlign w:val="superscript"/>
-    </w:rPr>
-  </w:style>
-  <w:style w:type="paragraph" w:styleId="FootnoteText">
-    <w:name w:val="footnote text"/>
-    <w:basedOn w:val="Normal"/>
-    <w:link w:val="FootnoteTextChar"/>
-    <w:uiPriority w:val="99"/>
-    <w:semiHidden/>
-    <w:unhideWhenUsed/>
-    <w:pPr>
-      <w:spacing w:after="0" w:line="240" w:lineRule="auto"/>
-    </w:pPr>
-    <w:rPr>
-      <w:sz w:val="20"/>
-      <w:szCs w:val="20"/>
-    </w:rPr>
-  </w:style>
-  <w:style w:type="character" w:styleId="FootnoteTextChar">
-    <w:name w:val="Footnote Text Char"/>
-    <w:basedOn w:val="DefaultParagraphFont"/>
-    <w:link w:val="FootnoteText"/>
-    <w:uiPriority w:val="99"/>
-    <w:semiHidden/>
-    <w:unhideWhenUsed/>
-    <w:rPr>
-      <w:sz w:val="20"/>
-      <w:szCs w:val="20"/>
-    </w:rPr>
-  </w:style>
-  <w:style w:type="character" w:styleId="EndnoteReference">
-    <w:name w:val="endnote reference"/>
-    <w:basedOn w:val="DefaultParagraphFont"/>
-    <w:uiPriority w:val="99"/>
-    <w:semiHidden/>
-    <w:unhideWhenUsed/>
-    <w:rPr>
-      <w:vertAlign w:val="superscript"/>
-    </w:rPr>
-  </w:style>
-  <w:style w:type="paragraph" w:styleId="EndnoteText">
-    <w:name w:val="endnote text"/>
-    <w:basedOn w:val="Normal"/>
-    <w:link w:val="EndnoteTextChar"/>
-    <w:uiPriority w:val="99"/>
-    <w:semiHidden/>
-    <w:unhideWhenUsed/>
-    <w:pPr>
-      <w:spacing w:after="0" w:line="240" w:lineRule="auto"/>
-    </w:pPr>
-    <w:rPr>
-      <w:sz w:val="20"/>
-      <w:szCs w:val="20"/>
-    </w:rPr>
-  </w:style>
-  <w:style w:type="character" w:styleId="EndnoteTextChar">
-    <w:name w:val="Endnote Text Char"/>
-    <w:basedOn w:val="DefaultParagraphFont"/>
-    <w:link w:val="EndnoteText"/>
-    <w:uiPriority w:val="99"/>
-    <w:semiHidden/>
-    <w:unhideWhenUsed/>
-    <w:rPr>
-      <w:sz w:val="20"/>
-      <w:szCs w:val="20"/>
     </w:rPr>
   </w:style>
 </w:styles>

</xml_diff>